<commit_message>
Link the public repository from the paper; run CI on main
The data and code availability statement now gives the GitHub URL.
The default branch becomes main, so CI no longer watches master.

Co-Authored-By: Claude Opus 5.5 <noreply@anthropic.com>
</commit_message>
<xml_diff>
--- a/paper/Orchards_in_the_Meadow.docx
+++ b/paper/Orchards_in_the_Meadow.docx
@@ -54,31 +54,7 @@
         <w:jc w:val="both"/>
       </w:pPr>
       <w:r>
-        <w:t xml:space="preserve">Crop-type classifiers trained on Sentinel-2 time series reach about 80% overall accuracy on the </w:t>
-      </w:r>
-      <w:proofErr w:type="spellStart"/>
-      <w:r>
-        <w:t>BreizhCrops</w:t>
-      </w:r>
-      <w:proofErr w:type="spellEnd"/>
-      <w:r>
-        <w:t xml:space="preserve"> benchmark, yet they miss most parcels of rare classes. Orchards make up 0.45% of the test region and are confused almost exclusively with meadows; a pretrained </w:t>
-      </w:r>
-      <w:proofErr w:type="spellStart"/>
-      <w:r>
-        <w:t>MSResNet</w:t>
-      </w:r>
-      <w:proofErr w:type="spellEnd"/>
-      <w:r>
-        <w:t xml:space="preserve"> finds 15.7% of them. We fuse three kinds of evidence in a gradient-boosted meta-classifier: phenology features computed from cloud-free dates, an </w:t>
-      </w:r>
-      <w:proofErr w:type="spellStart"/>
-      <w:r>
-        <w:t>MSResNet</w:t>
-      </w:r>
-      <w:proofErr w:type="spellEnd"/>
-      <w:r>
-        <w:t xml:space="preserve"> trained on atmospherically corrected (L2A) series, and the outputs of pretrained networks. A second-stage verifier then re-scores the meta-classifier's orchard candidates using seasonal, geometric and </w:t>
+        <w:t xml:space="preserve">Crop-type classifiers trained on Sentinel-2 time series reach about 80% overall accuracy on the BreizhCrops benchmark, yet they miss most parcels of rare classes. Orchards make up 0.45% of the test region and are confused almost exclusively with meadows; a pretrained MSResNet finds 15.7% of them. We fuse three kinds of evidence in a gradient-boosted meta-classifier: phenology features computed from cloud-free dates, an MSResNet trained on atmospherically corrected (L2A) series, and the outputs of pretrained networks. A second-stage verifier then re-scores the meta-classifier's orchard candidates using seasonal, geometric and </w:t>
       </w:r>
       <w:r>
         <w:t>neighborhood</w:t>
@@ -90,15 +66,7 @@
         <w:t>the verifier raises orchard average precision (AP) from 34.9 to 39.1</w:t>
       </w:r>
       <w:r>
-        <w:t xml:space="preserve"> and reaches 45.5% orchard precision at 82.90% accuracy. Controlled ablations show that the gain comes from the seasonal evidence and from the L2A input itself: an identical network trained on L1C data adds almost nothing, a four-tier mixture of experts adds little, and an end-to-end network trained with an orchard-weighted loss stays 7.5–10 points of orchard AP behind. In a pre-registered rotation over all four </w:t>
-      </w:r>
-      <w:proofErr w:type="spellStart"/>
-      <w:r>
-        <w:t>BreizhCrops</w:t>
-      </w:r>
-      <w:proofErr w:type="spellEnd"/>
-      <w:r>
-        <w:t xml:space="preserve"> regions, the phenology and L2A-network gains hold in every region, while the verifier helps in three of the four. Training the meta-classifier on out-of-sample network outputs instead changes neither accuracy nor orchard average precision, so stacking leakage does not inflate the results. All results are out of sample, with spatially cross-fitted operating points and three seeds.</w:t>
+        <w:t xml:space="preserve"> and reaches 45.5% orchard precision at 82.90% accuracy. Controlled ablations show that the gain comes from the seasonal evidence and from the L2A input itself: an identical network trained on L1C data adds almost nothing, a four-tier mixture of experts adds little, and an end-to-end network trained with an orchard-weighted loss stays 7.5–10 points of orchard AP behind. In a pre-registered rotation over all four BreizhCrops regions, the phenology and L2A-network gains hold in every region, while the verifier helps in three of the four. Training the meta-classifier on out-of-sample network outputs instead changes neither accuracy nor orchard average precision, so stacking leakage does not inflate the results. All results are out of sample, with spatially cross-fitted operating points and three seeds.</w:t>
       </w:r>
     </w:p>
     <w:p>
@@ -114,15 +82,7 @@
         <w:t>Keywords:</w:t>
       </w:r>
       <w:r>
-        <w:t xml:space="preserve"> crop-type mapping; Sentinel-2; satellite image time series; rare classes; stacking; gradient boosting; </w:t>
-      </w:r>
-      <w:proofErr w:type="spellStart"/>
-      <w:r>
-        <w:t>BreizhCrops</w:t>
-      </w:r>
-      <w:proofErr w:type="spellEnd"/>
-      <w:r>
-        <w:t>.</w:t>
+        <w:t xml:space="preserve"> crop-type mapping; Sentinel-2; satellite image time series; rare classes; stacking; gradient boosting; BreizhCrops.</w:t>
       </w:r>
     </w:p>
     <w:p>
@@ -140,55 +100,7 @@
         <w:jc w:val="both"/>
       </w:pPr>
       <w:r>
-        <w:t>Satellite image time series (SITS) from Sentinel-2 (Drusch et al., 2012) have made parcel-level crop-type mapping practical at national scale, and operational systems now produce such maps routinely (</w:t>
-      </w:r>
-      <w:proofErr w:type="spellStart"/>
-      <w:r>
-        <w:t>Inglada</w:t>
-      </w:r>
-      <w:proofErr w:type="spellEnd"/>
-      <w:r>
-        <w:t xml:space="preserve"> et al., 2015; </w:t>
-      </w:r>
-      <w:proofErr w:type="spellStart"/>
-      <w:r>
-        <w:t>Defourny</w:t>
-      </w:r>
-      <w:proofErr w:type="spellEnd"/>
-      <w:r>
-        <w:t xml:space="preserve"> et al., 2019). Deep temporal classifiers, whether convolutional (Pelletier et al., 2019), residual (Wang et al., 2017) or attention-based (Sainte Fare </w:t>
-      </w:r>
-      <w:proofErr w:type="spellStart"/>
-      <w:r>
-        <w:t>Garnot</w:t>
-      </w:r>
-      <w:proofErr w:type="spellEnd"/>
-      <w:r>
-        <w:t xml:space="preserve"> et al., 2020; </w:t>
-      </w:r>
-      <w:proofErr w:type="spellStart"/>
-      <w:r>
-        <w:t>Rußwurm</w:t>
-      </w:r>
-      <w:proofErr w:type="spellEnd"/>
-      <w:r>
-        <w:t xml:space="preserve"> and Körner, 2020), reach around 80% overall accuracy on the </w:t>
-      </w:r>
-      <w:proofErr w:type="spellStart"/>
-      <w:r>
-        <w:t>BreizhCrops</w:t>
-      </w:r>
-      <w:proofErr w:type="spellEnd"/>
-      <w:r>
-        <w:t xml:space="preserve"> benchmark (</w:t>
-      </w:r>
-      <w:proofErr w:type="spellStart"/>
-      <w:r>
-        <w:t>Rußwurm</w:t>
-      </w:r>
-      <w:proofErr w:type="spellEnd"/>
-      <w:r>
-        <w:t xml:space="preserve"> et al., 2020). Overall accuracy, however, is dominated by abundant classes; rare classes barely move it, yet they often matter most for policy: orchards, for example, are </w:t>
+        <w:t xml:space="preserve">Satellite image time series (SITS) from Sentinel-2 (Drusch et al., 2012) have made parcel-level crop-type mapping practical at national scale, and operational systems now produce such maps routinely (Inglada et al., 2015; Defourny et al., 2019). Deep temporal classifiers, whether convolutional (Pelletier et al., 2019), residual (Wang et al., 2017) or attention-based (Sainte Fare Garnot et al., 2020; Rußwurm and Körner, 2020), reach around 80% overall accuracy on the BreizhCrops benchmark (Rußwurm et al., 2020). Overall accuracy, however, is dominated by abundant classes; rare classes barely move it, yet they often matter most for policy: orchards, for example, are </w:t>
       </w:r>
       <w:r>
         <w:t>subsidized</w:t>
@@ -203,37 +115,13 @@
         <w:jc w:val="both"/>
       </w:pPr>
       <w:r>
-        <w:t xml:space="preserve">We study this problem on </w:t>
-      </w:r>
-      <w:proofErr w:type="spellStart"/>
-      <w:r>
-        <w:t>BreizhCrops</w:t>
-      </w:r>
-      <w:proofErr w:type="spellEnd"/>
-      <w:r>
-        <w:t xml:space="preserve">, which covers 608,489 field parcels in four regions of Brittany (France) for 2017. Following the standard split, we train on regions frh01–frh03 (485,781 parcels) and test on frh04 (122,708 parcels), with nine classes: barley, wheat, rapeseed, corn, sunflower, orchards, nuts, and permanent and temporary meadows. Only 552 test parcels (0.45%) are orchards. Orchards are the only rare class that can be evaluated: </w:t>
+        <w:t xml:space="preserve">We study this problem on BreizhCrops, which covers 608,489 field parcels in four regions of Brittany (France) for 2017. Following the standard split, we train on regions frh01–frh03 (485,781 parcels) and test on frh04 (122,708 parcels), with nine classes: barley, wheat, rapeseed, corn, sunflower, orchards, nuts, and permanent and temporary meadows. Only 552 test parcels (0.45%) are orchards. Orchards are the only rare class that can be evaluated: </w:t>
       </w:r>
       <w:r>
         <w:t>sunflowers</w:t>
       </w:r>
       <w:r>
-        <w:t xml:space="preserve"> and nuts have 2 and 11 test parcels, too few to estimate recall or precision, so this paper is a study of orchards as a rare class. A pretrained </w:t>
-      </w:r>
-      <w:proofErr w:type="spellStart"/>
-      <w:r>
-        <w:t>MSResNet</w:t>
-      </w:r>
-      <w:proofErr w:type="spellEnd"/>
-      <w:r>
-        <w:t xml:space="preserve"> from the </w:t>
-      </w:r>
-      <w:proofErr w:type="spellStart"/>
-      <w:r>
-        <w:t>BreizhCrops</w:t>
-      </w:r>
-      <w:proofErr w:type="spellEnd"/>
-      <w:r>
-        <w:t xml:space="preserve"> model zoo reaches 80.77% accuracy but finds only 15.7% of them. An error analysis shows that the problem is narrow: 96% of the parcels falsely predicted as orchards are meadows, and 98% of the missed orchards are predicted as one of the two meadow classes. A plausible cause is that grassed orchards share the meadows' spring green-up; what should separate them is timing </w:t>
+        <w:t xml:space="preserve"> and nuts have 2 and 11 test parcels, too few to estimate recall or precision, so this paper is a study of orchards as a rare class. A pretrained MSResNet from the BreizhCrops model zoo reaches 80.77% accuracy but finds only 15.7% of them. An error analysis shows that the problem is narrow: 96% of the parcels falsely predicted as orchards are meadows, and 98% of the missed orchards are predicted as one of the two meadow classes. A plausible cause is that grassed orchards share the meadows' spring green-up; what should separate them is timing </w:t>
       </w:r>
       <w:r>
         <w:lastRenderedPageBreak/>
@@ -246,50 +134,10 @@
         <w:jc w:val="both"/>
       </w:pPr>
       <w:r>
-        <w:t>This points to seasonal evidence rather than more model capacity. Our system has two stages (Fig. 1). A gradient-boosted meta-classifier (</w:t>
-      </w:r>
-      <w:proofErr w:type="spellStart"/>
-      <w:r>
-        <w:t>XGBoost</w:t>
-      </w:r>
-      <w:proofErr w:type="spellEnd"/>
-      <w:r>
-        <w:t xml:space="preserve"> and </w:t>
-      </w:r>
-      <w:proofErr w:type="spellStart"/>
-      <w:r>
-        <w:t>CatBoost</w:t>
-      </w:r>
-      <w:proofErr w:type="spellEnd"/>
-      <w:r>
-        <w:t xml:space="preserve">) fuses 51 per-parcel features: parcel metadata, 15 phenology features computed from cloud-free dates, the logits of pretrained networks on top-of-atmosphere (L1C) data, and the logits of an </w:t>
-      </w:r>
-      <w:proofErr w:type="spellStart"/>
-      <w:r>
-        <w:t>MSResNet</w:t>
-      </w:r>
-      <w:proofErr w:type="spellEnd"/>
-      <w:r>
-        <w:t xml:space="preserve"> we train on atmospherically corrected (L2A) data. Decode-time log-biases choose the operating point. A binary verifier then re-scores the parcels the meta-classifier considers possible orchards, using </w:t>
-      </w:r>
-      <w:r>
-        <w:t xml:space="preserve">monthly </w:t>
-      </w:r>
-      <w:proofErr w:type="gramStart"/>
-      <w:r>
-        <w:t>clear-date</w:t>
-      </w:r>
-      <w:proofErr w:type="gramEnd"/>
-      <w:r>
-        <w:t xml:space="preserve"> </w:t>
-      </w:r>
-      <w:proofErr w:type="spellStart"/>
-      <w:r>
-        <w:t>reflectances</w:t>
-      </w:r>
-      <w:proofErr w:type="spellEnd"/>
-      <w:r>
-        <w:t>,</w:t>
+        <w:t xml:space="preserve">This points to seasonal evidence rather than more model capacity. Our system has two stages (Fig. 1). A gradient-boosted meta-classifier (XGBoost and CatBoost) fuses 51 per-parcel features: parcel metadata, 15 phenology features computed from cloud-free dates, the logits of pretrained networks on top-of-atmosphere (L1C) data, and the logits of an MSResNet we train on atmospherically corrected (L2A) data. Decode-time log-biases choose the operating point. A binary verifier then re-scores the parcels the meta-classifier considers possible orchards, using </w:t>
+      </w:r>
+      <w:r>
+        <w:t>monthly clear-date reflectances,</w:t>
       </w:r>
       <w:r>
         <w:t xml:space="preserve"> parcel geometry and the predictions for </w:t>
@@ -326,15 +174,7 @@
         <w:jc w:val="both"/>
       </w:pPr>
       <w:r>
-        <w:t xml:space="preserve">A two-stage orchard </w:t>
-      </w:r>
-      <w:proofErr w:type="gramStart"/>
-      <w:r>
-        <w:t>verifier that</w:t>
-      </w:r>
-      <w:proofErr w:type="gramEnd"/>
-      <w:r>
-        <w:t xml:space="preserve"> raises orchard average</w:t>
+        <w:t>A two-stage orchard verifier that raises orchard average</w:t>
       </w:r>
       <w:r>
         <w:t xml:space="preserve"> precision by about four points and, at the high-accuracy operating point, raises orchard precision from 34.8% to 45.5% at the same recall.</w:t>
@@ -377,75 +217,14 @@
         <w:spacing w:after="120" w:line="276" w:lineRule="auto"/>
         <w:jc w:val="both"/>
       </w:pPr>
-      <w:proofErr w:type="spellStart"/>
-      <w:r>
-        <w:t>TempCNN</w:t>
-      </w:r>
-      <w:proofErr w:type="spellEnd"/>
-      <w:r>
-        <w:t xml:space="preserve"> (Pelletier et al., 2019) showed that one-dimensional temporal convolutions are a strong baseline for pixel and parcel series. Residual networks (He et al., 2016), adapted to time series by Wang et al. (2017), and their multi-scale variant </w:t>
-      </w:r>
-      <w:proofErr w:type="spellStart"/>
-      <w:r>
-        <w:t>MSResNet</w:t>
-      </w:r>
-      <w:proofErr w:type="spellEnd"/>
-      <w:r>
-        <w:t xml:space="preserve"> (Wang, n.d.) are among the strongest </w:t>
-      </w:r>
-      <w:proofErr w:type="spellStart"/>
-      <w:r>
-        <w:t>BreizhCrops</w:t>
-      </w:r>
-      <w:proofErr w:type="spellEnd"/>
-      <w:r>
-        <w:t xml:space="preserve"> baselines. Attention-based encoders followed: the pixel-set encoder with temporal attention (Sainte Fare </w:t>
-      </w:r>
-      <w:proofErr w:type="spellStart"/>
-      <w:r>
-        <w:t>Garnot</w:t>
-      </w:r>
-      <w:proofErr w:type="spellEnd"/>
-      <w:r>
-        <w:t xml:space="preserve"> et al., 2020), </w:t>
-      </w:r>
-      <w:r>
-        <w:t xml:space="preserve">its lightweight temporal attention encoder, LTAE (Sainte Fare </w:t>
-      </w:r>
-      <w:proofErr w:type="spellStart"/>
-      <w:r>
-        <w:t>Garnot</w:t>
-      </w:r>
-      <w:proofErr w:type="spellEnd"/>
-      <w:r>
-        <w:t xml:space="preserve"> and Landrieu, 2020)</w:t>
-      </w:r>
-      <w:r>
-        <w:t>, and Transformer encoders (Vaswani et al., 2017) applied to raw optical series (</w:t>
-      </w:r>
-      <w:proofErr w:type="spellStart"/>
-      <w:r>
-        <w:t>Rußwurm</w:t>
-      </w:r>
-      <w:proofErr w:type="spellEnd"/>
-      <w:r>
-        <w:t xml:space="preserve"> and Körner, 2020). </w:t>
-      </w:r>
-      <w:proofErr w:type="spellStart"/>
-      <w:r>
-        <w:t>BreizhCrops</w:t>
-      </w:r>
-      <w:proofErr w:type="spellEnd"/>
-      <w:r>
-        <w:t xml:space="preserve"> (</w:t>
-      </w:r>
-      <w:proofErr w:type="spellStart"/>
-      <w:r>
-        <w:t>Rußwurm</w:t>
-      </w:r>
-      <w:proofErr w:type="spellEnd"/>
-      <w:r>
-        <w:t xml:space="preserve"> et al., 2020) provides L1C and L2A versions of Sentinel-2 parcel series, pretrained baselines and a reference transform that resamples every series to 45 dates. These works report overall accuracy and macro scores, rarely the rarest classes on their own.</w:t>
+      <w:r>
+        <w:t xml:space="preserve">TempCNN (Pelletier et al., 2019) showed that one-dimensional temporal convolutions are a strong baseline for pixel and parcel series. Residual networks (He et al., 2016), adapted to time series by Wang et al. (2017), and their multi-scale variant MSResNet (Wang, n.d.) are among the strongest BreizhCrops baselines. Attention-based encoders followed: the pixel-set encoder with temporal attention (Sainte Fare Garnot et al., 2020), </w:t>
+      </w:r>
+      <w:r>
+        <w:t>its lightweight temporal attention encoder, LTAE (Sainte Fare Garnot and Landrieu, 2020)</w:t>
+      </w:r>
+      <w:r>
+        <w:t>, and Transformer encoders (Vaswani et al., 2017) applied to raw optical series (Rußwurm and Körner, 2020). BreizhCrops (Rußwurm et al., 2020) provides L1C and L2A versions of Sentinel-2 parcel series, pretrained baselines and a reference transform that resamples every series to 45 dates. These works report overall accuracy and macro scores, rarely the rarest classes on their own.</w:t>
       </w:r>
     </w:p>
     <w:p>
@@ -499,31 +278,7 @@
         <w:t>are</w:t>
       </w:r>
       <w:r>
-        <w:t xml:space="preserve"> trained on the same data. Gradient-boosted trees such as </w:t>
-      </w:r>
-      <w:proofErr w:type="spellStart"/>
-      <w:r>
-        <w:t>XGBoost</w:t>
-      </w:r>
-      <w:proofErr w:type="spellEnd"/>
-      <w:r>
-        <w:t xml:space="preserve"> (Chen and Guestrin, 2016) and </w:t>
-      </w:r>
-      <w:proofErr w:type="spellStart"/>
-      <w:r>
-        <w:t>CatBoost</w:t>
-      </w:r>
-      <w:proofErr w:type="spellEnd"/>
-      <w:r>
-        <w:t xml:space="preserve"> (</w:t>
-      </w:r>
-      <w:proofErr w:type="spellStart"/>
-      <w:r>
-        <w:t>Prokhorenkova</w:t>
-      </w:r>
-      <w:proofErr w:type="spellEnd"/>
-      <w:r>
-        <w:t xml:space="preserve"> et al., 2018) are strong second-level learners for mixed tabular features.</w:t>
+        <w:t xml:space="preserve"> trained on the same data. Gradient-boosted trees such as XGBoost (Chen and Guestrin, 2016) and CatBoost (Prokhorenkova et al., 2018) are strong second-level learners for mixed tabular features.</w:t>
       </w:r>
     </w:p>
     <w:p>
@@ -542,67 +297,19 @@
         <w:jc w:val="both"/>
       </w:pPr>
       <w:r>
-        <w:t xml:space="preserve">Phenological metrics such as those of TIMESAT (Jönsson and </w:t>
-      </w:r>
-      <w:proofErr w:type="spellStart"/>
-      <w:r>
-        <w:t>Eklundh</w:t>
-      </w:r>
-      <w:proofErr w:type="spellEnd"/>
-      <w:r>
-        <w:t xml:space="preserve">, </w:t>
+        <w:t xml:space="preserve">Phenological metrics such as those of TIMESAT (Jönsson and Eklundh, </w:t>
       </w:r>
       <w:r>
         <w:t>2004) summarize the seasonal trajectory</w:t>
       </w:r>
       <w:r>
-        <w:t xml:space="preserve"> of vegetation indices and are a staple of operational crop mapping (</w:t>
-      </w:r>
-      <w:proofErr w:type="spellStart"/>
-      <w:r>
-        <w:t>Inglada</w:t>
-      </w:r>
-      <w:proofErr w:type="spellEnd"/>
-      <w:r>
-        <w:t xml:space="preserve"> et al., 2015; </w:t>
-      </w:r>
-      <w:proofErr w:type="spellStart"/>
-      <w:r>
-        <w:t>Defourny</w:t>
-      </w:r>
-      <w:proofErr w:type="spellEnd"/>
-      <w:r>
-        <w:t xml:space="preserve"> et al., 2019). Red-edge and moisture indices (Gitelson and </w:t>
-      </w:r>
-      <w:proofErr w:type="spellStart"/>
-      <w:r>
-        <w:t>Merzlyak</w:t>
-      </w:r>
-      <w:proofErr w:type="spellEnd"/>
-      <w:r>
-        <w:t xml:space="preserve">, 1994; Gao, 1996) </w:t>
+        <w:t xml:space="preserve"> of vegetation indices and are a staple of operational crop mapping (Inglada et al., 2015; Defourny et al., 2019). Red-edge and moisture indices (Gitelson and Merzlyak, 1994; Gao, 1996) </w:t>
       </w:r>
       <w:r>
         <w:t>add information beyond the normalized difference vegetation index (NDVI).</w:t>
       </w:r>
       <w:r>
-        <w:t xml:space="preserve"> Optical series are affected by clouds: L2A products from Sen2Cor (Main-</w:t>
-      </w:r>
-      <w:proofErr w:type="spellStart"/>
-      <w:r>
-        <w:t>Knorn</w:t>
-      </w:r>
-      <w:proofErr w:type="spellEnd"/>
-      <w:r>
-        <w:t xml:space="preserve"> et al., 2017) carry cloud information, and </w:t>
-      </w:r>
-      <w:proofErr w:type="spellStart"/>
-      <w:r>
-        <w:t>Fmask</w:t>
-      </w:r>
-      <w:proofErr w:type="spellEnd"/>
-      <w:r>
-        <w:t xml:space="preserve"> (Zhu and Woodcock, 2012; Qiu et al., 2019) is a widely used alternative for cloud screening.</w:t>
+        <w:t xml:space="preserve"> Optical series are affected by clouds: L2A products from Sen2Cor (Main-Knorn et al., 2017) carry cloud information, and Fmask (Zhu and Woodcock, 2012; Qiu et al., 2019) is a widely used alternative for cloud screening.</w:t>
       </w:r>
     </w:p>
     <w:p>
@@ -626,39 +333,7 @@
         <w:t>more informative than receiver operating characteristic (ROC) analysis</w:t>
       </w:r>
       <w:r>
-        <w:t xml:space="preserve"> for rare classes (Saito and </w:t>
-      </w:r>
-      <w:proofErr w:type="spellStart"/>
-      <w:r>
-        <w:t>Rehmsmeier</w:t>
-      </w:r>
-      <w:proofErr w:type="spellEnd"/>
-      <w:r>
-        <w:t xml:space="preserve">, 2015). Spatially autocorrelated data inflate random cross-validation estimates (Roberts et al., 2017; </w:t>
-      </w:r>
-      <w:proofErr w:type="spellStart"/>
-      <w:r>
-        <w:t>Ploton</w:t>
-      </w:r>
-      <w:proofErr w:type="spellEnd"/>
-      <w:r>
-        <w:t xml:space="preserve"> et al., 2020), and block resampling (</w:t>
-      </w:r>
-      <w:proofErr w:type="spellStart"/>
-      <w:r>
-        <w:t>Künsch</w:t>
-      </w:r>
-      <w:proofErr w:type="spellEnd"/>
-      <w:r>
-        <w:t xml:space="preserve">, 1989) gives more honest intervals. We are not aware of a </w:t>
-      </w:r>
-      <w:proofErr w:type="spellStart"/>
-      <w:r>
-        <w:t>BreizhCrops</w:t>
-      </w:r>
-      <w:proofErr w:type="spellEnd"/>
-      <w:r>
-        <w:t xml:space="preserve"> study that follows a rare class end to end, with controlled ablations, out-of-sample threshold selection and </w:t>
+        <w:t xml:space="preserve"> for rare classes (Saito and Rehmsmeier, 2015). Spatially autocorrelated data inflate random cross-validation estimates (Roberts et al., 2017; Ploton et al., 2020), and block resampling (Künsch, 1989) gives more honest intervals. We are not aware of a BreizhCrops study that follows a rare class end to end, with controlled ablations, out-of-sample threshold selection and </w:t>
       </w:r>
       <w:r>
         <w:t>rotation</w:t>
@@ -691,26 +366,10 @@
         <w:jc w:val="both"/>
       </w:pPr>
       <w:r>
-        <w:t xml:space="preserve">Each parcel is a multivariate time series of the 10 Sentinel-2 L2A bands with up to 45 acquisition dates; series lengths vary, and 85% of the test parcels have fewer than 45 dates (median 27). The L2A data include a per-date cloud fraction, which is above zero on 60–68% of the observations, so many dates are noisy. The pretrained </w:t>
-      </w:r>
-      <w:proofErr w:type="spellStart"/>
-      <w:r>
-        <w:t>BreizhCrops</w:t>
-      </w:r>
-      <w:proofErr w:type="spellEnd"/>
-      <w:r>
-        <w:t xml:space="preserve"> networks expect the 13-band L1C series; we align those to the L2A parcels by identifier. 151 of the 122,708 test parcels (and 394 training parcels) have no L1C series; their L1C-network </w:t>
-      </w:r>
-      <w:r>
-        <w:t xml:space="preserve">features are set to </w:t>
-      </w:r>
-      <w:proofErr w:type="gramStart"/>
-      <w:r>
-        <w:t>missing</w:t>
-      </w:r>
-      <w:proofErr w:type="gramEnd"/>
-      <w:r>
-        <w:t>.</w:t>
+        <w:t xml:space="preserve">Each parcel is a multivariate time series of the 10 Sentinel-2 L2A bands with up to 45 acquisition dates; series lengths vary, and 85% of the test parcels have fewer than 45 dates (median 27). The L2A data include a per-date cloud fraction, which is above zero on 60–68% of the observations, so many dates are noisy. The pretrained BreizhCrops networks expect the 13-band L1C series; we align those to the L2A parcels by identifier. 151 of the 122,708 test parcels (and 394 training parcels) have no L1C series; their L1C-network </w:t>
+      </w:r>
+      <w:r>
+        <w:t>features are set to missing.</w:t>
       </w:r>
     </w:p>
     <w:p>
@@ -721,13 +380,8 @@
       <w:r>
         <w:t xml:space="preserve">3.2 </w:t>
       </w:r>
-      <w:proofErr w:type="gramStart"/>
-      <w:r>
-        <w:t>Multi-view</w:t>
-      </w:r>
-      <w:proofErr w:type="gramEnd"/>
-      <w:r>
-        <w:t xml:space="preserve"> inference</w:t>
+      <w:r>
+        <w:t>Multi-view inference</w:t>
       </w:r>
     </w:p>
     <w:p>
@@ -754,31 +408,7 @@
           <w:sz w:val="22"/>
           <w:szCs w:val="22"/>
         </w:rPr>
-        <w:t xml:space="preserve">Because 85% of test parcels have fewer than 45 dates, the </w:t>
-      </w:r>
-      <w:proofErr w:type="spellStart"/>
-      <w:r>
-        <w:rPr>
-          <w:b w:val="0"/>
-          <w:bCs w:val="0"/>
-          <w:i w:val="0"/>
-          <w:iCs w:val="0"/>
-          <w:sz w:val="22"/>
-          <w:szCs w:val="22"/>
-        </w:rPr>
-        <w:t>BreizhCrops</w:t>
-      </w:r>
-      <w:proofErr w:type="spellEnd"/>
-      <w:r>
-        <w:rPr>
-          <w:b w:val="0"/>
-          <w:bCs w:val="0"/>
-          <w:i w:val="0"/>
-          <w:iCs w:val="0"/>
-          <w:sz w:val="22"/>
-          <w:szCs w:val="22"/>
-        </w:rPr>
-        <w:t xml:space="preserve"> reference transform randomly resamples each series to 45 dates (unlike zero-padding, which creates out-of-distribution inputs and degrades cascade cereal accuracy from 95.0% to 86.5%). To reduce the variance of random resampling at test time, we feed every network the mean over eight seeded, resampled 45-date views—a form of test-time augmentation (Shanmugam et al., 2021)</w:t>
+        <w:t>Because 85% of test parcels have fewer than 45 dates, the BreizhCrops reference transform randomly resamples each series to 45 dates (unlike zero-padding, which creates out-of-distribution inputs and degrades cascade cereal accuracy from 95.0% to 86.5%). To reduce the variance of random resampling at test time, we feed every network the mean over eight seeded, resampled 45-date views—a form of test-time augmentation (Shanmugam et al., 2021)</w:t>
       </w:r>
       <w:r>
         <w:rPr>
@@ -870,15 +500,7 @@
         <w:t xml:space="preserve"> computed from cloud-free dates only: seasonal NDVI means and the winter minimum, NDVI spread, the summer-minus-winter contrast, mowing-like NDVI drops between April and September, spring and summer red-edge (NDRE) and moisture (NDMI) means, the number of clear dates, and parcel compactness. On frh04 the strongest single features separate orchards from meadows </w:t>
       </w:r>
       <w:r>
-        <w:t xml:space="preserve">with a separability of 0.74 (spring NDMI), 0.72 (spring NDVI) and 0.70 (largest summer NDVI drop), where separability is </w:t>
-      </w:r>
-      <w:proofErr w:type="gramStart"/>
-      <w:r>
-        <w:t>max(</w:t>
-      </w:r>
-      <w:proofErr w:type="gramEnd"/>
-      <w:r>
-        <w:t>AUROC, 1 − AUROC) and AUROC is the area under the ROC curve;</w:t>
+        <w:t>with a separability of 0.74 (spring NDMI), 0.72 (spring NDVI) and 0.70 (largest summer NDVI drop), where separability is max(AUROC, 1 − AUROC) and AUROC is the area under the ROC curve;</w:t>
       </w:r>
       <w:r>
         <w:t xml:space="preserve"> Fig. 2a, b shows the seasonal difference.</w:t>
@@ -899,27 +521,10 @@
           <w:b/>
           <w:bCs/>
         </w:rPr>
-        <w:lastRenderedPageBreak/>
         <w:t>Pretrained L1C networks (19):</w:t>
       </w:r>
       <w:r>
-        <w:t xml:space="preserve"> the logits of the </w:t>
-      </w:r>
-      <w:proofErr w:type="spellStart"/>
-      <w:r>
-        <w:t>BreizhCrops</w:t>
-      </w:r>
-      <w:proofErr w:type="spellEnd"/>
-      <w:r>
-        <w:t xml:space="preserve"> </w:t>
-      </w:r>
-      <w:proofErr w:type="spellStart"/>
-      <w:r>
-        <w:t>MSResNet</w:t>
-      </w:r>
-      <w:proofErr w:type="spellEnd"/>
-      <w:r>
-        <w:t xml:space="preserve"> and Transformer (nine each) and one margin feature, extracted with eight-view test-time augmentation.</w:t>
+        <w:t xml:space="preserve"> the logits of the BreizhCrops MSResNet and Transformer (nine each) and one margin feature, extracted with eight-view test-time augmentation.</w:t>
       </w:r>
     </w:p>
     <w:p>
@@ -940,34 +545,10 @@
         <w:t>L2A network (9):</w:t>
       </w:r>
       <w:r>
-        <w:t xml:space="preserve"> the logits of a 9-class </w:t>
-      </w:r>
-      <w:proofErr w:type="spellStart"/>
-      <w:r>
-        <w:t>MSResNet</w:t>
-      </w:r>
-      <w:proofErr w:type="spellEnd"/>
-      <w:r>
-        <w:t xml:space="preserve"> that we train from scratch on the L2A series of frh01–frh03. It uses clear dates only, keeping a date when its cloud fraction is at most 0.1, its blue reflectance is below </w:t>
-      </w:r>
-      <w:proofErr w:type="gramStart"/>
-      <w:r>
-        <w:t>0.12</w:t>
-      </w:r>
-      <w:proofErr w:type="gramEnd"/>
-      <w:r>
-        <w:t xml:space="preserve"> and it is not an isolated NDVI dip; this keeps 32–40% of the dates. </w:t>
-      </w:r>
-      <w:r>
-        <w:t xml:space="preserve">We train the network for ten epochs and then recompute its </w:t>
-      </w:r>
-      <w:proofErr w:type="spellStart"/>
-      <w:r>
-        <w:t>BatchNorm</w:t>
-      </w:r>
-      <w:proofErr w:type="spellEnd"/>
-      <w:r>
-        <w:t xml:space="preserve"> statistics (Ioffe and Szegedy, 2015) on the training series; without this step its accuracy is 58.7% instead of 80.2%. Its logits are averaged over three training seeds and extracted with eight-view test-time augmentation.</w:t>
+        <w:t xml:space="preserve"> the logits of a 9-class MSResNet that we train from scratch on the L2A series of frh01–frh03. It uses clear dates only, keeping a date when its cloud fraction is at most 0.1, its blue reflectance is below 0.12 and it is not an isolated NDVI dip; this keeps 32–40% of the dates. </w:t>
+      </w:r>
+      <w:r>
+        <w:t>We train the network for ten epochs and then recompute its BatchNorm statistics (Ioffe and Szegedy, 2015) on the training series; without this step its accuracy is 58.7% instead of 80.2%. Its logits are averaged over three training seeds and extracted with eight-view test-time augmentation.</w:t>
       </w:r>
     </w:p>
     <w:p>
@@ -984,43 +565,14 @@
         <w:spacing w:after="120" w:line="276" w:lineRule="auto"/>
         <w:jc w:val="both"/>
       </w:pPr>
-      <w:proofErr w:type="spellStart"/>
-      <w:r>
-        <w:t>XGBoost</w:t>
-      </w:r>
-      <w:proofErr w:type="spellEnd"/>
-      <w:r>
-        <w:t xml:space="preserve"> and </w:t>
-      </w:r>
-      <w:proofErr w:type="spellStart"/>
-      <w:r>
-        <w:t>CatBoost</w:t>
-      </w:r>
-      <w:proofErr w:type="spellEnd"/>
-      <w:r>
-        <w:t xml:space="preserve"> are trained on the 51 features of the training regions, </w:t>
+      <w:r>
+        <w:t xml:space="preserve">XGBoost and CatBoost are trained on the 51 features of the training regions, </w:t>
       </w:r>
       <w:r>
         <w:t>with class-balanced sample weights and orchards further up-weighted by a factor m</w:t>
       </w:r>
       <w:r>
-        <w:t xml:space="preserve"> ∈ {1, 2, </w:t>
-      </w:r>
-      <w:proofErr w:type="gramStart"/>
-      <w:r>
-        <w:t>3}.</w:t>
-      </w:r>
-      <w:proofErr w:type="gramEnd"/>
-      <w:r>
-        <w:t xml:space="preserve"> Their class probabilities are combined either by a geometric mean or by a weighted arithmetic mean (weight 0.7 on </w:t>
-      </w:r>
-      <w:proofErr w:type="spellStart"/>
-      <w:r>
-        <w:t>XGBoost</w:t>
-      </w:r>
-      <w:proofErr w:type="spellEnd"/>
-      <w:r>
-        <w:t xml:space="preserve">). At decoding time, log-space biases </w:t>
+        <w:t xml:space="preserve"> ∈ {1, 2, 3}. Their class probabilities are combined either by a geometric mean or by a weighted arithmetic mean (weight 0.7 on XGBoost). At decoding time, log-space biases </w:t>
       </w:r>
       <w:r>
         <w:t>favor</w:t>
@@ -1045,103 +597,7 @@
           <w:i/>
           <w:iCs/>
         </w:rPr>
-        <w:t xml:space="preserve">ŷ = </w:t>
-      </w:r>
-      <w:proofErr w:type="spellStart"/>
-      <w:r>
-        <w:rPr>
-          <w:i/>
-          <w:iCs/>
-        </w:rPr>
-        <w:t>argmax_k</w:t>
-      </w:r>
-      <w:proofErr w:type="spellEnd"/>
-      <w:r>
-        <w:rPr>
-          <w:i/>
-          <w:iCs/>
-        </w:rPr>
-        <w:t xml:space="preserve"> </w:t>
-      </w:r>
-      <w:proofErr w:type="gramStart"/>
-      <w:r>
-        <w:rPr>
-          <w:i/>
-          <w:iCs/>
-        </w:rPr>
-        <w:t>[ log</w:t>
-      </w:r>
-      <w:proofErr w:type="gramEnd"/>
-      <w:r>
-        <w:rPr>
-          <w:i/>
-          <w:iCs/>
-        </w:rPr>
-        <w:t xml:space="preserve"> </w:t>
-      </w:r>
-      <w:proofErr w:type="spellStart"/>
-      <w:r>
-        <w:rPr>
-          <w:i/>
-          <w:iCs/>
-        </w:rPr>
-        <w:t>p_k</w:t>
-      </w:r>
-      <w:proofErr w:type="spellEnd"/>
-      <w:r>
-        <w:rPr>
-          <w:i/>
-          <w:iCs/>
-        </w:rPr>
-        <w:t xml:space="preserve"> + </w:t>
-      </w:r>
-      <w:proofErr w:type="spellStart"/>
-      <w:r>
-        <w:rPr>
-          <w:i/>
-          <w:iCs/>
-        </w:rPr>
-        <w:t>b_o</w:t>
-      </w:r>
-      <w:proofErr w:type="spellEnd"/>
-      <w:r>
-        <w:rPr>
-          <w:i/>
-          <w:iCs/>
-        </w:rPr>
-        <w:t xml:space="preserve"> · 1(k = orchard) − </w:t>
-      </w:r>
-      <w:proofErr w:type="spellStart"/>
-      <w:r>
-        <w:rPr>
-          <w:i/>
-          <w:iCs/>
-        </w:rPr>
-        <w:t>b_m</w:t>
-      </w:r>
-      <w:proofErr w:type="spellEnd"/>
-      <w:r>
-        <w:rPr>
-          <w:i/>
-          <w:iCs/>
-        </w:rPr>
-        <w:t xml:space="preserve"> · 1(k ∈ meadows</w:t>
-      </w:r>
-      <w:proofErr w:type="gramStart"/>
-      <w:r>
-        <w:rPr>
-          <w:i/>
-          <w:iCs/>
-        </w:rPr>
-        <w:t>) ]</w:t>
-      </w:r>
-      <w:proofErr w:type="gramEnd"/>
-      <w:r>
-        <w:rPr>
-          <w:i/>
-          <w:iCs/>
-        </w:rPr>
-        <w:t>,</w:t>
+        <w:t>ŷ = argmax_k [ log p_k + b_o · 1(k = orchard) − b_m · 1(k ∈ meadows) ],</w:t>
       </w:r>
     </w:p>
     <w:p>
@@ -1150,23 +606,7 @@
         <w:jc w:val="both"/>
       </w:pPr>
       <w:r>
-        <w:t xml:space="preserve">with </w:t>
-      </w:r>
-      <w:proofErr w:type="spellStart"/>
-      <w:r>
-        <w:t>b_o</w:t>
-      </w:r>
-      <w:proofErr w:type="spellEnd"/>
-      <w:r>
-        <w:t xml:space="preserve"> ∈ {0, 0.5, …, 3} and </w:t>
-      </w:r>
-      <w:proofErr w:type="spellStart"/>
-      <w:r>
-        <w:t>b_m</w:t>
-      </w:r>
-      <w:proofErr w:type="spellEnd"/>
-      <w:r>
-        <w:t xml:space="preserve"> ∈ {0, 0.25, 0.5, 0.75, 1, 1.5, 2}. Together with the two blends and three </w:t>
+        <w:t xml:space="preserve">with b_o ∈ {0, 0.5, …, 3} and b_m ∈ {0, 0.25, 0.5, 0.75, 1, 1.5, 2}. Together with the two blends and three </w:t>
       </w:r>
       <w:r>
         <w:t>multipliers,</w:t>
@@ -1190,29 +630,13 @@
         <w:jc w:val="both"/>
       </w:pPr>
       <w:r>
-        <w:t xml:space="preserve">The second stage re-examines the parcels the meta-classifier considers possible orchards. To train it on candidates that look like test candidates, we compute out-of-fold meta-classifier scores on the training regions: each training region is scored by a meta-classifier trained on the other two. The candidate threshold τ is the 10th percentile of these scores among training orchards, so 90% of training orchards become candidates. A binary </w:t>
-      </w:r>
-      <w:proofErr w:type="spellStart"/>
-      <w:r>
-        <w:t>XGBoost</w:t>
-      </w:r>
-      <w:proofErr w:type="spellEnd"/>
-      <w:r>
-        <w:t xml:space="preserve"> is trained on the training candidates (orchard versus rest) with 9 meta-classifier probabilities, the 15 phenology features, monthly means of the 10 bands and of NDVI, NDRE and NDMI over clear dates, parcel geometry (area, perimeter, compactness, elongation) and the context of the ten nearest parcels (mean and maximum orchard score, mean meadow score, mean distance). Parcels are then ranked with candidates first, ordered by the verifier's probability, followed by non-candidates, ordered by the meta orchard probability (in the implementation a candidate's score is 1 plus the verifier probability). A parcel is </w:t>
+        <w:t xml:space="preserve">The second stage re-examines the parcels the meta-classifier considers possible orchards. To train it on candidates that look like test candidates, we compute out-of-fold meta-classifier scores on the training regions: each training region is scored by a meta-classifier trained on the other two. The candidate threshold τ is the 10th percentile of these scores among training orchards, so 90% of training orchards become candidates. A binary XGBoost is trained on the training candidates (orchard versus rest) with 9 meta-classifier probabilities, the 15 phenology features, monthly means of the 10 bands and of NDVI, NDRE and NDMI over clear dates, parcel geometry (area, perimeter, compactness, elongation) and the context of the ten nearest parcels (mean and maximum orchard score, mean meadow score, mean distance). Parcels are then ranked with candidates first, ordered by the verifier's probability, followed by non-candidates, ordered by the meta orchard probability (in the implementation a candidate's score is 1 plus the verifier probability). A parcel is </w:t>
       </w:r>
       <w:r>
         <w:t>labeled</w:t>
       </w:r>
       <w:r>
-        <w:t xml:space="preserve"> an orchard if its score passes a threshold chosen out of sample (Section 4.2); </w:t>
-      </w:r>
-      <w:proofErr w:type="gramStart"/>
-      <w:r>
-        <w:t>otherwise</w:t>
-      </w:r>
-      <w:proofErr w:type="gramEnd"/>
-      <w:r>
-        <w:t xml:space="preserve"> it receives the meta-classifier's most probable non-orchard class.</w:t>
+        <w:t xml:space="preserve"> an orchard if its score passes a threshold chosen out of sample (Section 4.2); otherwise it receives the meta-classifier's most probable non-orchard class.</w:t>
       </w:r>
     </w:p>
     <w:p>
@@ -1225,7 +649,6 @@
         <w:rPr>
           <w:noProof/>
         </w:rPr>
-        <w:lastRenderedPageBreak/>
         <w:drawing>
           <wp:inline distT="0" distB="0" distL="0" distR="0" wp14:anchorId="6566574F" wp14:editId="22305BF3">
             <wp:extent cx="5667375" cy="2047875"/>
@@ -1317,9 +740,8 @@
           <w:sz w:val="22"/>
           <w:szCs w:val="22"/>
         </w:rPr>
-        <w:t>The project started from a hierarchical mixture of experts (Jordan and Jacobs, 1994). A Transformer router (</w:t>
-      </w:r>
-      <w:proofErr w:type="spellStart"/>
+        <w:t xml:space="preserve">The project started from a hierarchical mixture of experts (Jordan and Jacobs, 1994). A Transformer router (Rußwurm and Körner, 2020) assigns four super-classes; an LTAE expert (Sainte Fare Garnot and Landrieu, 2020) separates barley from wheat; </w:t>
+      </w:r>
       <w:r>
         <w:rPr>
           <w:b w:val="0"/>
@@ -1327,9 +749,8 @@
           <w:sz w:val="22"/>
           <w:szCs w:val="22"/>
         </w:rPr>
-        <w:t>Rußwurm</w:t>
-      </w:r>
-      <w:proofErr w:type="spellEnd"/>
+        <w:t>and a global–local temporal attention (GL-TAE) anomaly gate</w:t>
+      </w:r>
       <w:r>
         <w:rPr>
           <w:b w:val="0"/>
@@ -1337,9 +758,8 @@
           <w:sz w:val="22"/>
           <w:szCs w:val="22"/>
         </w:rPr>
-        <w:t xml:space="preserve"> and Körner, 2020) assigns four super-classes; an LTAE expert (Sainte Fare </w:t>
-      </w:r>
-      <w:proofErr w:type="spellStart"/>
+        <w:t xml:space="preserve"> sends grassland-like parcels either to an MSResNet meadow expert </w:t>
+      </w:r>
       <w:r>
         <w:rPr>
           <w:b w:val="0"/>
@@ -1347,9 +767,8 @@
           <w:sz w:val="22"/>
           <w:szCs w:val="22"/>
         </w:rPr>
-        <w:t>Garnot</w:t>
-      </w:r>
-      <w:proofErr w:type="spellEnd"/>
+        <w:t>or to a prototypical network</w:t>
+      </w:r>
       <w:r>
         <w:rPr>
           <w:b w:val="0"/>
@@ -1357,7 +776,7 @@
           <w:sz w:val="22"/>
           <w:szCs w:val="22"/>
         </w:rPr>
-        <w:t xml:space="preserve"> and Landrieu, 2020) separates barley from wheat; </w:t>
+        <w:t xml:space="preserve"> (Snell et al., 2017) using Mahalanobis distances (Mahalanobis, 1936) for the rare classes. We evaluate this cascade on its own and as a fifth feature block of the meta-classifier </w:t>
       </w:r>
       <w:r>
         <w:rPr>
@@ -1366,102 +785,6 @@
           <w:sz w:val="22"/>
           <w:szCs w:val="22"/>
         </w:rPr>
-        <w:t>and a global–local temporal attention (GL-TAE) anomaly gate</w:t>
-      </w:r>
-      <w:r>
-        <w:rPr>
-          <w:b w:val="0"/>
-          <w:bCs w:val="0"/>
-          <w:sz w:val="22"/>
-          <w:szCs w:val="22"/>
-        </w:rPr>
-        <w:t xml:space="preserve"> sends grassland-like parcels either to an </w:t>
-      </w:r>
-      <w:proofErr w:type="spellStart"/>
-      <w:r>
-        <w:rPr>
-          <w:b w:val="0"/>
-          <w:bCs w:val="0"/>
-          <w:sz w:val="22"/>
-          <w:szCs w:val="22"/>
-        </w:rPr>
-        <w:t>MSResNet</w:t>
-      </w:r>
-      <w:proofErr w:type="spellEnd"/>
-      <w:r>
-        <w:rPr>
-          <w:b w:val="0"/>
-          <w:bCs w:val="0"/>
-          <w:sz w:val="22"/>
-          <w:szCs w:val="22"/>
-        </w:rPr>
-        <w:t xml:space="preserve"> meadow expert </w:t>
-      </w:r>
-      <w:r>
-        <w:rPr>
-          <w:b w:val="0"/>
-          <w:bCs w:val="0"/>
-          <w:sz w:val="22"/>
-          <w:szCs w:val="22"/>
-        </w:rPr>
-        <w:t>or to a prototypical network</w:t>
-      </w:r>
-      <w:r>
-        <w:rPr>
-          <w:b w:val="0"/>
-          <w:bCs w:val="0"/>
-          <w:sz w:val="22"/>
-          <w:szCs w:val="22"/>
-        </w:rPr>
-        <w:t xml:space="preserve"> (Snell et al., 2017) using </w:t>
-      </w:r>
-      <w:proofErr w:type="spellStart"/>
-      <w:r>
-        <w:rPr>
-          <w:b w:val="0"/>
-          <w:bCs w:val="0"/>
-          <w:sz w:val="22"/>
-          <w:szCs w:val="22"/>
-        </w:rPr>
-        <w:t>Mahalanobis</w:t>
-      </w:r>
-      <w:proofErr w:type="spellEnd"/>
-      <w:r>
-        <w:rPr>
-          <w:b w:val="0"/>
-          <w:bCs w:val="0"/>
-          <w:sz w:val="22"/>
-          <w:szCs w:val="22"/>
-        </w:rPr>
-        <w:t xml:space="preserve"> distances (</w:t>
-      </w:r>
-      <w:proofErr w:type="spellStart"/>
-      <w:r>
-        <w:rPr>
-          <w:b w:val="0"/>
-          <w:bCs w:val="0"/>
-          <w:sz w:val="22"/>
-          <w:szCs w:val="22"/>
-        </w:rPr>
-        <w:t>Mahalanobis</w:t>
-      </w:r>
-      <w:proofErr w:type="spellEnd"/>
-      <w:r>
-        <w:rPr>
-          <w:b w:val="0"/>
-          <w:bCs w:val="0"/>
-          <w:sz w:val="22"/>
-          <w:szCs w:val="22"/>
-        </w:rPr>
-        <w:t xml:space="preserve">, 1936) for the rare classes. We evaluate this cascade on its own and as a fifth feature block of the meta-classifier </w:t>
-      </w:r>
-      <w:r>
-        <w:rPr>
-          <w:b w:val="0"/>
-          <w:bCs w:val="0"/>
-          <w:sz w:val="22"/>
-          <w:szCs w:val="22"/>
-        </w:rPr>
         <w:t>(its prototype distances and cereal margins).</w:t>
       </w:r>
     </w:p>
@@ -1489,114 +812,10 @@
         <w:jc w:val="both"/>
       </w:pPr>
       <w:r>
-        <w:t xml:space="preserve">Unless stated otherwise, models are trained on frh01–frh03 and tested on frh04. We report overall accuracy and orchard precision, recall, F1 and average precision (AP, threshold-free, from the blended probabilities), plus micro and macro scores over the nine classes. Every result is the </w:t>
-      </w:r>
-      <w:proofErr w:type="gramStart"/>
-      <w:r>
-        <w:t>mean</w:t>
-      </w:r>
-      <w:proofErr w:type="gramEnd"/>
-      <w:r>
-        <w:t xml:space="preserve"> of three seeds (42, 1 and 2), where the seed sets both the L2A network and the meta-classifier. The meta-classifier uses </w:t>
-      </w:r>
-      <w:proofErr w:type="spellStart"/>
-      <w:r>
-        <w:t>XGBoost</w:t>
-      </w:r>
-      <w:proofErr w:type="spellEnd"/>
-      <w:r>
-        <w:t xml:space="preserve"> 3.2.0 and </w:t>
-      </w:r>
-      <w:proofErr w:type="spellStart"/>
-      <w:r>
-        <w:t>CatBoost</w:t>
-      </w:r>
-      <w:proofErr w:type="spellEnd"/>
-      <w:r>
-        <w:t xml:space="preserve"> 1.2.10; networks are implemented in </w:t>
-      </w:r>
-      <w:proofErr w:type="spellStart"/>
-      <w:r>
-        <w:t>PyTorch</w:t>
-      </w:r>
-      <w:proofErr w:type="spellEnd"/>
-      <w:r>
-        <w:t>.</w:t>
-      </w:r>
-      <w:r>
-        <w:t xml:space="preserve"> The L2A </w:t>
-      </w:r>
-      <w:proofErr w:type="spellStart"/>
-      <w:r>
-        <w:t>MSResNet</w:t>
-      </w:r>
-      <w:proofErr w:type="spellEnd"/>
-      <w:r>
-        <w:t xml:space="preserve"> is trained for ten epochs with Adam (learning rate 6.27 × 10⁻⁴, the setting of the pretrained </w:t>
-      </w:r>
-      <w:proofErr w:type="spellStart"/>
-      <w:r>
-        <w:t>BreizhCrops</w:t>
-      </w:r>
-      <w:proofErr w:type="spellEnd"/>
-      <w:r>
-        <w:t xml:space="preserve"> </w:t>
-      </w:r>
-      <w:proofErr w:type="spellStart"/>
-      <w:r>
-        <w:t>MSResNet</w:t>
-      </w:r>
-      <w:proofErr w:type="spellEnd"/>
-      <w:r>
-        <w:t xml:space="preserve">; weight decay 4.75 × 10⁻⁶; batch size 256; cosine schedule). </w:t>
-      </w:r>
-      <w:proofErr w:type="spellStart"/>
-      <w:r>
-        <w:t>XGBoost</w:t>
-      </w:r>
-      <w:proofErr w:type="spellEnd"/>
-      <w:r>
-        <w:t xml:space="preserve"> and </w:t>
-      </w:r>
-      <w:proofErr w:type="spellStart"/>
-      <w:r>
-        <w:t>CatBoost</w:t>
-      </w:r>
-      <w:proofErr w:type="spellEnd"/>
-      <w:r>
-        <w:t xml:space="preserve"> use 400 trees of depth 8 with learning </w:t>
-      </w:r>
-      <w:proofErr w:type="gramStart"/>
-      <w:r>
-        <w:t>rate</w:t>
-      </w:r>
-      <w:proofErr w:type="gramEnd"/>
-      <w:r>
-        <w:t xml:space="preserve"> 0.05 (</w:t>
-      </w:r>
-      <w:proofErr w:type="spellStart"/>
-      <w:r>
-        <w:t>XGBoost</w:t>
-      </w:r>
-      <w:proofErr w:type="spellEnd"/>
-      <w:r>
-        <w:t xml:space="preserve"> row and column subsampling 0.85); the verifier is an </w:t>
-      </w:r>
-      <w:proofErr w:type="spellStart"/>
-      <w:r>
-        <w:t>XGBoost</w:t>
-      </w:r>
-      <w:proofErr w:type="spellEnd"/>
-      <w:r>
-        <w:t xml:space="preserve"> with 600 trees of depth 6 and learning </w:t>
-      </w:r>
-      <w:proofErr w:type="gramStart"/>
-      <w:r>
-        <w:t>rate</w:t>
-      </w:r>
-      <w:proofErr w:type="gramEnd"/>
-      <w:r>
-        <w:t xml:space="preserve"> 0.05.</w:t>
+        <w:t>Unless stated otherwise, models are trained on frh01–frh03 and tested on frh04. We report overall accuracy and orchard precision, recall, F1 and average precision (AP, threshold-free, from the blended probabilities), plus micro and macro scores over the nine classes. Every result is the mean of three seeds (42, 1 and 2), where the seed sets both the L2A network and the meta-classifier. The meta-classifier uses XGBoost 3.2.0 and CatBoost 1.2.10; networks are implemented in PyTorch.</w:t>
+      </w:r>
+      <w:r>
+        <w:t xml:space="preserve"> The L2A MSResNet is trained for ten epochs with Adam (learning rate 6.27 × 10⁻⁴, the setting of the pretrained BreizhCrops MSResNet; weight decay 4.75 × 10⁻⁶; batch size 256; cosine schedule). XGBoost and CatBoost use 400 trees of depth 8 with learning rate 0.05 (XGBoost row and column subsampling 0.85); the verifier is an XGBoost with 600 trees of depth 6 and learning rate 0.05.</w:t>
       </w:r>
     </w:p>
     <w:p>
@@ -1614,27 +833,7 @@
         <w:jc w:val="both"/>
       </w:pPr>
       <w:r>
-        <w:t xml:space="preserve">Choosing a decoding configuration on the same parcels it is reported on is optimistic, and neighboring parcels are correlated. We therefore cut the test region into 10 km blocks grouped into five spatial folds (Roberts et al., 2017); each fold is scored with the configuration chosen on the other four, and the five folds are concatenated. Three selection rules were fixed in advance: accuracy-first (maximum accuracy subject to orchard recall ≥ 35%), orchard-first (maximum orchard recall subject to accuracy ≥ 80.69%) and closest to a stretch target of 81% accuracy and 60% orchard recall; these thresholds are targets set at the start of the project, the accuracy floor just below the pretrained </w:t>
-      </w:r>
-      <w:proofErr w:type="spellStart"/>
-      <w:r>
-        <w:t>MSResNet’s</w:t>
-      </w:r>
-      <w:proofErr w:type="spellEnd"/>
-      <w:r>
-        <w:t xml:space="preserve"> 80.77%. Intervals are 95% block-bootstrap intervals (</w:t>
-      </w:r>
-      <w:proofErr w:type="spellStart"/>
-      <w:r>
-        <w:t>Künsch</w:t>
-      </w:r>
-      <w:proofErr w:type="spellEnd"/>
-      <w:r>
-        <w:t xml:space="preserve">, 1989) over the same blocks, with 2,000 resamples, and differences between systems are paired, using the same resamples. Point estimates are means of three </w:t>
-      </w:r>
-      <w:r>
-        <w:lastRenderedPageBreak/>
-        <w:t>seeds; where a single interval is given it is for seed 42, while paired differences are tested on every seed. Choosing settings directly on frh04 would have inflated accuracy by at most 0.15 points.</w:t>
+        <w:t>Choosing a decoding configuration on the same parcels it is reported on is optimistic, and neighboring parcels are correlated. We therefore cut the test region into 10 km blocks grouped into five spatial folds (Roberts et al., 2017); each fold is scored with the configuration chosen on the other four, and the five folds are concatenated. Three selection rules were fixed in advance: accuracy-first (maximum accuracy subject to orchard recall ≥ 35%), orchard-first (maximum orchard recall subject to accuracy ≥ 80.69%) and closest to a stretch target of 81% accuracy and 60% orchard recall; these thresholds are targets set at the start of the project, the accuracy floor just below the pretrained MSResNet’s 80.77%. Intervals are 95% block-bootstrap intervals (Künsch, 1989) over the same blocks, with 2,000 resamples, and differences between systems are paired, using the same resamples. Point estimates are means of three seeds; where a single interval is given it is for seed 42, while paired differences are tested on every seed. Choosing settings directly on frh04 would have inflated accuracy by at most 0.15 points.</w:t>
       </w:r>
     </w:p>
     <w:p>
@@ -1653,31 +852,7 @@
         <w:jc w:val="both"/>
       </w:pPr>
       <w:r>
-        <w:t xml:space="preserve">Table 1 compares the final pipeline with single-network baselines, the four-tier expert cascade and end-to-end networks trained on L2A. Single networks reach up to 82.47% accuracy but find at most 17.2% of the orchards, and the cascade raises orchard recall only by collapsing precision to 5.7%. The strongest end-to-end alternative is the same </w:t>
-      </w:r>
-      <w:proofErr w:type="spellStart"/>
-      <w:r>
-        <w:t>MSResNet</w:t>
-      </w:r>
-      <w:proofErr w:type="spellEnd"/>
-      <w:r>
-        <w:t xml:space="preserve"> trained with a class-weighted loss (orchards ×10, or square-</w:t>
-      </w:r>
-      <w:proofErr w:type="spellStart"/>
-      <w:r>
-        <w:t>root</w:t>
-      </w:r>
-      <w:proofErr w:type="spellEnd"/>
-      <w:r>
-        <w:t xml:space="preserve"> inverse frequency capped at 10) and given the </w:t>
-      </w:r>
-      <w:proofErr w:type="gramStart"/>
-      <w:r>
-        <w:t>same decision</w:t>
-      </w:r>
-      <w:proofErr w:type="gramEnd"/>
-      <w:r>
-        <w:t xml:space="preserve"> dial as our system. Weighting moves its operating point but hardly changes how it ranks orchards: orchard AP is 25.2–27.7 against 26.1 without weighting (paired intervals spanning zero), while the full system reaches 35.3 (+7.5 to +10.2, every interval excluding zero). The full system leads at every operating point: it matches the unweighted network’s accuracy at the accuracy-first point (82.67%; 95% interval 81.80–83.46) while nearly tripling its argmax orchard recall (48.7% against 17.2%), and at the orchard-first point it finds 77.8% of the orchards, against at most 62% for any end-to-end network. With the verifier, the system reaches the highest accuracy (82.90%) and orchard F1 (40.5%).</w:t>
+        <w:t>Table 1 compares the final pipeline with single-network baselines, the four-tier expert cascade and end-to-end networks trained on L2A. Single networks reach up to 82.47% accuracy but find at most 17.2% of the orchards, and the cascade raises orchard recall only by collapsing precision to 5.7%. The strongest end-to-end alternative is the same MSResNet trained with a class-weighted loss (orchards ×10, or square-root inverse frequency capped at 10) and given the same decision dial as our system. Weighting moves its operating point but hardly changes how it ranks orchards: orchard AP is 25.2–27.7 against 26.1 without weighting (paired intervals spanning zero), while the full system reaches 35.3 (+7.5 to +10.2, every interval excluding zero). The full system leads at every operating point: it matches the unweighted network’s accuracy at the accuracy-first point (82.67%; 95% interval 81.80–83.46) while nearly tripling its argmax orchard recall (48.7% against 17.2%), and at the orchard-first point it finds 77.8% of the orchards, against at most 62% for any end-to-end network. With the verifier, the system reaches the highest accuracy (82.90%) and orchard F1 (40.5%).</w:t>
       </w:r>
     </w:p>
     <w:p>
@@ -1701,25 +876,7 @@
           <w:sz w:val="20"/>
           <w:szCs w:val="20"/>
         </w:rPr>
-        <w:t xml:space="preserve"> Comparison on frh04 (means of three seeds; accuracy-first unless stated). * Evaluated on the L1C test set (122,614 parcels). † Paired with our systems on </w:t>
-      </w:r>
-      <w:proofErr w:type="gramStart"/>
-      <w:r>
-        <w:rPr>
-          <w:bCs/>
-          <w:sz w:val="20"/>
-          <w:szCs w:val="20"/>
-        </w:rPr>
-        <w:t>the 122,557</w:t>
-      </w:r>
-      <w:proofErr w:type="gramEnd"/>
-      <w:r>
-        <w:rPr>
-          <w:bCs/>
-          <w:sz w:val="20"/>
-          <w:szCs w:val="20"/>
-        </w:rPr>
-        <w:t xml:space="preserve"> parcels that have an L1C series. ‡ Same decoding biases and out-of-sample selection as the full system. Orchard AP is threshold-free, so it is given once per model; – not available. The cascade uses eight-view inputs.</w:t>
+        <w:t xml:space="preserve"> Comparison on frh04 (means of three seeds; accuracy-first unless stated). * Evaluated on the L1C test set (122,614 parcels). † Paired with our systems on the 122,557 parcels that have an L1C series. ‡ Same decoding biases and out-of-sample selection as the full system. Orchard AP is threshold-free, so it is given once per model; – not available. The cascade uses eight-view inputs.</w:t>
       </w:r>
     </w:p>
     <w:tbl>
@@ -2001,23 +1158,7 @@
                 <w:sz w:val="18"/>
                 <w:szCs w:val="18"/>
               </w:rPr>
-              <w:t xml:space="preserve">Pretrained </w:t>
-            </w:r>
-            <w:proofErr w:type="spellStart"/>
-            <w:r>
-              <w:rPr>
-                <w:sz w:val="18"/>
-                <w:szCs w:val="18"/>
-              </w:rPr>
-              <w:t>MSResNet</w:t>
-            </w:r>
-            <w:proofErr w:type="spellEnd"/>
-            <w:r>
-              <w:rPr>
-                <w:sz w:val="18"/>
-                <w:szCs w:val="18"/>
-              </w:rPr>
-              <w:t xml:space="preserve"> *</w:t>
+              <w:t>Pretrained MSResNet *</w:t>
             </w:r>
           </w:p>
         </w:tc>
@@ -2188,23 +1329,7 @@
                 <w:sz w:val="18"/>
                 <w:szCs w:val="18"/>
               </w:rPr>
-              <w:t xml:space="preserve">Pretrained </w:t>
-            </w:r>
-            <w:proofErr w:type="spellStart"/>
-            <w:r>
-              <w:rPr>
-                <w:sz w:val="18"/>
-                <w:szCs w:val="18"/>
-              </w:rPr>
-              <w:t>MSResNet</w:t>
-            </w:r>
-            <w:proofErr w:type="spellEnd"/>
-            <w:r>
-              <w:rPr>
-                <w:sz w:val="18"/>
-                <w:szCs w:val="18"/>
-              </w:rPr>
-              <w:t xml:space="preserve">, 8-view inputs </w:t>
+              <w:t xml:space="preserve">Pretrained MSResNet, 8-view inputs </w:t>
             </w:r>
           </w:p>
         </w:tc>
@@ -2555,25 +1680,7 @@
                 <w:sz w:val="18"/>
                 <w:szCs w:val="18"/>
               </w:rPr>
-              <w:t xml:space="preserve">End-to-end </w:t>
-            </w:r>
-            <w:proofErr w:type="spellStart"/>
-            <w:r>
-              <w:rPr>
-                <w:i/>
-                <w:sz w:val="18"/>
-                <w:szCs w:val="18"/>
-              </w:rPr>
-              <w:t>MSResNet</w:t>
-            </w:r>
-            <w:proofErr w:type="spellEnd"/>
-            <w:r>
-              <w:rPr>
-                <w:i/>
-                <w:sz w:val="18"/>
-                <w:szCs w:val="18"/>
-              </w:rPr>
-              <w:t xml:space="preserve"> on L2A</w:t>
+              <w:t>End-to-end MSResNet on L2A</w:t>
             </w:r>
           </w:p>
         </w:tc>
@@ -2596,21 +1703,12 @@
             </w:tcMar>
           </w:tcPr>
           <w:p>
-            <w:proofErr w:type="spellStart"/>
-            <w:r>
-              <w:rPr>
-                <w:sz w:val="18"/>
-                <w:szCs w:val="18"/>
-              </w:rPr>
-              <w:t>MSResNet</w:t>
-            </w:r>
-            <w:proofErr w:type="spellEnd"/>
-            <w:r>
-              <w:rPr>
-                <w:sz w:val="18"/>
-                <w:szCs w:val="18"/>
-              </w:rPr>
-              <w:t xml:space="preserve"> trained on L2A</w:t>
+            <w:r>
+              <w:rPr>
+                <w:sz w:val="18"/>
+                <w:szCs w:val="18"/>
+              </w:rPr>
+              <w:t>MSResNet trained on L2A</w:t>
             </w:r>
           </w:p>
         </w:tc>
@@ -2776,21 +1874,12 @@
             </w:tcMar>
           </w:tcPr>
           <w:p>
-            <w:proofErr w:type="spellStart"/>
-            <w:r>
-              <w:rPr>
-                <w:sz w:val="18"/>
-                <w:szCs w:val="18"/>
-              </w:rPr>
-              <w:t>MSResNet</w:t>
-            </w:r>
-            <w:proofErr w:type="spellEnd"/>
-            <w:r>
-              <w:rPr>
-                <w:sz w:val="18"/>
-                <w:szCs w:val="18"/>
-              </w:rPr>
-              <w:t xml:space="preserve"> on L2A + decision dial </w:t>
+            <w:r>
+              <w:rPr>
+                <w:sz w:val="18"/>
+                <w:szCs w:val="18"/>
+              </w:rPr>
+              <w:t xml:space="preserve">MSResNet on L2A + decision dial </w:t>
             </w:r>
           </w:p>
         </w:tc>
@@ -2949,21 +2038,12 @@
             </w:tcMar>
           </w:tcPr>
           <w:p>
-            <w:proofErr w:type="spellStart"/>
-            <w:r>
-              <w:rPr>
-                <w:sz w:val="18"/>
-                <w:szCs w:val="18"/>
-              </w:rPr>
-              <w:t>MSResNet</w:t>
-            </w:r>
-            <w:proofErr w:type="spellEnd"/>
-            <w:r>
-              <w:rPr>
-                <w:sz w:val="18"/>
-                <w:szCs w:val="18"/>
-              </w:rPr>
-              <w:t xml:space="preserve"> on L2A, orchards ×10 + dial </w:t>
+            <w:r>
+              <w:rPr>
+                <w:sz w:val="18"/>
+                <w:szCs w:val="18"/>
+              </w:rPr>
+              <w:t xml:space="preserve">MSResNet on L2A, orchards ×10 + dial </w:t>
             </w:r>
           </w:p>
         </w:tc>
@@ -3884,15 +2964,7 @@
         <w:jc w:val="both"/>
       </w:pPr>
       <w:r>
-        <w:t xml:space="preserve">Across all nine classes on the 122,557 paired parcels, macro F1 rises from 59.43 (pretrained </w:t>
-      </w:r>
-      <w:proofErr w:type="spellStart"/>
-      <w:r>
-        <w:t>MSResNet</w:t>
-      </w:r>
-      <w:proofErr w:type="spellEnd"/>
-      <w:r>
-        <w:t xml:space="preserve">) to 62.12 (meta-classifier) and 63.33 (with verifier), capped across all systems by sunflower and nuts (2 and 11 test parcels, which no model </w:t>
+        <w:t xml:space="preserve">Across all nine classes on the 122,557 paired parcels, macro F1 rises from 59.43 (pretrained MSResNet) to 62.12 (meta-classifier) and 63.33 (with verifier), capped across all systems by sunflower and nuts (2 and 11 test parcels, which no model </w:t>
       </w:r>
       <w:r>
         <w:t>recognizes</w:t>
@@ -3916,19 +2988,7 @@
         <w:jc w:val="both"/>
       </w:pPr>
       <w:r>
-        <w:t xml:space="preserve">Table 2 isolates the network block on top of meta-classifier + phenology, in the configuration used before the expert blocks were dropped (one network per seed). The same </w:t>
-      </w:r>
-      <w:proofErr w:type="spellStart"/>
-      <w:r>
-        <w:t>MSResNet</w:t>
-      </w:r>
-      <w:proofErr w:type="spellEnd"/>
-      <w:r>
-        <w:t xml:space="preserve"> trained on L1C data adds nothing measurable (orchard AP 26.8 against 26.5); trained on L2A, it adds 8 points of orchard AP and 10–13 points of orchard recall at an 81% accuracy floor, and it beats the L1C network by 9–11 points of recall at that floor, every interval excluding zero. The gain therefore comes from the corrected </w:t>
-      </w:r>
-      <w:r>
-        <w:lastRenderedPageBreak/>
-        <w:t>L2A input, not from a second network. Cloud screening helps the network alone (+4 points of orchard recall) but not after fusion.</w:t>
+        <w:t>Table 2 isolates the network block on top of meta-classifier + phenology, in the configuration used before the expert blocks were dropped (one network per seed). The same MSResNet trained on L1C data adds nothing measurable (orchard AP 26.8 against 26.5); trained on L2A, it adds 8 points of orchard AP and 10–13 points of orchard recall at an 81% accuracy floor, and it beats the L1C network by 9–11 points of recall at that floor, every interval excluding zero. The gain therefore comes from the corrected L2A input, not from a second network. Cloud screening helps the network alone (+4 points of orchard recall) but not after fusion.</w:t>
       </w:r>
     </w:p>
     <w:p>
@@ -3952,25 +3012,7 @@
           <w:sz w:val="20"/>
           <w:szCs w:val="20"/>
         </w:rPr>
-        <w:t xml:space="preserve"> Effect of the extra network block on top of meta + phenology (expert blocks </w:t>
-      </w:r>
-      <w:proofErr w:type="gramStart"/>
-      <w:r>
-        <w:rPr>
-          <w:bCs/>
-          <w:sz w:val="20"/>
-          <w:szCs w:val="20"/>
-        </w:rPr>
-        <w:t>still included,</w:t>
-      </w:r>
-      <w:proofErr w:type="gramEnd"/>
-      <w:r>
-        <w:rPr>
-          <w:bCs/>
-          <w:sz w:val="20"/>
-          <w:szCs w:val="20"/>
-        </w:rPr>
-        <w:t xml:space="preserve"> one network per seed; accuracy-first point, and orchard recall at accuracy ≥ 81%; means of three seeds).</w:t>
+        <w:t xml:space="preserve"> Effect of the extra network block on top of meta + phenology (expert blocks still included, one network per seed; accuracy-first point, and orchard recall at accuracy ≥ 81%; means of three seeds).</w:t>
       </w:r>
     </w:p>
     <w:tbl>
@@ -4181,7 +3223,6 @@
             <w:pPr>
               <w:jc w:val="right"/>
             </w:pPr>
-            <w:proofErr w:type="spellStart"/>
             <w:r>
               <w:rPr>
                 <w:b/>
@@ -4189,9 +3230,31 @@
                 <w:sz w:val="18"/>
                 <w:szCs w:val="18"/>
               </w:rPr>
-              <w:t>R at</w:t>
-            </w:r>
-            <w:proofErr w:type="spellEnd"/>
+              <w:t>R at acc ≥ 81%</w:t>
+            </w:r>
+          </w:p>
+        </w:tc>
+        <w:tc>
+          <w:tcPr>
+            <w:tcW w:w="1000" w:type="dxa"/>
+            <w:tcBorders>
+              <w:top w:val="single" w:sz="4" w:space="0" w:color="999999"/>
+              <w:left w:val="single" w:sz="4" w:space="0" w:color="999999"/>
+              <w:bottom w:val="single" w:sz="4" w:space="0" w:color="999999"/>
+              <w:right w:val="single" w:sz="4" w:space="0" w:color="999999"/>
+            </w:tcBorders>
+            <w:shd w:val="clear" w:color="auto" w:fill="EDEDED"/>
+            <w:tcMar>
+              <w:top w:w="40" w:type="dxa"/>
+              <w:left w:w="80" w:type="dxa"/>
+              <w:bottom w:w="40" w:type="dxa"/>
+              <w:right w:w="80" w:type="dxa"/>
+            </w:tcMar>
+          </w:tcPr>
+          <w:p>
+            <w:pPr>
+              <w:jc w:val="right"/>
+            </w:pPr>
             <w:r>
               <w:rPr>
                 <w:b/>
@@ -4199,38 +3262,6 @@
                 <w:sz w:val="18"/>
                 <w:szCs w:val="18"/>
               </w:rPr>
-              <w:t xml:space="preserve"> acc ≥ 81%</w:t>
-            </w:r>
-          </w:p>
-        </w:tc>
-        <w:tc>
-          <w:tcPr>
-            <w:tcW w:w="1000" w:type="dxa"/>
-            <w:tcBorders>
-              <w:top w:val="single" w:sz="4" w:space="0" w:color="999999"/>
-              <w:left w:val="single" w:sz="4" w:space="0" w:color="999999"/>
-              <w:bottom w:val="single" w:sz="4" w:space="0" w:color="999999"/>
-              <w:right w:val="single" w:sz="4" w:space="0" w:color="999999"/>
-            </w:tcBorders>
-            <w:shd w:val="clear" w:color="auto" w:fill="EDEDED"/>
-            <w:tcMar>
-              <w:top w:w="40" w:type="dxa"/>
-              <w:left w:w="80" w:type="dxa"/>
-              <w:bottom w:w="40" w:type="dxa"/>
-              <w:right w:w="80" w:type="dxa"/>
-            </w:tcMar>
-          </w:tcPr>
-          <w:p>
-            <w:pPr>
-              <w:jc w:val="right"/>
-            </w:pPr>
-            <w:r>
-              <w:rPr>
-                <w:b/>
-                <w:bCs/>
-                <w:sz w:val="18"/>
-                <w:szCs w:val="18"/>
-              </w:rPr>
               <w:t>Orch. AP</w:t>
             </w:r>
           </w:p>
@@ -4658,21 +3689,12 @@
             </w:tcMar>
           </w:tcPr>
           <w:p>
-            <w:proofErr w:type="gramStart"/>
-            <w:r>
-              <w:rPr>
-                <w:sz w:val="18"/>
-                <w:szCs w:val="18"/>
-              </w:rPr>
-              <w:t>Network on</w:t>
-            </w:r>
-            <w:proofErr w:type="gramEnd"/>
-            <w:r>
-              <w:rPr>
-                <w:sz w:val="18"/>
-                <w:szCs w:val="18"/>
-              </w:rPr>
-              <w:t xml:space="preserve"> L2A, all dates</w:t>
+            <w:r>
+              <w:rPr>
+                <w:sz w:val="18"/>
+                <w:szCs w:val="18"/>
+              </w:rPr>
+              <w:t>Network on L2A, all dates</w:t>
             </w:r>
           </w:p>
         </w:tc>
@@ -5215,23 +4237,7 @@
         <w:t>Decoding.</w:t>
       </w:r>
       <w:r>
-        <w:t xml:space="preserve"> The </w:t>
-      </w:r>
-      <w:proofErr w:type="spellStart"/>
-      <w:r>
-        <w:t>CatBoost</w:t>
-      </w:r>
-      <w:proofErr w:type="spellEnd"/>
-      <w:r>
-        <w:t xml:space="preserve"> blend matters: </w:t>
-      </w:r>
-      <w:proofErr w:type="spellStart"/>
-      <w:r>
-        <w:t>XGBoost</w:t>
-      </w:r>
-      <w:proofErr w:type="spellEnd"/>
-      <w:r>
-        <w:t xml:space="preserve"> alone loses 4–7 points of orchard recall at the accuracy-first point.</w:t>
+        <w:t xml:space="preserve"> The CatBoost blend matters: XGBoost alone loses 4–7 points of orchard recall at the accuracy-first point.</w:t>
       </w:r>
     </w:p>
     <w:p>
@@ -5717,7 +4723,6 @@
                 <w:sz w:val="18"/>
                 <w:szCs w:val="18"/>
               </w:rPr>
-              <w:lastRenderedPageBreak/>
               <w:t>Meta + verifier</w:t>
             </w:r>
           </w:p>
@@ -6281,23 +5286,7 @@
           <w:sz w:val="20"/>
           <w:szCs w:val="20"/>
         </w:rPr>
-        <w:t xml:space="preserve">(a, b) Monthly medians (lines) and interquartile ranges (bands) of clear-date NDVI and NDMI for orchards and the two meadow classes in the training regions frh01–frh03. Orchards are less green and drier than both meadow classes from winter to spring and in autumn, while temporary meadows drop in summer (mowing or grazing). (c) Orchard precision–recall curves on frh04 for the pretrained </w:t>
-      </w:r>
-      <w:proofErr w:type="spellStart"/>
-      <w:r>
-        <w:rPr>
-          <w:sz w:val="20"/>
-          <w:szCs w:val="20"/>
-        </w:rPr>
-        <w:t>MSResNet</w:t>
-      </w:r>
-      <w:proofErr w:type="spellEnd"/>
-      <w:r>
-        <w:rPr>
-          <w:sz w:val="20"/>
-          <w:szCs w:val="20"/>
-        </w:rPr>
-        <w:t>, the meta-classifier and the verifier (seed 42; the 122,557 parcels with an L1C series).</w:t>
+        <w:t>(a, b) Monthly medians (lines) and interquartile ranges (bands) of clear-date NDVI and NDMI for orchards and the two meadow classes in the training regions frh01–frh03. Orchards are less green and drier than both meadow classes from winter to spring and in autumn, while temporary meadows drop in summer (mowing or grazing). (c) Orchard precision–recall curves on frh04 for the pretrained MSResNet, the meta-classifier and the verifier (seed 42; the 122,557 parcels with an L1C series).</w:t>
       </w:r>
     </w:p>
     <w:p>
@@ -7391,27 +6380,7 @@
         <w:jc w:val="both"/>
       </w:pPr>
       <w:r>
-        <w:t xml:space="preserve">Every design choice above was made on frh04. We therefore froze the design and wrote down four checks before rotating the test region over all four regions, each time training on the other three. Because the pretrained </w:t>
-      </w:r>
-      <w:proofErr w:type="spellStart"/>
-      <w:r>
-        <w:t>BreizhCrops</w:t>
-      </w:r>
-      <w:proofErr w:type="spellEnd"/>
-      <w:r>
-        <w:t xml:space="preserve"> networks were trained on frh01–frh03, the rotation uses a variant that replaces them with our own L1C </w:t>
-      </w:r>
-      <w:proofErr w:type="spellStart"/>
-      <w:r>
-        <w:t>MSResNet</w:t>
-      </w:r>
-      <w:proofErr w:type="spellEnd"/>
-      <w:r>
-        <w:t xml:space="preserve"> trained per fold, and one L2A network seed per fold. The </w:t>
-      </w:r>
-      <w:r>
-        <w:lastRenderedPageBreak/>
-        <w:t>arms are B (metadata + phenology + L1C network + L2A network), A (B without the L2A network), D (B without phenology) and C (B with the verifier). Table 5 and Fig. 3 give the results.</w:t>
+        <w:t>Every design choice above was made on frh04. We therefore froze the design and wrote down four checks before rotating the test region over all four regions, each time training on the other three. Because the pretrained BreizhCrops networks were trained on frh01–frh03, the rotation uses a variant that replaces them with our own L1C MSResNet trained per fold, and one L2A network seed per fold. The arms are B (metadata + phenology + L1C network + L2A network), A (B without the L2A network), D (B without phenology) and C (B with the verifier). Table 5 and Fig. 3 give the results.</w:t>
       </w:r>
     </w:p>
     <w:p>
@@ -7718,27 +6687,7 @@
                 <w:sz w:val="18"/>
                 <w:szCs w:val="18"/>
               </w:rPr>
-              <w:t xml:space="preserve">AP, no </w:t>
-            </w:r>
-            <w:proofErr w:type="spellStart"/>
-            <w:r>
-              <w:rPr>
-                <w:b/>
-                <w:bCs/>
-                <w:sz w:val="18"/>
-                <w:szCs w:val="18"/>
-              </w:rPr>
-              <w:t>pheno</w:t>
-            </w:r>
-            <w:proofErr w:type="spellEnd"/>
-            <w:r>
-              <w:rPr>
-                <w:b/>
-                <w:bCs/>
-                <w:sz w:val="18"/>
-                <w:szCs w:val="18"/>
-              </w:rPr>
-              <w:t>.</w:t>
+              <w:t>AP, no pheno.</w:t>
             </w:r>
           </w:p>
         </w:tc>
@@ -8933,21 +7882,7 @@
         <w:rPr>
           <w:bCs/>
         </w:rPr>
-        <w:t xml:space="preserve"> frh03 holds 40% of all orchards, so its fold trains on the fewest (1,837, against 2,117–2,706) and gets the loosest candidate threshold: 18% of its parcels become candidates, against 8–10% elsewhere. Fixing the candidate share at 9% in every fold removes the small loss (AP change −0.3 to +0.3) without creating a </w:t>
-      </w:r>
-      <w:proofErr w:type="gramStart"/>
-      <w:r>
-        <w:rPr>
-          <w:bCs/>
-        </w:rPr>
-        <w:t>gain, and</w:t>
-      </w:r>
-      <w:proofErr w:type="gramEnd"/>
-      <w:r>
-        <w:rPr>
-          <w:bCs/>
-        </w:rPr>
-        <w:t xml:space="preserve"> removing the neighbor or monthly features does not help either; the threshold explains part of the failure, not all of it. These checks were run after the rotation and leave the frozen design unchanged.</w:t>
+        <w:t xml:space="preserve"> frh03 holds 40% of all orchards, so its fold trains on the fewest (1,837, against 2,117–2,706) and gets the loosest candidate threshold: 18% of its parcels become candidates, against 8–10% elsewhere. Fixing the candidate share at 9% in every fold removes the small loss (AP change −0.3 to +0.3) without creating a gain, and removing the neighbor or monthly features does not help either; the threshold explains part of the failure, not all of it. These checks were run after the rotation and leave the frozen design unchanged.</w:t>
       </w:r>
     </w:p>
     <w:p>
@@ -8960,7 +7895,6 @@
         <w:rPr>
           <w:noProof/>
         </w:rPr>
-        <w:lastRenderedPageBreak/>
         <w:drawing>
           <wp:inline distT="0" distB="0" distL="0" distR="0" wp14:anchorId="492921B3" wp14:editId="49FEBE2C">
             <wp:extent cx="3019425" cy="2686050"/>
@@ -9039,23 +7973,7 @@
         <w:jc w:val="both"/>
       </w:pPr>
       <w:r>
-        <w:t xml:space="preserve">On </w:t>
-      </w:r>
-      <w:proofErr w:type="spellStart"/>
-      <w:r>
-        <w:t>BreizhCrops</w:t>
-      </w:r>
-      <w:proofErr w:type="spellEnd"/>
-      <w:r>
-        <w:t xml:space="preserve">, mapping orchards is an orchard-versus-meadow problem, and it responds to seasonal evidence rather than to extra model capacity. Phenology features from cloud-free dates and an </w:t>
-      </w:r>
-      <w:proofErr w:type="spellStart"/>
-      <w:r>
-        <w:t>MSResNet</w:t>
-      </w:r>
-      <w:proofErr w:type="spellEnd"/>
-      <w:r>
-        <w:t xml:space="preserve"> trained on L2A series, fused late with pretrained networks, lift orchard recall from 15.7% to 48.7–77.8% at 80.8–82.7% accuracy. The input level matters: the same network trained on L1C data adds almost nothing. A hierarchy of experts adds little once these blocks are in, and an end-to-end network trained with an orchard-weighted loss shifts its operating point without learning to rank orchards better (orchard AP about 27 against 35). A verifier with seasonal, geometric and </w:t>
+        <w:t xml:space="preserve">On BreizhCrops, mapping orchards is an orchard-versus-meadow problem, and it responds to seasonal evidence rather than to extra model capacity. Phenology features from cloud-free dates and an MSResNet trained on L2A series, fused late with pretrained networks, lift orchard recall from 15.7% to 48.7–77.8% at 80.8–82.7% accuracy. The input level matters: the same network trained on L1C data adds almost nothing. A hierarchy of experts adds little once these blocks are in, and an end-to-end network trained with an orchard-weighted loss shifts its operating point without learning to rank orchards better (orchard AP about 27 against 35). A verifier with seasonal, geometric and </w:t>
       </w:r>
       <w:r>
         <w:t>neighborhood</w:t>
@@ -9064,15 +7982,7 @@
         <w:t xml:space="preserve"> evidence raises orchard precision at the high-accuracy end from 34.8% to 45.5% at equal recall. </w:t>
       </w:r>
       <w:r>
-        <w:t xml:space="preserve">Training details matter as well: without recomputing its </w:t>
-      </w:r>
-      <w:proofErr w:type="spellStart"/>
-      <w:r>
-        <w:t>BatchNorm</w:t>
-      </w:r>
-      <w:proofErr w:type="spellEnd"/>
-      <w:r>
-        <w:t xml:space="preserve"> statistics, the L2A network alone loses more than 20 points of accuracy.</w:t>
+        <w:t>Training details matter as well: without recomputing its BatchNorm statistics, the L2A network alone loses more than 20 points of accuracy.</w:t>
       </w:r>
       <w:r>
         <w:t xml:space="preserve"> Training the meta-classifier on out-of-sample network outputs changes neither accuracy nor orchard AP, so the stacking design does not inflate these numbers.</w:t>
@@ -9084,15 +7994,7 @@
         <w:jc w:val="both"/>
       </w:pPr>
       <w:r>
-        <w:t xml:space="preserve">A pre-registered rotation over all four regions confirms the main findings: the gains from phenology and from the L2A network </w:t>
-      </w:r>
-      <w:proofErr w:type="gramStart"/>
-      <w:r>
-        <w:t>hold</w:t>
-      </w:r>
-      <w:proofErr w:type="gramEnd"/>
-      <w:r>
-        <w:t xml:space="preserve"> in every region. It also qualifies one of them: the verifier helps in three regions and is neutral in frh03, whose fold trains on the fewest orchards; a loose candidate threshold explains part, but not all, of this.</w:t>
+        <w:t>A pre-registered rotation over all four regions confirms the main findings: the gains from phenology and from the L2A network hold in every region. It also qualifies one of them: the verifier helps in three regions and is neutral in frh03, whose fold trains on the fewest orchards; a loose candidate threshold explains part, but not all, of this.</w:t>
       </w:r>
     </w:p>
     <w:p>
@@ -9133,7 +8035,6 @@
         <w:keepNext/>
       </w:pPr>
       <w:r>
-        <w:lastRenderedPageBreak/>
         <w:t>Data and code availability</w:t>
       </w:r>
     </w:p>
@@ -9141,47 +8042,11 @@
       <w:pPr>
         <w:jc w:val="both"/>
       </w:pPr>
-      <w:proofErr w:type="spellStart"/>
-      <w:r>
-        <w:t>BreizhCrops</w:t>
-      </w:r>
-      <w:proofErr w:type="spellEnd"/>
-      <w:r>
-        <w:t xml:space="preserve"> is publicly available (</w:t>
-      </w:r>
-      <w:proofErr w:type="spellStart"/>
-      <w:r>
-        <w:t>Rußwurm</w:t>
-      </w:r>
-      <w:proofErr w:type="spellEnd"/>
-      <w:r>
-        <w:t xml:space="preserve"> et al., 2020). The code for every experiment and the logs behind every number in this paper are available</w:t>
-      </w:r>
-      <w:r>
-        <w:t xml:space="preserve"> </w:t>
-      </w:r>
-      <w:hyperlink r:id="rId10" w:history="1">
-        <w:r>
-          <w:rPr>
-            <w:rStyle w:val="Hyperlink"/>
-          </w:rPr>
-          <w:t>on Git</w:t>
-        </w:r>
-        <w:r>
-          <w:rPr>
-            <w:rStyle w:val="Hyperlink"/>
-          </w:rPr>
-          <w:t>H</w:t>
-        </w:r>
-        <w:r>
-          <w:rPr>
-            <w:rStyle w:val="Hyperlink"/>
-          </w:rPr>
-          <w:t>ub</w:t>
-        </w:r>
-      </w:hyperlink>
-      <w:r>
-        <w:t>.</w:t>
+      <w:r>
+        <w:t xml:space="preserve">BreizhCrops is publicly available (Rußwurm et al., 2020). The code for every experiment and the logs behind every number in this paper </w:t>
+      </w:r>
+      <w:r>
+        <w:t>are available on GitHub: https://github.com/Tudor810/orchards-in-the-meadow.</w:t>
       </w:r>
     </w:p>
     <w:p>
@@ -9203,39 +8068,7 @@
           <w:sz w:val="19"/>
           <w:szCs w:val="19"/>
         </w:rPr>
-        <w:t xml:space="preserve">Chen, T., </w:t>
-      </w:r>
-      <w:proofErr w:type="spellStart"/>
-      <w:r>
-        <w:rPr>
-          <w:sz w:val="19"/>
-          <w:szCs w:val="19"/>
-        </w:rPr>
-        <w:t>Guestrin</w:t>
-      </w:r>
-      <w:proofErr w:type="spellEnd"/>
-      <w:r>
-        <w:rPr>
-          <w:sz w:val="19"/>
-          <w:szCs w:val="19"/>
-        </w:rPr>
-        <w:t xml:space="preserve">, C., 2016. </w:t>
-      </w:r>
-      <w:proofErr w:type="spellStart"/>
-      <w:r>
-        <w:rPr>
-          <w:sz w:val="19"/>
-          <w:szCs w:val="19"/>
-        </w:rPr>
-        <w:t>XGBoost</w:t>
-      </w:r>
-      <w:proofErr w:type="spellEnd"/>
-      <w:r>
-        <w:rPr>
-          <w:sz w:val="19"/>
-          <w:szCs w:val="19"/>
-        </w:rPr>
-        <w:t xml:space="preserve">: a scalable tree boosting system. In: </w:t>
+        <w:t xml:space="preserve">Chen, T., Guestrin, C., 2016. XGBoost: a scalable tree boosting system. In: </w:t>
       </w:r>
       <w:r>
         <w:rPr>
@@ -9259,21 +8092,12 @@
         <w:spacing w:after="80" w:line="252" w:lineRule="auto"/>
         <w:ind w:left="360" w:hanging="360"/>
       </w:pPr>
-      <w:proofErr w:type="spellStart"/>
-      <w:r>
-        <w:rPr>
-          <w:sz w:val="19"/>
-          <w:szCs w:val="19"/>
-        </w:rPr>
-        <w:t>Defourny</w:t>
-      </w:r>
-      <w:proofErr w:type="spellEnd"/>
-      <w:r>
-        <w:rPr>
-          <w:sz w:val="19"/>
-          <w:szCs w:val="19"/>
-        </w:rPr>
-        <w:t xml:space="preserve">, P., Bontemps, S., Bellemans, N., et al., 2019. Near real-time agriculture monitoring at national scale at parcel resolution: performance assessment of the Sen2-Agri automated system in various cropping systems around the world. </w:t>
+      <w:r>
+        <w:rPr>
+          <w:sz w:val="19"/>
+          <w:szCs w:val="19"/>
+        </w:rPr>
+        <w:t xml:space="preserve">Defourny, P., Bontemps, S., Bellemans, N., et al., 2019. Near real-time agriculture monitoring at national scale at parcel resolution: performance assessment of the Sen2-Agri automated system in various cropping systems around the world. </w:t>
       </w:r>
       <w:r>
         <w:rPr>
@@ -9360,23 +8184,7 @@
           <w:sz w:val="19"/>
           <w:szCs w:val="19"/>
         </w:rPr>
-        <w:t xml:space="preserve">Gitelson, A., </w:t>
-      </w:r>
-      <w:proofErr w:type="spellStart"/>
-      <w:r>
-        <w:rPr>
-          <w:sz w:val="19"/>
-          <w:szCs w:val="19"/>
-        </w:rPr>
-        <w:t>Merzlyak</w:t>
-      </w:r>
-      <w:proofErr w:type="spellEnd"/>
-      <w:r>
-        <w:rPr>
-          <w:sz w:val="19"/>
-          <w:szCs w:val="19"/>
-        </w:rPr>
-        <w:t xml:space="preserve">, M.N., 1994. Spectral reflectance changes associated with autumn senescence of </w:t>
+        <w:t xml:space="preserve">Gitelson, A., Merzlyak, M.N., 1994. Spectral reflectance changes associated with autumn senescence of </w:t>
       </w:r>
       <w:r>
         <w:rPr>
@@ -9401,9 +8209,15 @@
           <w:sz w:val="19"/>
           <w:szCs w:val="19"/>
         </w:rPr>
-        <w:t xml:space="preserve">Acer </w:t>
-      </w:r>
-      <w:proofErr w:type="spellStart"/>
+        <w:t>Acer platanoides</w:t>
+      </w:r>
+      <w:r>
+        <w:rPr>
+          <w:sz w:val="19"/>
+          <w:szCs w:val="19"/>
+        </w:rPr>
+        <w:t xml:space="preserve"> L. leaves: spectral features and relation to chlorophyll estimation. </w:t>
+      </w:r>
       <w:r>
         <w:rPr>
           <w:i/>
@@ -9411,15 +8225,27 @@
           <w:sz w:val="19"/>
           <w:szCs w:val="19"/>
         </w:rPr>
-        <w:t>platanoides</w:t>
-      </w:r>
-      <w:proofErr w:type="spellEnd"/>
-      <w:r>
-        <w:rPr>
-          <w:sz w:val="19"/>
-          <w:szCs w:val="19"/>
-        </w:rPr>
-        <w:t xml:space="preserve"> L. leaves: spectral features and relation to chlorophyll estimation. </w:t>
+        <w:t>Journal of Plant Physiology</w:t>
+      </w:r>
+      <w:r>
+        <w:rPr>
+          <w:sz w:val="19"/>
+          <w:szCs w:val="19"/>
+        </w:rPr>
+        <w:t xml:space="preserve"> 143(3), 286–292. https://doi.org/10.1016/S0176-1617(11)81633-0</w:t>
+      </w:r>
+    </w:p>
+    <w:p>
+      <w:pPr>
+        <w:spacing w:after="80" w:line="252" w:lineRule="auto"/>
+        <w:ind w:left="360" w:hanging="360"/>
+      </w:pPr>
+      <w:r>
+        <w:rPr>
+          <w:sz w:val="19"/>
+          <w:szCs w:val="19"/>
+        </w:rPr>
+        <w:t xml:space="preserve">He, H., Garcia, E.A., 2009. Learning from imbalanced data. </w:t>
       </w:r>
       <w:r>
         <w:rPr>
@@ -9428,14 +8254,14 @@
           <w:sz w:val="19"/>
           <w:szCs w:val="19"/>
         </w:rPr>
-        <w:t>Journal of Plant Physiology</w:t>
-      </w:r>
-      <w:r>
-        <w:rPr>
-          <w:sz w:val="19"/>
-          <w:szCs w:val="19"/>
-        </w:rPr>
-        <w:t xml:space="preserve"> 143(3), 286–292. https://doi.org/10.1016/S0176-1617(11)81633-0</w:t>
+        <w:t>IEEE Transactions on Knowledge and Data Engineering</w:t>
+      </w:r>
+      <w:r>
+        <w:rPr>
+          <w:sz w:val="19"/>
+          <w:szCs w:val="19"/>
+        </w:rPr>
+        <w:t xml:space="preserve"> 21(9), 1263–1284. https://doi.org/10.1109/TKDE.2008.239</w:t>
       </w:r>
     </w:p>
     <w:p>
@@ -9448,7 +8274,7 @@
           <w:sz w:val="19"/>
           <w:szCs w:val="19"/>
         </w:rPr>
-        <w:t xml:space="preserve">He, H., Garcia, E.A., 2009. Learning from imbalanced data. </w:t>
+        <w:t xml:space="preserve">He, K., Zhang, X., Ren, S., Sun, J., 2016. Deep residual learning for image recognition. In: </w:t>
       </w:r>
       <w:r>
         <w:rPr>
@@ -9457,14 +8283,14 @@
           <w:sz w:val="19"/>
           <w:szCs w:val="19"/>
         </w:rPr>
-        <w:t>IEEE Transactions on Knowledge and Data Engineering</w:t>
-      </w:r>
-      <w:r>
-        <w:rPr>
-          <w:sz w:val="19"/>
-          <w:szCs w:val="19"/>
-        </w:rPr>
-        <w:t xml:space="preserve"> 21(9), 1263–1284. https://doi.org/10.1109/TKDE.2008.239</w:t>
+        <w:t>Proceedings of the IEEE Conference on Computer Vision and Pattern Recognition (CVPR)</w:t>
+      </w:r>
+      <w:r>
+        <w:rPr>
+          <w:sz w:val="19"/>
+          <w:szCs w:val="19"/>
+        </w:rPr>
+        <w:t>, pp. 770–778. https://doi.org/10.1109/CVPR.2016.90</w:t>
       </w:r>
     </w:p>
     <w:p>
@@ -9477,7 +8303,7 @@
           <w:sz w:val="19"/>
           <w:szCs w:val="19"/>
         </w:rPr>
-        <w:t xml:space="preserve">He, K., Zhang, X., Ren, S., Sun, J., 2016. Deep residual learning for image recognition. In: </w:t>
+        <w:t xml:space="preserve">Inglada, J., Arias, M., Tardy, B., et al., 2015. Assessment of an operational system for crop type map production using high temporal and spatial resolution satellite optical imagery. </w:t>
       </w:r>
       <w:r>
         <w:rPr>
@@ -9486,14 +8312,14 @@
           <w:sz w:val="19"/>
           <w:szCs w:val="19"/>
         </w:rPr>
-        <w:t>Proceedings of the IEEE Conference on Computer Vision and Pattern Recognition (CVPR)</w:t>
-      </w:r>
-      <w:r>
-        <w:rPr>
-          <w:sz w:val="19"/>
-          <w:szCs w:val="19"/>
-        </w:rPr>
-        <w:t>, pp. 770–778. https://doi.org/10.1109/CVPR.2016.90</w:t>
+        <w:t>Remote Sensing</w:t>
+      </w:r>
+      <w:r>
+        <w:rPr>
+          <w:sz w:val="19"/>
+          <w:szCs w:val="19"/>
+        </w:rPr>
+        <w:t xml:space="preserve"> 7(9), 12356–12379. https://doi.org/10.3390/rs70912356</w:t>
       </w:r>
     </w:p>
     <w:p>
@@ -9501,21 +8327,12 @@
         <w:spacing w:after="80" w:line="252" w:lineRule="auto"/>
         <w:ind w:left="360" w:hanging="360"/>
       </w:pPr>
-      <w:proofErr w:type="spellStart"/>
-      <w:r>
-        <w:rPr>
-          <w:sz w:val="19"/>
-          <w:szCs w:val="19"/>
-        </w:rPr>
-        <w:t>Inglada</w:t>
-      </w:r>
-      <w:proofErr w:type="spellEnd"/>
-      <w:r>
-        <w:rPr>
-          <w:sz w:val="19"/>
-          <w:szCs w:val="19"/>
-        </w:rPr>
-        <w:t xml:space="preserve">, J., Arias, M., Tardy, B., et al., 2015. Assessment of an operational system for crop type map production using high temporal and spatial resolution satellite optical imagery. </w:t>
+      <w:r>
+        <w:rPr>
+          <w:sz w:val="19"/>
+          <w:szCs w:val="19"/>
+        </w:rPr>
+        <w:t xml:space="preserve">Ioffe, S., Szegedy, C., 2015. Batch normalization: accelerating deep network training by reducing internal covariate shift. In: </w:t>
       </w:r>
       <w:r>
         <w:rPr>
@@ -9524,14 +8341,14 @@
           <w:sz w:val="19"/>
           <w:szCs w:val="19"/>
         </w:rPr>
-        <w:t>Remote Sensing</w:t>
-      </w:r>
-      <w:r>
-        <w:rPr>
-          <w:sz w:val="19"/>
-          <w:szCs w:val="19"/>
-        </w:rPr>
-        <w:t xml:space="preserve"> 7(9), 12356–12379. https://doi.org/10.3390/rs70912356</w:t>
+        <w:t>Proceedings of the 32nd International Conference on Machine Learning</w:t>
+      </w:r>
+      <w:r>
+        <w:rPr>
+          <w:sz w:val="19"/>
+          <w:szCs w:val="19"/>
+        </w:rPr>
+        <w:t>, PMLR 37, pp. 448–456. https://proceedings.mlr.press/v37/ioffe15.html</w:t>
       </w:r>
     </w:p>
     <w:p>
@@ -9544,7 +8361,7 @@
           <w:sz w:val="19"/>
           <w:szCs w:val="19"/>
         </w:rPr>
-        <w:t xml:space="preserve">Ioffe, S., Szegedy, C., 2015. Batch normalization: accelerating deep network training by reducing internal covariate shift. In: </w:t>
+        <w:t xml:space="preserve">Jacobs, R.A., Jordan, M.I., Nowlan, S.J., Hinton, G.E., 1991. Adaptive mixtures of local experts. </w:t>
       </w:r>
       <w:r>
         <w:rPr>
@@ -9553,14 +8370,14 @@
           <w:sz w:val="19"/>
           <w:szCs w:val="19"/>
         </w:rPr>
-        <w:t>Proceedings of the 32nd International Conference on Machine Learning</w:t>
-      </w:r>
-      <w:r>
-        <w:rPr>
-          <w:sz w:val="19"/>
-          <w:szCs w:val="19"/>
-        </w:rPr>
-        <w:t>, PMLR 37, pp. 448–456. https://proceedings.mlr.press/v37/ioffe15.html</w:t>
+        <w:t>Neural Computation</w:t>
+      </w:r>
+      <w:r>
+        <w:rPr>
+          <w:sz w:val="19"/>
+          <w:szCs w:val="19"/>
+        </w:rPr>
+        <w:t xml:space="preserve"> 3(1), 79–87. https://doi.org/10.1162/neco.1991.3.1.79</w:t>
       </w:r>
     </w:p>
     <w:p>
@@ -9573,7 +8390,7 @@
           <w:sz w:val="19"/>
           <w:szCs w:val="19"/>
         </w:rPr>
-        <w:t xml:space="preserve">Jacobs, R.A., Jordan, M.I., Nowlan, S.J., Hinton, G.E., 1991. Adaptive mixtures of local experts. </w:t>
+        <w:t xml:space="preserve">Jönsson, P., Eklundh, L., 2004. TIMESAT—a program for analyzing time-series of satellite sensor data. </w:t>
       </w:r>
       <w:r>
         <w:rPr>
@@ -9582,14 +8399,14 @@
           <w:sz w:val="19"/>
           <w:szCs w:val="19"/>
         </w:rPr>
-        <w:t>Neural Computation</w:t>
-      </w:r>
-      <w:r>
-        <w:rPr>
-          <w:sz w:val="19"/>
-          <w:szCs w:val="19"/>
-        </w:rPr>
-        <w:t xml:space="preserve"> 3(1), 79–87. https://doi.org/10.1162/neco.1991.3.1.79</w:t>
+        <w:t>Computers &amp; Geosciences</w:t>
+      </w:r>
+      <w:r>
+        <w:rPr>
+          <w:sz w:val="19"/>
+          <w:szCs w:val="19"/>
+        </w:rPr>
+        <w:t xml:space="preserve"> 30(8), 833–845. https://doi.org/10.1016/j.cageo.2004.05.006</w:t>
       </w:r>
     </w:p>
     <w:p>
@@ -9602,7 +8419,7 @@
           <w:sz w:val="19"/>
           <w:szCs w:val="19"/>
         </w:rPr>
-        <w:t xml:space="preserve">Jönsson, P., Eklundh, L., 2004. TIMESAT—a program for analyzing time-series of satellite sensor data. </w:t>
+        <w:t xml:space="preserve">Jordan, M.I., Jacobs, R.A., 1994. Hierarchical mixtures of experts and the EM algorithm. </w:t>
       </w:r>
       <w:r>
         <w:rPr>
@@ -9611,14 +8428,14 @@
           <w:sz w:val="19"/>
           <w:szCs w:val="19"/>
         </w:rPr>
-        <w:t>Computers &amp; Geosciences</w:t>
-      </w:r>
-      <w:r>
-        <w:rPr>
-          <w:sz w:val="19"/>
-          <w:szCs w:val="19"/>
-        </w:rPr>
-        <w:t xml:space="preserve"> 30(8), 833–845. https://doi.org/10.1016/j.cageo.2004.05.006</w:t>
+        <w:t>Neural Computation</w:t>
+      </w:r>
+      <w:r>
+        <w:rPr>
+          <w:sz w:val="19"/>
+          <w:szCs w:val="19"/>
+        </w:rPr>
+        <w:t xml:space="preserve"> 6(2), 181–214. https://doi.org/10.1162/neco.1994.6.2.181</w:t>
       </w:r>
     </w:p>
     <w:p>
@@ -9631,7 +8448,7 @@
           <w:sz w:val="19"/>
           <w:szCs w:val="19"/>
         </w:rPr>
-        <w:t xml:space="preserve">Jordan, M.I., Jacobs, R.A., 1994. Hierarchical mixtures of experts and the EM algorithm. </w:t>
+        <w:t xml:space="preserve">Künsch, H.R., 1989. The jackknife and the bootstrap for general stationary observations. </w:t>
       </w:r>
       <w:r>
         <w:rPr>
@@ -9640,36 +8457,59 @@
           <w:sz w:val="19"/>
           <w:szCs w:val="19"/>
         </w:rPr>
-        <w:t>Neural Computation</w:t>
-      </w:r>
-      <w:r>
-        <w:rPr>
-          <w:sz w:val="19"/>
-          <w:szCs w:val="19"/>
-        </w:rPr>
-        <w:t xml:space="preserve"> 6(2), 181–214. https://doi.org/10.1162/neco.1994.6.2.181</w:t>
+        <w:t>The Annals of Statistics</w:t>
+      </w:r>
+      <w:r>
+        <w:rPr>
+          <w:sz w:val="19"/>
+          <w:szCs w:val="19"/>
+        </w:rPr>
+        <w:t xml:space="preserve"> 17(3), 1217–1241. https://doi.org/10.1214/aos/1176347265</w:t>
       </w:r>
     </w:p>
     <w:p>
       <w:pPr>
         <w:spacing w:after="80" w:line="252" w:lineRule="auto"/>
         <w:ind w:left="360" w:hanging="360"/>
-      </w:pPr>
-      <w:proofErr w:type="spellStart"/>
-      <w:r>
-        <w:rPr>
-          <w:sz w:val="19"/>
-          <w:szCs w:val="19"/>
-        </w:rPr>
-        <w:t>Künsch</w:t>
-      </w:r>
-      <w:proofErr w:type="spellEnd"/>
-      <w:r>
-        <w:rPr>
-          <w:sz w:val="19"/>
-          <w:szCs w:val="19"/>
-        </w:rPr>
-        <w:t xml:space="preserve">, H.R., 1989. The jackknife and the bootstrap for general stationary observations. </w:t>
+        <w:rPr>
+          <w:sz w:val="19"/>
+          <w:szCs w:val="19"/>
+        </w:rPr>
+      </w:pPr>
+      <w:r>
+        <w:rPr>
+          <w:sz w:val="19"/>
+          <w:szCs w:val="19"/>
+        </w:rPr>
+        <w:t xml:space="preserve">Mahalanobis, P.C., 1936. On the generalized distance in statistics. </w:t>
+      </w:r>
+      <w:r>
+        <w:rPr>
+          <w:i/>
+          <w:sz w:val="19"/>
+          <w:szCs w:val="19"/>
+        </w:rPr>
+        <w:t>Proceedings of the National Institute of Sciences of India</w:t>
+      </w:r>
+      <w:r>
+        <w:rPr>
+          <w:sz w:val="19"/>
+          <w:szCs w:val="19"/>
+        </w:rPr>
+        <w:t xml:space="preserve"> 2(1), 49–55.</w:t>
+      </w:r>
+    </w:p>
+    <w:p>
+      <w:pPr>
+        <w:spacing w:after="80" w:line="252" w:lineRule="auto"/>
+        <w:ind w:left="360" w:hanging="360"/>
+      </w:pPr>
+      <w:r>
+        <w:rPr>
+          <w:sz w:val="19"/>
+          <w:szCs w:val="19"/>
+        </w:rPr>
+        <w:t xml:space="preserve">Main-Knorn, M., Pflug, B., Louis, J., Debaecker, V., Müller-Wilm, U., Gascon, F., 2017. Sen2Cor for Sentinel-2. In: </w:t>
       </w:r>
       <w:r>
         <w:rPr>
@@ -9678,55 +8518,43 @@
           <w:sz w:val="19"/>
           <w:szCs w:val="19"/>
         </w:rPr>
-        <w:t>The Annals of Statistics</w:t>
-      </w:r>
-      <w:r>
-        <w:rPr>
-          <w:sz w:val="19"/>
-          <w:szCs w:val="19"/>
-        </w:rPr>
-        <w:t xml:space="preserve"> 17(3), 1217–1241. https://doi.org/10.1214/aos/1176347265</w:t>
+        <w:t>Image and Signal Processing for Remote Sensing XXIII</w:t>
+      </w:r>
+      <w:r>
+        <w:rPr>
+          <w:sz w:val="19"/>
+          <w:szCs w:val="19"/>
+        </w:rPr>
+        <w:t>, Proc. SPIE 10427, 1042704. https://doi.org/10.1117/12.2278218</w:t>
       </w:r>
     </w:p>
     <w:p>
       <w:pPr>
         <w:spacing w:after="80" w:line="252" w:lineRule="auto"/>
         <w:ind w:left="360" w:hanging="360"/>
-        <w:rPr>
-          <w:sz w:val="19"/>
-          <w:szCs w:val="19"/>
-        </w:rPr>
-      </w:pPr>
-      <w:proofErr w:type="spellStart"/>
-      <w:r>
-        <w:rPr>
-          <w:sz w:val="19"/>
-          <w:szCs w:val="19"/>
-        </w:rPr>
-        <w:t>Mahalanobis</w:t>
-      </w:r>
-      <w:proofErr w:type="spellEnd"/>
-      <w:r>
-        <w:rPr>
-          <w:sz w:val="19"/>
-          <w:szCs w:val="19"/>
-        </w:rPr>
-        <w:t xml:space="preserve">, P.C., 1936. On the generalized distance in statistics. </w:t>
+      </w:pPr>
+      <w:r>
+        <w:rPr>
+          <w:sz w:val="19"/>
+          <w:szCs w:val="19"/>
+        </w:rPr>
+        <w:t xml:space="preserve">Pelletier, C., Webb, G.I., Petitjean, F., 2019. Temporal convolutional neural network for the classification of satellite image time series. </w:t>
       </w:r>
       <w:r>
         <w:rPr>
           <w:i/>
-          <w:sz w:val="19"/>
-          <w:szCs w:val="19"/>
-        </w:rPr>
-        <w:t>Proceedings of the National Institute of Sciences of India</w:t>
-      </w:r>
-      <w:r>
-        <w:rPr>
-          <w:sz w:val="19"/>
-          <w:szCs w:val="19"/>
-        </w:rPr>
-        <w:t xml:space="preserve"> 2(1), 49–55.</w:t>
+          <w:iCs/>
+          <w:sz w:val="19"/>
+          <w:szCs w:val="19"/>
+        </w:rPr>
+        <w:t>Remote Sensing</w:t>
+      </w:r>
+      <w:r>
+        <w:rPr>
+          <w:sz w:val="19"/>
+          <w:szCs w:val="19"/>
+        </w:rPr>
+        <w:t xml:space="preserve"> 11(5), 523. https://doi.org/10.3390/rs11050523</w:t>
       </w:r>
     </w:p>
     <w:p>
@@ -9739,39 +8567,7 @@
           <w:sz w:val="19"/>
           <w:szCs w:val="19"/>
         </w:rPr>
-        <w:t>Main-</w:t>
-      </w:r>
-      <w:proofErr w:type="spellStart"/>
-      <w:r>
-        <w:rPr>
-          <w:sz w:val="19"/>
-          <w:szCs w:val="19"/>
-        </w:rPr>
-        <w:t>Knorn</w:t>
-      </w:r>
-      <w:proofErr w:type="spellEnd"/>
-      <w:r>
-        <w:rPr>
-          <w:sz w:val="19"/>
-          <w:szCs w:val="19"/>
-        </w:rPr>
-        <w:t xml:space="preserve">, M., Pflug, B., Louis, J., </w:t>
-      </w:r>
-      <w:proofErr w:type="spellStart"/>
-      <w:r>
-        <w:rPr>
-          <w:sz w:val="19"/>
-          <w:szCs w:val="19"/>
-        </w:rPr>
-        <w:t>Debaecker</w:t>
-      </w:r>
-      <w:proofErr w:type="spellEnd"/>
-      <w:r>
-        <w:rPr>
-          <w:sz w:val="19"/>
-          <w:szCs w:val="19"/>
-        </w:rPr>
-        <w:t xml:space="preserve">, V., Müller-Wilm, U., Gascon, F., 2017. Sen2Cor for Sentinel-2. In: </w:t>
+        <w:t xml:space="preserve">Ploton, P., Mortier, F., Réjou-Méchain, M., et al., 2020. Spatial validation reveals poor predictive performance of large-scale ecological mapping models. </w:t>
       </w:r>
       <w:r>
         <w:rPr>
@@ -9780,14 +8576,14 @@
           <w:sz w:val="19"/>
           <w:szCs w:val="19"/>
         </w:rPr>
-        <w:t>Image and Signal Processing for Remote Sensing XXIII</w:t>
-      </w:r>
-      <w:r>
-        <w:rPr>
-          <w:sz w:val="19"/>
-          <w:szCs w:val="19"/>
-        </w:rPr>
-        <w:t>, Proc. SPIE 10427, 1042704. https://doi.org/10.1117/12.2278218</w:t>
+        <w:t>Nature Communications</w:t>
+      </w:r>
+      <w:r>
+        <w:rPr>
+          <w:sz w:val="19"/>
+          <w:szCs w:val="19"/>
+        </w:rPr>
+        <w:t xml:space="preserve"> 11, 4540. https://doi.org/10.1038/s41467-020-18321-y</w:t>
       </w:r>
     </w:p>
     <w:p>
@@ -9800,7 +8596,7 @@
           <w:sz w:val="19"/>
           <w:szCs w:val="19"/>
         </w:rPr>
-        <w:t xml:space="preserve">Pelletier, C., Webb, G.I., Petitjean, F., 2019. Temporal convolutional neural network for the classification of satellite image time series. </w:t>
+        <w:t xml:space="preserve">Prokhorenkova, L., Gusev, G., Vorobev, A., Dorogush, A.V., Gulin, A., 2018. CatBoost: unbiased boosting with categorical features. In: </w:t>
       </w:r>
       <w:r>
         <w:rPr>
@@ -9809,14 +8605,14 @@
           <w:sz w:val="19"/>
           <w:szCs w:val="19"/>
         </w:rPr>
-        <w:t>Remote Sensing</w:t>
-      </w:r>
-      <w:r>
-        <w:rPr>
-          <w:sz w:val="19"/>
-          <w:szCs w:val="19"/>
-        </w:rPr>
-        <w:t xml:space="preserve"> 11(5), 523. https://doi.org/10.3390/rs11050523</w:t>
+        <w:t>Advances in Neural Information Processing Systems 31 (NeurIPS 2018)</w:t>
+      </w:r>
+      <w:r>
+        <w:rPr>
+          <w:sz w:val="19"/>
+          <w:szCs w:val="19"/>
+        </w:rPr>
+        <w:t>.</w:t>
       </w:r>
     </w:p>
     <w:p>
@@ -9824,37 +8620,12 @@
         <w:spacing w:after="80" w:line="252" w:lineRule="auto"/>
         <w:ind w:left="360" w:hanging="360"/>
       </w:pPr>
-      <w:proofErr w:type="spellStart"/>
-      <w:r>
-        <w:rPr>
-          <w:sz w:val="19"/>
-          <w:szCs w:val="19"/>
-        </w:rPr>
-        <w:t>Ploton</w:t>
-      </w:r>
-      <w:proofErr w:type="spellEnd"/>
-      <w:r>
-        <w:rPr>
-          <w:sz w:val="19"/>
-          <w:szCs w:val="19"/>
-        </w:rPr>
-        <w:t xml:space="preserve">, P., Mortier, F., </w:t>
-      </w:r>
-      <w:proofErr w:type="spellStart"/>
-      <w:r>
-        <w:rPr>
-          <w:sz w:val="19"/>
-          <w:szCs w:val="19"/>
-        </w:rPr>
-        <w:t>Réjou-Méchain</w:t>
-      </w:r>
-      <w:proofErr w:type="spellEnd"/>
-      <w:r>
-        <w:rPr>
-          <w:sz w:val="19"/>
-          <w:szCs w:val="19"/>
-        </w:rPr>
-        <w:t xml:space="preserve">, M., et al., 2020. Spatial validation reveals poor predictive performance of large-scale ecological mapping models. </w:t>
+      <w:r>
+        <w:rPr>
+          <w:sz w:val="19"/>
+          <w:szCs w:val="19"/>
+        </w:rPr>
+        <w:t xml:space="preserve">Qiu, S., Zhu, Z., He, B., 2019. Fmask 4.0: improved cloud and cloud shadow detection in Landsats 4–8 and Sentinel-2 imagery. </w:t>
       </w:r>
       <w:r>
         <w:rPr>
@@ -9863,14 +8634,14 @@
           <w:sz w:val="19"/>
           <w:szCs w:val="19"/>
         </w:rPr>
-        <w:t>Nature Communications</w:t>
-      </w:r>
-      <w:r>
-        <w:rPr>
-          <w:sz w:val="19"/>
-          <w:szCs w:val="19"/>
-        </w:rPr>
-        <w:t xml:space="preserve"> 11, 4540. https://doi.org/10.1038/s41467-020-18321-y</w:t>
+        <w:t>Remote Sensing of Environment</w:t>
+      </w:r>
+      <w:r>
+        <w:rPr>
+          <w:sz w:val="19"/>
+          <w:szCs w:val="19"/>
+        </w:rPr>
+        <w:t xml:space="preserve"> 231, 111205. https://doi.org/10.1016/j.rse.2019.05.024</w:t>
       </w:r>
     </w:p>
     <w:p>
@@ -9878,53 +8649,12 @@
         <w:spacing w:after="80" w:line="252" w:lineRule="auto"/>
         <w:ind w:left="360" w:hanging="360"/>
       </w:pPr>
-      <w:proofErr w:type="spellStart"/>
-      <w:r>
-        <w:rPr>
-          <w:sz w:val="19"/>
-          <w:szCs w:val="19"/>
-        </w:rPr>
-        <w:t>Prokhorenkova</w:t>
-      </w:r>
-      <w:proofErr w:type="spellEnd"/>
-      <w:r>
-        <w:rPr>
-          <w:sz w:val="19"/>
-          <w:szCs w:val="19"/>
-        </w:rPr>
-        <w:t xml:space="preserve">, L., Gusev, G., Vorobev, A., </w:t>
-      </w:r>
-      <w:proofErr w:type="spellStart"/>
-      <w:r>
-        <w:rPr>
-          <w:sz w:val="19"/>
-          <w:szCs w:val="19"/>
-        </w:rPr>
-        <w:t>Dorogush</w:t>
-      </w:r>
-      <w:proofErr w:type="spellEnd"/>
-      <w:r>
-        <w:rPr>
-          <w:sz w:val="19"/>
-          <w:szCs w:val="19"/>
-        </w:rPr>
-        <w:t xml:space="preserve">, A.V., Gulin, A., 2018. </w:t>
-      </w:r>
-      <w:proofErr w:type="spellStart"/>
-      <w:r>
-        <w:rPr>
-          <w:sz w:val="19"/>
-          <w:szCs w:val="19"/>
-        </w:rPr>
-        <w:t>CatBoost</w:t>
-      </w:r>
-      <w:proofErr w:type="spellEnd"/>
-      <w:r>
-        <w:rPr>
-          <w:sz w:val="19"/>
-          <w:szCs w:val="19"/>
-        </w:rPr>
-        <w:t xml:space="preserve">: unbiased boosting with categorical features. In: </w:t>
+      <w:r>
+        <w:rPr>
+          <w:sz w:val="19"/>
+          <w:szCs w:val="19"/>
+        </w:rPr>
+        <w:t xml:space="preserve">Roberts, D.R., Bahn, V., Ciuti, S., et al., 2017. Cross-validation strategies for data with temporal, spatial, hierarchical, or phylogenetic structure. </w:t>
       </w:r>
       <w:r>
         <w:rPr>
@@ -9933,9 +8663,28 @@
           <w:sz w:val="19"/>
           <w:szCs w:val="19"/>
         </w:rPr>
-        <w:t>Advances in Neural Information Processing Systems 31 (</w:t>
-      </w:r>
-      <w:proofErr w:type="spellStart"/>
+        <w:t>Ecography</w:t>
+      </w:r>
+      <w:r>
+        <w:rPr>
+          <w:sz w:val="19"/>
+          <w:szCs w:val="19"/>
+        </w:rPr>
+        <w:t xml:space="preserve"> 40(8), 913–929. https://doi.org/10.1111/ecog.02881</w:t>
+      </w:r>
+    </w:p>
+    <w:p>
+      <w:pPr>
+        <w:spacing w:after="80" w:line="252" w:lineRule="auto"/>
+        <w:ind w:left="360" w:hanging="360"/>
+      </w:pPr>
+      <w:r>
+        <w:rPr>
+          <w:sz w:val="19"/>
+          <w:szCs w:val="19"/>
+        </w:rPr>
+        <w:t xml:space="preserve">Rußwurm, M., Körner, M., 2020. Self-attention for raw optical satellite time series classification. </w:t>
+      </w:r>
       <w:r>
         <w:rPr>
           <w:i/>
@@ -9943,9 +8692,28 @@
           <w:sz w:val="19"/>
           <w:szCs w:val="19"/>
         </w:rPr>
-        <w:t>NeurIPS</w:t>
-      </w:r>
-      <w:proofErr w:type="spellEnd"/>
+        <w:t>ISPRS Journal of Photogrammetry and Remote Sensing</w:t>
+      </w:r>
+      <w:r>
+        <w:rPr>
+          <w:sz w:val="19"/>
+          <w:szCs w:val="19"/>
+        </w:rPr>
+        <w:t xml:space="preserve"> 169, 421–435. https://doi.org/10.1016/j.isprsjprs.2020.06.006</w:t>
+      </w:r>
+    </w:p>
+    <w:p>
+      <w:pPr>
+        <w:spacing w:after="80" w:line="252" w:lineRule="auto"/>
+        <w:ind w:left="360" w:hanging="360"/>
+      </w:pPr>
+      <w:r>
+        <w:rPr>
+          <w:sz w:val="19"/>
+          <w:szCs w:val="19"/>
+        </w:rPr>
+        <w:t xml:space="preserve">Rußwurm, M., Pelletier, C., Zollner, M., Lefèvre, S., Körner, M., 2020. BreizhCrops: a time series dataset for crop type mapping. </w:t>
+      </w:r>
       <w:r>
         <w:rPr>
           <w:i/>
@@ -9953,14 +8721,14 @@
           <w:sz w:val="19"/>
           <w:szCs w:val="19"/>
         </w:rPr>
-        <w:t xml:space="preserve"> 2018)</w:t>
-      </w:r>
-      <w:r>
-        <w:rPr>
-          <w:sz w:val="19"/>
-          <w:szCs w:val="19"/>
-        </w:rPr>
-        <w:t>.</w:t>
+        <w:t>International Archives of the Photogrammetry, Remote Sensing and Spatial Information Sciences</w:t>
+      </w:r>
+      <w:r>
+        <w:rPr>
+          <w:sz w:val="19"/>
+          <w:szCs w:val="19"/>
+        </w:rPr>
+        <w:t xml:space="preserve"> XLIII-B2-2020, 1545–1551. https://doi.org/10.5194/isprs-archives-XLIII-B2-2020-1545-2020</w:t>
       </w:r>
     </w:p>
     <w:p>
@@ -9973,39 +8741,7 @@
           <w:sz w:val="19"/>
           <w:szCs w:val="19"/>
         </w:rPr>
-        <w:t xml:space="preserve">Qiu, S., Zhu, Z., He, B., 2019. </w:t>
-      </w:r>
-      <w:proofErr w:type="spellStart"/>
-      <w:r>
-        <w:rPr>
-          <w:sz w:val="19"/>
-          <w:szCs w:val="19"/>
-        </w:rPr>
-        <w:t>Fmask</w:t>
-      </w:r>
-      <w:proofErr w:type="spellEnd"/>
-      <w:r>
-        <w:rPr>
-          <w:sz w:val="19"/>
-          <w:szCs w:val="19"/>
-        </w:rPr>
-        <w:t xml:space="preserve"> 4.0: improved cloud and cloud shadow detection in </w:t>
-      </w:r>
-      <w:proofErr w:type="spellStart"/>
-      <w:r>
-        <w:rPr>
-          <w:sz w:val="19"/>
-          <w:szCs w:val="19"/>
-        </w:rPr>
-        <w:t>Landsats</w:t>
-      </w:r>
-      <w:proofErr w:type="spellEnd"/>
-      <w:r>
-        <w:rPr>
-          <w:sz w:val="19"/>
-          <w:szCs w:val="19"/>
-        </w:rPr>
-        <w:t xml:space="preserve"> 4–8 and Sentinel-2 imagery. </w:t>
+        <w:t xml:space="preserve">Sainte Fare Garnot, V., Landrieu, L., 2020. Lightweight temporal self-attention for classifying satellite images time series. In: </w:t>
       </w:r>
       <w:r>
         <w:rPr>
@@ -10014,14 +8750,14 @@
           <w:sz w:val="19"/>
           <w:szCs w:val="19"/>
         </w:rPr>
-        <w:t>Remote Sensing of Environment</w:t>
-      </w:r>
-      <w:r>
-        <w:rPr>
-          <w:sz w:val="19"/>
-          <w:szCs w:val="19"/>
-        </w:rPr>
-        <w:t xml:space="preserve"> 231, 111205. https://doi.org/10.1016/j.rse.2019.05.024</w:t>
+        <w:t>Advanced Analytics and Learning on Temporal Data (AALTD 2020)</w:t>
+      </w:r>
+      <w:r>
+        <w:rPr>
+          <w:sz w:val="19"/>
+          <w:szCs w:val="19"/>
+        </w:rPr>
+        <w:t>, Lecture Notes in Computer Science, Springer, pp. 171–181. https://doi.org/10.1007/978-3-030-65742-0_12</w:t>
       </w:r>
     </w:p>
     <w:p>
@@ -10034,26 +8770,8 @@
           <w:sz w:val="19"/>
           <w:szCs w:val="19"/>
         </w:rPr>
-        <w:lastRenderedPageBreak/>
-        <w:t xml:space="preserve">Roberts, D.R., Bahn, V., </w:t>
-      </w:r>
-      <w:proofErr w:type="spellStart"/>
-      <w:r>
-        <w:rPr>
-          <w:sz w:val="19"/>
-          <w:szCs w:val="19"/>
-        </w:rPr>
-        <w:t>Ciuti</w:t>
-      </w:r>
-      <w:proofErr w:type="spellEnd"/>
-      <w:r>
-        <w:rPr>
-          <w:sz w:val="19"/>
-          <w:szCs w:val="19"/>
-        </w:rPr>
-        <w:t xml:space="preserve">, S., et al., 2017. Cross-validation strategies for data with temporal, spatial, hierarchical, or phylogenetic structure. </w:t>
-      </w:r>
-      <w:proofErr w:type="spellStart"/>
+        <w:t xml:space="preserve">Sainte Fare Garnot, V., Landrieu, L., Giordano, S., Chehata, N., 2020. Satellite image time series classification with pixel-set encoders and temporal self-attention. In: </w:t>
+      </w:r>
       <w:r>
         <w:rPr>
           <w:i/>
@@ -10061,15 +8779,14 @@
           <w:sz w:val="19"/>
           <w:szCs w:val="19"/>
         </w:rPr>
-        <w:t>Ecography</w:t>
-      </w:r>
-      <w:proofErr w:type="spellEnd"/>
-      <w:r>
-        <w:rPr>
-          <w:sz w:val="19"/>
-          <w:szCs w:val="19"/>
-        </w:rPr>
-        <w:t xml:space="preserve"> 40(8), 913–929. https://doi.org/10.1111/ecog.02881</w:t>
+        <w:t>Proceedings of the IEEE/CVF Conference on Computer Vision and Pattern Recognition (CVPR)</w:t>
+      </w:r>
+      <w:r>
+        <w:rPr>
+          <w:sz w:val="19"/>
+          <w:szCs w:val="19"/>
+        </w:rPr>
+        <w:t>, pp. 12322–12331. https://doi.org/10.1109/CVPR42600.2020.01234</w:t>
       </w:r>
     </w:p>
     <w:p>
@@ -10077,21 +8794,12 @@
         <w:spacing w:after="80" w:line="252" w:lineRule="auto"/>
         <w:ind w:left="360" w:hanging="360"/>
       </w:pPr>
-      <w:proofErr w:type="spellStart"/>
-      <w:r>
-        <w:rPr>
-          <w:sz w:val="19"/>
-          <w:szCs w:val="19"/>
-        </w:rPr>
-        <w:t>Rußwurm</w:t>
-      </w:r>
-      <w:proofErr w:type="spellEnd"/>
-      <w:r>
-        <w:rPr>
-          <w:sz w:val="19"/>
-          <w:szCs w:val="19"/>
-        </w:rPr>
-        <w:t xml:space="preserve">, M., Körner, M., 2020. Self-attention for raw optical satellite time series classification. </w:t>
+      <w:r>
+        <w:rPr>
+          <w:sz w:val="19"/>
+          <w:szCs w:val="19"/>
+        </w:rPr>
+        <w:t xml:space="preserve">Saito, T., Rehmsmeier, M., 2015. The precision-recall plot is more informative than the ROC plot when evaluating binary classifiers on imbalanced datasets. </w:t>
       </w:r>
       <w:r>
         <w:rPr>
@@ -10100,14 +8808,14 @@
           <w:sz w:val="19"/>
           <w:szCs w:val="19"/>
         </w:rPr>
-        <w:t>ISPRS Journal of Photogrammetry and Remote Sensing</w:t>
-      </w:r>
-      <w:r>
-        <w:rPr>
-          <w:sz w:val="19"/>
-          <w:szCs w:val="19"/>
-        </w:rPr>
-        <w:t xml:space="preserve"> 169, 421–435. https://doi.org/10.1016/j.isprsjprs.2020.06.006</w:t>
+        <w:t>PLOS ONE</w:t>
+      </w:r>
+      <w:r>
+        <w:rPr>
+          <w:sz w:val="19"/>
+          <w:szCs w:val="19"/>
+        </w:rPr>
+        <w:t xml:space="preserve"> 10(3), e0118432. https://doi.org/10.1371/journal.pone.0118432</w:t>
       </w:r>
     </w:p>
     <w:p>
@@ -10115,37 +8823,12 @@
         <w:spacing w:after="80" w:line="252" w:lineRule="auto"/>
         <w:ind w:left="360" w:hanging="360"/>
       </w:pPr>
-      <w:proofErr w:type="spellStart"/>
-      <w:r>
-        <w:rPr>
-          <w:sz w:val="19"/>
-          <w:szCs w:val="19"/>
-        </w:rPr>
-        <w:t>Rußwurm</w:t>
-      </w:r>
-      <w:proofErr w:type="spellEnd"/>
-      <w:r>
-        <w:rPr>
-          <w:sz w:val="19"/>
-          <w:szCs w:val="19"/>
-        </w:rPr>
-        <w:t xml:space="preserve">, M., Pelletier, C., Zollner, M., Lefèvre, S., Körner, M., 2020. </w:t>
-      </w:r>
-      <w:proofErr w:type="spellStart"/>
-      <w:r>
-        <w:rPr>
-          <w:sz w:val="19"/>
-          <w:szCs w:val="19"/>
-        </w:rPr>
-        <w:t>BreizhCrops</w:t>
-      </w:r>
-      <w:proofErr w:type="spellEnd"/>
-      <w:r>
-        <w:rPr>
-          <w:sz w:val="19"/>
-          <w:szCs w:val="19"/>
-        </w:rPr>
-        <w:t xml:space="preserve">: a time series dataset for crop type mapping. </w:t>
+      <w:r>
+        <w:rPr>
+          <w:sz w:val="19"/>
+          <w:szCs w:val="19"/>
+        </w:rPr>
+        <w:t xml:space="preserve">Shanmugam, D., Blalock, D., Balakrishnan, G., Guttag, J., 2021. Better aggregation in test-time augmentation. In: </w:t>
       </w:r>
       <w:r>
         <w:rPr>
@@ -10154,14 +8837,14 @@
           <w:sz w:val="19"/>
           <w:szCs w:val="19"/>
         </w:rPr>
-        <w:t>International Archives of the Photogrammetry, Remote Sensing and Spatial Information Sciences</w:t>
-      </w:r>
-      <w:r>
-        <w:rPr>
-          <w:sz w:val="19"/>
-          <w:szCs w:val="19"/>
-        </w:rPr>
-        <w:t xml:space="preserve"> XLIII-B2-2020, 1545–1551. https://doi.org/10.5194/isprs-archives-XLIII-B2-2020-1545-2020</w:t>
+        <w:t>Proceedings of the IEEE/CVF International Conference on Computer Vision (ICCV)</w:t>
+      </w:r>
+      <w:r>
+        <w:rPr>
+          <w:sz w:val="19"/>
+          <w:szCs w:val="19"/>
+        </w:rPr>
+        <w:t>, pp. 1194–1203. https://doi.org/10.1109/ICCV48922.2021.00125</w:t>
       </w:r>
     </w:p>
     <w:p>
@@ -10174,23 +8857,7 @@
           <w:sz w:val="19"/>
           <w:szCs w:val="19"/>
         </w:rPr>
-        <w:t xml:space="preserve">Sainte Fare </w:t>
-      </w:r>
-      <w:proofErr w:type="spellStart"/>
-      <w:r>
-        <w:rPr>
-          <w:sz w:val="19"/>
-          <w:szCs w:val="19"/>
-        </w:rPr>
-        <w:t>Garnot</w:t>
-      </w:r>
-      <w:proofErr w:type="spellEnd"/>
-      <w:r>
-        <w:rPr>
-          <w:sz w:val="19"/>
-          <w:szCs w:val="19"/>
-        </w:rPr>
-        <w:t xml:space="preserve">, V., Landrieu, L., 2020. Lightweight temporal self-attention for classifying satellite images time series. In: </w:t>
+        <w:t xml:space="preserve">Silla, C.N., Freitas, A.A., 2011. A survey of hierarchical classification across different application domains. </w:t>
       </w:r>
       <w:r>
         <w:rPr>
@@ -10199,14 +8866,14 @@
           <w:sz w:val="19"/>
           <w:szCs w:val="19"/>
         </w:rPr>
-        <w:t>Advanced Analytics and Learning on Temporal Data (AALTD 2020)</w:t>
-      </w:r>
-      <w:r>
-        <w:rPr>
-          <w:sz w:val="19"/>
-          <w:szCs w:val="19"/>
-        </w:rPr>
-        <w:t>, Lecture Notes in Computer Science, Springer, pp. 171–181. https://doi.org/10.1007/978-3-030-65742-0_12</w:t>
+        <w:t>Data Mining and Knowledge Discovery</w:t>
+      </w:r>
+      <w:r>
+        <w:rPr>
+          <w:sz w:val="19"/>
+          <w:szCs w:val="19"/>
+        </w:rPr>
+        <w:t xml:space="preserve"> 22(1–2), 31–72. https://doi.org/10.1007/s10618-010-0175-9</w:t>
       </w:r>
     </w:p>
     <w:p>
@@ -10219,39 +8886,7 @@
           <w:sz w:val="19"/>
           <w:szCs w:val="19"/>
         </w:rPr>
-        <w:t xml:space="preserve">Sainte Fare </w:t>
-      </w:r>
-      <w:proofErr w:type="spellStart"/>
-      <w:r>
-        <w:rPr>
-          <w:sz w:val="19"/>
-          <w:szCs w:val="19"/>
-        </w:rPr>
-        <w:t>Garnot</w:t>
-      </w:r>
-      <w:proofErr w:type="spellEnd"/>
-      <w:r>
-        <w:rPr>
-          <w:sz w:val="19"/>
-          <w:szCs w:val="19"/>
-        </w:rPr>
-        <w:t xml:space="preserve">, V., Landrieu, L., Giordano, S., </w:t>
-      </w:r>
-      <w:proofErr w:type="spellStart"/>
-      <w:r>
-        <w:rPr>
-          <w:sz w:val="19"/>
-          <w:szCs w:val="19"/>
-        </w:rPr>
-        <w:t>Chehata</w:t>
-      </w:r>
-      <w:proofErr w:type="spellEnd"/>
-      <w:r>
-        <w:rPr>
-          <w:sz w:val="19"/>
-          <w:szCs w:val="19"/>
-        </w:rPr>
-        <w:t xml:space="preserve">, N., 2020. Satellite image time series classification with pixel-set encoders and temporal self-attention. In: </w:t>
+        <w:t xml:space="preserve">Snell, J., Swersky, K., Zemel, R., 2017. Prototypical networks for few-shot learning. In: </w:t>
       </w:r>
       <w:r>
         <w:rPr>
@@ -10260,14 +8895,14 @@
           <w:sz w:val="19"/>
           <w:szCs w:val="19"/>
         </w:rPr>
-        <w:t>Proceedings of the IEEE/CVF Conference on Computer Vision and Pattern Recognition (CVPR)</w:t>
-      </w:r>
-      <w:r>
-        <w:rPr>
-          <w:sz w:val="19"/>
-          <w:szCs w:val="19"/>
-        </w:rPr>
-        <w:t>, pp. 12322–12331. https://doi.org/10.1109/CVPR42600.2020.01234</w:t>
+        <w:t>Advances in Neural Information Processing Systems 30 (NIPS 2017)</w:t>
+      </w:r>
+      <w:r>
+        <w:rPr>
+          <w:sz w:val="19"/>
+          <w:szCs w:val="19"/>
+        </w:rPr>
+        <w:t>.</w:t>
       </w:r>
     </w:p>
     <w:p>
@@ -10280,23 +8915,7 @@
           <w:sz w:val="19"/>
           <w:szCs w:val="19"/>
         </w:rPr>
-        <w:t xml:space="preserve">Saito, T., </w:t>
-      </w:r>
-      <w:proofErr w:type="spellStart"/>
-      <w:r>
-        <w:rPr>
-          <w:sz w:val="19"/>
-          <w:szCs w:val="19"/>
-        </w:rPr>
-        <w:t>Rehmsmeier</w:t>
-      </w:r>
-      <w:proofErr w:type="spellEnd"/>
-      <w:r>
-        <w:rPr>
-          <w:sz w:val="19"/>
-          <w:szCs w:val="19"/>
-        </w:rPr>
-        <w:t xml:space="preserve">, M., 2015. The precision-recall plot is more informative than the ROC plot when evaluating binary classifiers on imbalanced datasets. </w:t>
+        <w:t xml:space="preserve">Turkoglu, M.O., D'Aronco, S., Perich, G., et al., 2021. Crop mapping from image time series: deep learning with multi-scale label hierarchies. </w:t>
       </w:r>
       <w:r>
         <w:rPr>
@@ -10305,14 +8924,14 @@
           <w:sz w:val="19"/>
           <w:szCs w:val="19"/>
         </w:rPr>
-        <w:t>PLOS ONE</w:t>
-      </w:r>
-      <w:r>
-        <w:rPr>
-          <w:sz w:val="19"/>
-          <w:szCs w:val="19"/>
-        </w:rPr>
-        <w:t xml:space="preserve"> 10(3), e0118432. https://doi.org/10.1371/journal.pone.0118432</w:t>
+        <w:t>Remote Sensing of Environment</w:t>
+      </w:r>
+      <w:r>
+        <w:rPr>
+          <w:sz w:val="19"/>
+          <w:szCs w:val="19"/>
+        </w:rPr>
+        <w:t xml:space="preserve"> 264, 112603. https://doi.org/10.1016/j.rse.2021.112603</w:t>
       </w:r>
     </w:p>
     <w:p>
@@ -10325,7 +8944,7 @@
           <w:sz w:val="19"/>
           <w:szCs w:val="19"/>
         </w:rPr>
-        <w:t xml:space="preserve">Shanmugam, D., Blalock, D., Balakrishnan, G., Guttag, J., 2021. Better aggregation in test-time augmentation. In: </w:t>
+        <w:t xml:space="preserve">Vaswani, A., Shazeer, N., Parmar, N., et al., 2017. Attention is all you need. In: </w:t>
       </w:r>
       <w:r>
         <w:rPr>
@@ -10334,14 +8953,14 @@
           <w:sz w:val="19"/>
           <w:szCs w:val="19"/>
         </w:rPr>
-        <w:t>Proceedings of the IEEE/CVF International Conference on Computer Vision (ICCV)</w:t>
-      </w:r>
-      <w:r>
-        <w:rPr>
-          <w:sz w:val="19"/>
-          <w:szCs w:val="19"/>
-        </w:rPr>
-        <w:t>, pp. 1194–1203. https://doi.org/10.1109/ICCV48922.2021.00125</w:t>
+        <w:t>Advances in Neural Information Processing Systems 30 (NIPS 2017)</w:t>
+      </w:r>
+      <w:r>
+        <w:rPr>
+          <w:sz w:val="19"/>
+          <w:szCs w:val="19"/>
+        </w:rPr>
+        <w:t>.</w:t>
       </w:r>
     </w:p>
     <w:p>
@@ -10354,7 +8973,20 @@
           <w:sz w:val="19"/>
           <w:szCs w:val="19"/>
         </w:rPr>
-        <w:t xml:space="preserve">Silla, C.N., Freitas, A.A., 2011. A survey of hierarchical classification across different application domains. </w:t>
+        <w:t>Wang, F., n.d. Multi-Scale-1D-ResNet. GitHub repository (MSResNet implementation used by BreizhCrops). https://github.com/geekfeiw/Multi-Scale-1D-ResNet (accessed 15 October 2026).</w:t>
+      </w:r>
+    </w:p>
+    <w:p>
+      <w:pPr>
+        <w:spacing w:after="80" w:line="252" w:lineRule="auto"/>
+        <w:ind w:left="360" w:hanging="360"/>
+      </w:pPr>
+      <w:r>
+        <w:rPr>
+          <w:sz w:val="19"/>
+          <w:szCs w:val="19"/>
+        </w:rPr>
+        <w:t xml:space="preserve">Wang, Z., Yan, W., Oates, T., 2017. Time series classification from scratch with deep neural networks: a strong baseline. In: </w:t>
       </w:r>
       <w:r>
         <w:rPr>
@@ -10363,14 +8995,14 @@
           <w:sz w:val="19"/>
           <w:szCs w:val="19"/>
         </w:rPr>
-        <w:t>Data Mining and Knowledge Discovery</w:t>
-      </w:r>
-      <w:r>
-        <w:rPr>
-          <w:sz w:val="19"/>
-          <w:szCs w:val="19"/>
-        </w:rPr>
-        <w:t xml:space="preserve"> 22(1–2), 31–72. https://doi.org/10.1007/s10618-010-0175-9</w:t>
+        <w:t>Proceedings of the International Joint Conference on Neural Networks (IJCNN)</w:t>
+      </w:r>
+      <w:r>
+        <w:rPr>
+          <w:sz w:val="19"/>
+          <w:szCs w:val="19"/>
+        </w:rPr>
+        <w:t>, pp. 1578–1585. https://doi.org/10.1109/IJCNN.2017.7966039</w:t>
       </w:r>
     </w:p>
     <w:p>
@@ -10383,7 +9015,7 @@
           <w:sz w:val="19"/>
           <w:szCs w:val="19"/>
         </w:rPr>
-        <w:t xml:space="preserve">Snell, J., Swersky, K., Zemel, R., 2017. Prototypical networks for few-shot learning. In: </w:t>
+        <w:t xml:space="preserve">Wolpert, D.H., 1992. Stacked generalization. </w:t>
       </w:r>
       <w:r>
         <w:rPr>
@@ -10392,27 +9024,31 @@
           <w:sz w:val="19"/>
           <w:szCs w:val="19"/>
         </w:rPr>
-        <w:t>Advances in Neural Information Processing Systems 30 (NIPS 2017)</w:t>
-      </w:r>
-      <w:r>
-        <w:rPr>
-          <w:sz w:val="19"/>
-          <w:szCs w:val="19"/>
-        </w:rPr>
-        <w:t>.</w:t>
+        <w:t>Neural Networks</w:t>
+      </w:r>
+      <w:r>
+        <w:rPr>
+          <w:sz w:val="19"/>
+          <w:szCs w:val="19"/>
+        </w:rPr>
+        <w:t xml:space="preserve"> 5(2), 241–259. https://doi.org/10.1016/S0893-6080(05)80023-1</w:t>
       </w:r>
     </w:p>
     <w:p>
       <w:pPr>
         <w:spacing w:after="80" w:line="252" w:lineRule="auto"/>
         <w:ind w:left="360" w:hanging="360"/>
-      </w:pPr>
-      <w:r>
-        <w:rPr>
-          <w:sz w:val="19"/>
-          <w:szCs w:val="19"/>
-        </w:rPr>
-        <w:t xml:space="preserve">Turkoglu, M.O., D'Aronco, S., Perich, G., et al., 2021. Crop mapping from image time series: deep learning with multi-scale label hierarchies. </w:t>
+        <w:rPr>
+          <w:sz w:val="19"/>
+          <w:szCs w:val="19"/>
+        </w:rPr>
+      </w:pPr>
+      <w:r>
+        <w:rPr>
+          <w:sz w:val="19"/>
+          <w:szCs w:val="19"/>
+        </w:rPr>
+        <w:t xml:space="preserve">Zhu, Z., Woodcock, C.E., 2012. Object-based cloud and cloud shadow detection in Landsat imagery. </w:t>
       </w:r>
       <w:r>
         <w:rPr>
@@ -10428,208 +9064,11 @@
           <w:sz w:val="19"/>
           <w:szCs w:val="19"/>
         </w:rPr>
-        <w:t xml:space="preserve"> 264, 112603. https://doi.org/10.1016/j.rse.2021.112603</w:t>
-      </w:r>
-    </w:p>
-    <w:p>
-      <w:pPr>
-        <w:spacing w:after="80" w:line="252" w:lineRule="auto"/>
-        <w:ind w:left="360" w:hanging="360"/>
-      </w:pPr>
-      <w:r>
-        <w:rPr>
-          <w:sz w:val="19"/>
-          <w:szCs w:val="19"/>
-        </w:rPr>
-        <w:t xml:space="preserve">Vaswani, A., </w:t>
-      </w:r>
-      <w:proofErr w:type="spellStart"/>
-      <w:r>
-        <w:rPr>
-          <w:sz w:val="19"/>
-          <w:szCs w:val="19"/>
-        </w:rPr>
-        <w:t>Shazeer</w:t>
-      </w:r>
-      <w:proofErr w:type="spellEnd"/>
-      <w:r>
-        <w:rPr>
-          <w:sz w:val="19"/>
-          <w:szCs w:val="19"/>
-        </w:rPr>
-        <w:t xml:space="preserve">, N., Parmar, N., et al., 2017. Attention is all you need. In: </w:t>
-      </w:r>
-      <w:r>
-        <w:rPr>
-          <w:i/>
-          <w:iCs/>
-          <w:sz w:val="19"/>
-          <w:szCs w:val="19"/>
-        </w:rPr>
-        <w:t>Advances in Neural Information Processing Systems 30 (NIPS 2017)</w:t>
-      </w:r>
-      <w:r>
-        <w:rPr>
-          <w:sz w:val="19"/>
-          <w:szCs w:val="19"/>
-        </w:rPr>
-        <w:t>.</w:t>
-      </w:r>
-    </w:p>
-    <w:p>
-      <w:pPr>
-        <w:spacing w:after="80" w:line="252" w:lineRule="auto"/>
-        <w:ind w:left="360" w:hanging="360"/>
-      </w:pPr>
-      <w:r>
-        <w:rPr>
-          <w:sz w:val="19"/>
-          <w:szCs w:val="19"/>
-        </w:rPr>
-        <w:t xml:space="preserve">Wang, F., n.d. </w:t>
-      </w:r>
-      <w:proofErr w:type="gramStart"/>
-      <w:r>
-        <w:rPr>
-          <w:sz w:val="19"/>
-          <w:szCs w:val="19"/>
-        </w:rPr>
-        <w:t>Multi-Scale</w:t>
-      </w:r>
-      <w:proofErr w:type="gramEnd"/>
-      <w:r>
-        <w:rPr>
-          <w:sz w:val="19"/>
-          <w:szCs w:val="19"/>
-        </w:rPr>
-        <w:t>-1D-ResNet. GitHub repository (</w:t>
-      </w:r>
-      <w:proofErr w:type="spellStart"/>
-      <w:r>
-        <w:rPr>
-          <w:sz w:val="19"/>
-          <w:szCs w:val="19"/>
-        </w:rPr>
-        <w:t>MSResNet</w:t>
-      </w:r>
-      <w:proofErr w:type="spellEnd"/>
-      <w:r>
-        <w:rPr>
-          <w:sz w:val="19"/>
-          <w:szCs w:val="19"/>
-        </w:rPr>
-        <w:t xml:space="preserve"> implementation used by </w:t>
-      </w:r>
-      <w:proofErr w:type="spellStart"/>
-      <w:r>
-        <w:rPr>
-          <w:sz w:val="19"/>
-          <w:szCs w:val="19"/>
-        </w:rPr>
-        <w:t>BreizhCrops</w:t>
-      </w:r>
-      <w:proofErr w:type="spellEnd"/>
-      <w:r>
-        <w:rPr>
-          <w:sz w:val="19"/>
-          <w:szCs w:val="19"/>
-        </w:rPr>
-        <w:t>). https://github.com/geekfeiw/Multi-Scale-1D-ResNet (accessed 15 October 2026).</w:t>
-      </w:r>
-    </w:p>
-    <w:p>
-      <w:pPr>
-        <w:spacing w:after="80" w:line="252" w:lineRule="auto"/>
-        <w:ind w:left="360" w:hanging="360"/>
-      </w:pPr>
-      <w:r>
-        <w:rPr>
-          <w:sz w:val="19"/>
-          <w:szCs w:val="19"/>
-        </w:rPr>
-        <w:t xml:space="preserve">Wang, Z., Yan, W., Oates, T., 2017. Time series classification from scratch with deep neural networks: a strong baseline. In: </w:t>
-      </w:r>
-      <w:r>
-        <w:rPr>
-          <w:i/>
-          <w:iCs/>
-          <w:sz w:val="19"/>
-          <w:szCs w:val="19"/>
-        </w:rPr>
-        <w:t>Proceedings of the International Joint Conference on Neural Networks (IJCNN)</w:t>
-      </w:r>
-      <w:r>
-        <w:rPr>
-          <w:sz w:val="19"/>
-          <w:szCs w:val="19"/>
-        </w:rPr>
-        <w:t>, pp. 1578–1585. https://doi.org/10.1109/IJCNN.2017.7966039</w:t>
-      </w:r>
-    </w:p>
-    <w:p>
-      <w:pPr>
-        <w:spacing w:after="80" w:line="252" w:lineRule="auto"/>
-        <w:ind w:left="360" w:hanging="360"/>
-      </w:pPr>
-      <w:r>
-        <w:rPr>
-          <w:sz w:val="19"/>
-          <w:szCs w:val="19"/>
-        </w:rPr>
-        <w:t xml:space="preserve">Wolpert, D.H., 1992. Stacked generalization. </w:t>
-      </w:r>
-      <w:r>
-        <w:rPr>
-          <w:i/>
-          <w:iCs/>
-          <w:sz w:val="19"/>
-          <w:szCs w:val="19"/>
-        </w:rPr>
-        <w:t>Neural Networks</w:t>
-      </w:r>
-      <w:r>
-        <w:rPr>
-          <w:sz w:val="19"/>
-          <w:szCs w:val="19"/>
-        </w:rPr>
-        <w:t xml:space="preserve"> 5(2), 241–259. https://doi.org/10.1016/S0893-6080(05)80023-1</w:t>
-      </w:r>
-    </w:p>
-    <w:p>
-      <w:pPr>
-        <w:spacing w:after="80" w:line="252" w:lineRule="auto"/>
-        <w:ind w:left="360" w:hanging="360"/>
-        <w:rPr>
-          <w:sz w:val="19"/>
-          <w:szCs w:val="19"/>
-        </w:rPr>
-      </w:pPr>
-      <w:r>
-        <w:rPr>
-          <w:sz w:val="19"/>
-          <w:szCs w:val="19"/>
-        </w:rPr>
-        <w:t xml:space="preserve">Zhu, Z., Woodcock, C.E., 2012. Object-based cloud and cloud shadow detection in Landsat imagery. </w:t>
-      </w:r>
-      <w:r>
-        <w:rPr>
-          <w:i/>
-          <w:iCs/>
-          <w:sz w:val="19"/>
-          <w:szCs w:val="19"/>
-        </w:rPr>
-        <w:t>Remote Sensing of Environment</w:t>
-      </w:r>
-      <w:r>
-        <w:rPr>
-          <w:sz w:val="19"/>
-          <w:szCs w:val="19"/>
-        </w:rPr>
         <w:t xml:space="preserve"> 118, 83–94. https://doi.org/10.1016/j.rse.2011.10.028</w:t>
       </w:r>
     </w:p>
     <w:sectPr>
-      <w:footerReference w:type="default" r:id="rId11"/>
+      <w:footerReference w:type="default" r:id="rId10"/>
       <w:pgSz w:w="11906" w:h="16838"/>
       <w:pgMar w:top="1440" w:right="1440" w:bottom="1440" w:left="1440" w:header="708" w:footer="708" w:gutter="0"/>
       <w:cols w:space="720"/>
@@ -11427,6 +9866,7 @@
   <w:style w:type="character" w:default="1" w:styleId="DefaultParagraphFont">
     <w:name w:val="Default Paragraph Font"/>
     <w:uiPriority w:val="1"/>
+    <w:semiHidden/>
     <w:unhideWhenUsed/>
   </w:style>
   <w:style w:type="table" w:default="1" w:styleId="TableNormal">

</xml_diff>

<commit_message>
State the orchard-AP bootstrap resample count in the paper
Accuracy, recall and precision intervals use 2,000 block resamples, the
orchard-AP intervals 1,000 (paired_ap_ci.py, the verifier and the
rotation); the protocol paragraph said 2,000 for all of them.

Co-Authored-By: Claude Opus 5.5 <noreply@anthropic.com>
</commit_message>
<xml_diff>
--- a/paper/Orchards_in_the_Meadow.docx
+++ b/paper/Orchards_in_the_Meadow.docx
@@ -833,7 +833,13 @@
         <w:jc w:val="both"/>
       </w:pPr>
       <w:r>
-        <w:t>Choosing a decoding configuration on the same parcels it is reported on is optimistic, and neighboring parcels are correlated. We therefore cut the test region into 10 km blocks grouped into five spatial folds (Roberts et al., 2017); each fold is scored with the configuration chosen on the other four, and the five folds are concatenated. Three selection rules were fixed in advance: accuracy-first (maximum accuracy subject to orchard recall ≥ 35%), orchard-first (maximum orchard recall subject to accuracy ≥ 80.69%) and closest to a stretch target of 81% accuracy and 60% orchard recall; these thresholds are targets set at the start of the project, the accuracy floor just below the pretrained MSResNet’s 80.77%. Intervals are 95% block-bootstrap intervals (Künsch, 1989) over the same blocks, with 2,000 resamples, and differences between systems are paired, using the same resamples. Point estimates are means of three seeds; where a single interval is given it is for seed 42, while paired differences are tested on every seed. Choosing settings directly on frh04 would have inflated accuracy by at most 0.15 points.</w:t>
+        <w:t xml:space="preserve">Choosing a decoding configuration on the same parcels it is reported on is optimistic, and neighboring parcels are correlated. We therefore cut the test region into 10 km blocks grouped into five spatial folds (Roberts et al., 2017); each fold is scored with the configuration chosen on the other four, and the five folds are concatenated. Three selection rules were fixed in advance: accuracy-first (maximum accuracy subject to orchard recall ≥ 35%), orchard-first (maximum orchard recall subject to accuracy ≥ 80.69%) and closest to a stretch target of 81% accuracy and 60% orchard recall; these thresholds are targets set at the start of the project, the accuracy floor just below the pretrained MSResNet’s 80.77%. Intervals are 95% block-bootstrap intervals (Künsch, 1989) </w:t>
+      </w:r>
+      <w:r>
+        <w:t>over the same blocks, with 2,000 resamples (1,000 for orchard AP), and</w:t>
+      </w:r>
+      <w:r>
+        <w:t xml:space="preserve"> differences between systems are paired, using the same resamples. Point estimates are means of three seeds; where a single interval is given it is for seed 42, while paired differences are tested on every seed. Choosing settings directly on frh04 would have inflated accuracy by at most 0.15 points.</w:t>
       </w:r>
     </w:p>
     <w:p>

</xml_diff>

<commit_message>
Rerun Table 2 on the final configuration
Table 2 now isolates the network block in the final design (no expert
blocks; each network block averages three training seeds) instead of the
earlier configuration. Conclusions unchanged, effects larger: the L1C
network adds almost nothing (orchard AP 26.3 vs 25.7, recall at the 81%
floor within -0.4..+1.5, intervals spanning zero); the L2A network adds
9.5-9.9 AP and 14-15 points of recall at the floor, 12.5-14.7 over the
L1C network, every interval excluding zero; clear vs all dates differ by
about one AP point. The last row now equals the final design (Table 1).

scripts/meta/recall_at_accuracy_floor.py computes the recall-at-floor
column; it reproduces the old logged values exactly. Logs in logs/
(index updated), commands in the README.

Co-Authored-By: Claude Opus 5.5 <noreply@anthropic.com>
</commit_message>
<xml_diff>
--- a/paper/Orchards_in_the_Meadow.docx
+++ b/paper/Orchards_in_the_Meadow.docx
@@ -160,7 +160,13 @@
         <w:jc w:val="both"/>
       </w:pPr>
       <w:r>
-        <w:t>A late-fusion design in which phenology features and an L2A-trained network each add about ten points of orchard recall over pretrained networks. Controlled ablations show that the L2A input, not merely a second network, carries the gain, that a four-tier mixture of experts adds little, and that an end-to-end network with a class-weighted loss does not close the gap.</w:t>
+        <w:t xml:space="preserve">A late-fusion design in which phenology features and an L2A-trained network </w:t>
+      </w:r>
+      <w:r>
+        <w:t>each add at least eight points of orchard recall over pretrained networks.</w:t>
+      </w:r>
+      <w:r>
+        <w:t xml:space="preserve"> Controlled ablations show that the L2A input, not merely a second network, carries the gain, that a four-tier mixture of experts adds little, and that an end-to-end network with a class-weighted loss does not close the gap.</w:t>
       </w:r>
     </w:p>
     <w:p>
@@ -2994,7 +3000,31 @@
         <w:jc w:val="both"/>
       </w:pPr>
       <w:r>
-        <w:t>Table 2 isolates the network block on top of meta-classifier + phenology, in the configuration used before the expert blocks were dropped (one network per seed). The same MSResNet trained on L1C data adds nothing measurable (orchard AP 26.8 against 26.5); trained on L2A, it adds 8 points of orchard AP and 10–13 points of orchard recall at an 81% accuracy floor, and it beats the L1C network by 9–11 points of recall at that floor, every interval excluding zero. The gain therefore comes from the corrected L2A input, not from a second network. Cloud screening helps the network alone (+4 points of orchard recall) but not after fusion.</w:t>
+        <w:t>Table 2 isolates the network block in the final configuration: the final design with its network block removed or replaced, each network block averaging three training seeds.</w:t>
+      </w:r>
+      <w:r>
+        <w:t xml:space="preserve"> The same MSResNet trained on L1C data </w:t>
+      </w:r>
+      <w:r>
+        <w:t>adds almost nothing (orchard AP 26.3 against 25.7, +0.5 to +0.9, and orchard recall at the 81% accuracy floor changes by −0.4 to +1.5 points, every interval spanning zero); trained on L2A, it adds 9.5–9.9 points of orchard AP and 14</w:t>
+      </w:r>
+      <w:r>
+        <w:t>–</w:t>
+      </w:r>
+      <w:r>
+        <w:t>15 points of orchard recall at that floor, and it beats the L1C network by 12.5</w:t>
+      </w:r>
+      <w:r>
+        <w:t>–</w:t>
+      </w:r>
+      <w:r>
+        <w:t>14.7 points of recall there, every interval excluding zero.</w:t>
+      </w:r>
+      <w:r>
+        <w:t xml:space="preserve"> The gain therefore comes from the corrected L2A input, not from a second network. </w:t>
+      </w:r>
+      <w:r>
+        <w:t>Cloud screening helps the network alone (+4 points of orchard recall) but not after fusion: clear and all dates differ by about one point of orchard AP, every interval spanning zero.</w:t>
       </w:r>
     </w:p>
     <w:p>
@@ -3018,7 +3048,23 @@
           <w:sz w:val="20"/>
           <w:szCs w:val="20"/>
         </w:rPr>
-        <w:t xml:space="preserve"> Effect of the extra network block on top of meta + phenology (expert blocks still included, one network per seed; accuracy-first point, and orchard recall at accuracy ≥ 81%; means of three seeds).</w:t>
+        <w:t xml:space="preserve"> Effect of the extra network block on top of meta + phenology </w:t>
+      </w:r>
+      <w:r>
+        <w:rPr>
+          <w:bCs/>
+          <w:sz w:val="20"/>
+          <w:szCs w:val="20"/>
+        </w:rPr>
+        <w:t>(final configuration: the final design with its network block removed or replaced, each network block averaging three training seeds; accuracy-first point, and orchard recall at accuracy</w:t>
+      </w:r>
+      <w:r>
+        <w:rPr>
+          <w:bCs/>
+          <w:sz w:val="20"/>
+          <w:szCs w:val="20"/>
+        </w:rPr>
+        <w:t xml:space="preserve"> ≥ 81%; means of three seeds).</w:t>
       </w:r>
     </w:p>
     <w:tbl>
@@ -3325,7 +3371,7 @@
                 <w:sz w:val="18"/>
                 <w:szCs w:val="18"/>
               </w:rPr>
-              <w:t>82.01</w:t>
+              <w:t>81.80</w:t>
             </w:r>
           </w:p>
         </w:tc>
@@ -3354,7 +3400,7 @@
                 <w:sz w:val="18"/>
                 <w:szCs w:val="18"/>
               </w:rPr>
-              <w:t>15.3</w:t>
+              <w:t>15.0</w:t>
             </w:r>
           </w:p>
         </w:tc>
@@ -3383,7 +3429,7 @@
                 <w:sz w:val="18"/>
                 <w:szCs w:val="18"/>
               </w:rPr>
-              <w:t>45.5</w:t>
+              <w:t>45.0</w:t>
             </w:r>
           </w:p>
         </w:tc>
@@ -3412,7 +3458,7 @@
                 <w:sz w:val="18"/>
                 <w:szCs w:val="18"/>
               </w:rPr>
-              <w:t>22.9</w:t>
+              <w:t>22.5</w:t>
             </w:r>
           </w:p>
         </w:tc>
@@ -3441,7 +3487,7 @@
                 <w:sz w:val="18"/>
                 <w:szCs w:val="18"/>
               </w:rPr>
-              <w:t>63.7</w:t>
+              <w:t>60.7</w:t>
             </w:r>
           </w:p>
         </w:tc>
@@ -3470,7 +3516,7 @@
                 <w:sz w:val="18"/>
                 <w:szCs w:val="18"/>
               </w:rPr>
-              <w:t>26.5</w:t>
+              <w:t>25.7</w:t>
             </w:r>
           </w:p>
         </w:tc>
@@ -3527,7 +3573,7 @@
                 <w:sz w:val="18"/>
                 <w:szCs w:val="18"/>
               </w:rPr>
-              <w:t>82.12</w:t>
+              <w:t>81.97</w:t>
             </w:r>
           </w:p>
         </w:tc>
@@ -3556,7 +3602,7 @@
                 <w:sz w:val="18"/>
                 <w:szCs w:val="18"/>
               </w:rPr>
-              <w:t>15.4</w:t>
+              <w:t>15.7</w:t>
             </w:r>
           </w:p>
         </w:tc>
@@ -3585,7 +3631,7 @@
                 <w:sz w:val="18"/>
                 <w:szCs w:val="18"/>
               </w:rPr>
-              <w:t>43.5</w:t>
+              <w:t>44.0</w:t>
             </w:r>
           </w:p>
         </w:tc>
@@ -3614,7 +3660,7 @@
                 <w:sz w:val="18"/>
                 <w:szCs w:val="18"/>
               </w:rPr>
-              <w:t>22.8</w:t>
+              <w:t>23.2</w:t>
             </w:r>
           </w:p>
         </w:tc>
@@ -3643,7 +3689,7 @@
                 <w:sz w:val="18"/>
                 <w:szCs w:val="18"/>
               </w:rPr>
-              <w:t>64.5</w:t>
+              <w:t>61.4</w:t>
             </w:r>
           </w:p>
         </w:tc>
@@ -3672,7 +3718,7 @@
                 <w:sz w:val="18"/>
                 <w:szCs w:val="18"/>
               </w:rPr>
-              <w:t>26.8</w:t>
+              <w:t>26.3</w:t>
             </w:r>
           </w:p>
         </w:tc>
@@ -3729,7 +3775,7 @@
                 <w:sz w:val="18"/>
                 <w:szCs w:val="18"/>
               </w:rPr>
-              <w:t>82.66</w:t>
+              <w:t>82.77</w:t>
             </w:r>
           </w:p>
         </w:tc>
@@ -3758,7 +3804,7 @@
                 <w:sz w:val="18"/>
                 <w:szCs w:val="18"/>
               </w:rPr>
-              <w:t>20.1</w:t>
+              <w:t>21.9</w:t>
             </w:r>
           </w:p>
         </w:tc>
@@ -3787,7 +3833,7 @@
                 <w:sz w:val="18"/>
                 <w:szCs w:val="18"/>
               </w:rPr>
-              <w:t>48.1</w:t>
+              <w:t>47.3</w:t>
             </w:r>
           </w:p>
         </w:tc>
@@ -3816,7 +3862,7 @@
                 <w:sz w:val="18"/>
                 <w:szCs w:val="18"/>
               </w:rPr>
-              <w:t>28.4</w:t>
+              <w:t>30.0</w:t>
             </w:r>
           </w:p>
         </w:tc>
@@ -3845,7 +3891,7 @@
                 <w:sz w:val="18"/>
                 <w:szCs w:val="18"/>
               </w:rPr>
-              <w:t>74.3</w:t>
+              <w:t>75.4</w:t>
             </w:r>
           </w:p>
         </w:tc>
@@ -3874,7 +3920,7 @@
                 <w:sz w:val="18"/>
                 <w:szCs w:val="18"/>
               </w:rPr>
-              <w:t>33.3</w:t>
+              <w:t>34.3</w:t>
             </w:r>
           </w:p>
         </w:tc>
@@ -3931,7 +3977,7 @@
                 <w:sz w:val="18"/>
                 <w:szCs w:val="18"/>
               </w:rPr>
-              <w:t>82.63</w:t>
+              <w:t>82.67</w:t>
             </w:r>
           </w:p>
         </w:tc>
@@ -3960,7 +4006,7 @@
                 <w:sz w:val="18"/>
                 <w:szCs w:val="18"/>
               </w:rPr>
-              <w:t>20.6</w:t>
+              <w:t>21.7</w:t>
             </w:r>
           </w:p>
         </w:tc>
@@ -3989,7 +4035,7 @@
                 <w:sz w:val="18"/>
                 <w:szCs w:val="18"/>
               </w:rPr>
-              <w:t>49.8</w:t>
+              <w:t>48.7</w:t>
             </w:r>
           </w:p>
         </w:tc>
@@ -4018,7 +4064,7 @@
                 <w:sz w:val="18"/>
                 <w:szCs w:val="18"/>
               </w:rPr>
-              <w:t>29.2</w:t>
+              <w:t>30.0</w:t>
             </w:r>
           </w:p>
         </w:tc>
@@ -4076,7 +4122,7 @@
                 <w:sz w:val="18"/>
                 <w:szCs w:val="18"/>
               </w:rPr>
-              <w:t>34.5</w:t>
+              <w:t>35.3</w:t>
             </w:r>
           </w:p>
         </w:tc>

</xml_diff>

<commit_message>
Open the introduction with the subsidy-control motivation
The generic first sentence is replaced by the concrete setting the
paragraph ends on: farmers declare crops for Common Agricultural Policy
subsidies and national agencies check the declarations, increasingly
with satellite data (Russwurm et al., 2020). It links to "orchards are
subsidized and inspected separately" and to the label source in 3.1.

Co-Authored-By: Claude Opus 5.5 <noreply@anthropic.com>
</commit_message>
<xml_diff>
--- a/paper/Orchards_in_the_Meadow.docx
+++ b/paper/Orchards_in_the_Meadow.docx
@@ -100,7 +100,10 @@
         <w:jc w:val="both"/>
       </w:pPr>
       <w:r>
-        <w:t>Crop-type maps support agricultural statistics, subsidy control and environmental monitoring. Satellite image time series (SITS) from Sentinel-2 (Drusch et al., 2012) have made parcel-level crop-type mapping practical at national scale, and operational systems now produce such maps routinely (Inglada et al., 2015; Defourny et al., 2019). Deep temporal classifiers, whether convolutional (Pelletier et al., 2019), residual (Wang et al., 2017) or attention-based (Sainte Fare Garnot et al., 2020; Rußwurm and Körner, 2020), reach around 80% overall accuracy on the BreizhCrops benchmark (Rußwurm et al., 2020). Overall accuracy, however, is dominated by the abundant classes: a classifier can miss nearly every parcel of a rare class and lose less than a point. Yet rare classes often matter most for policy; orchards, for example, are subsidized and inspected separately.</w:t>
+        <w:t>In the European Union, farmers declare their crops to claim subsidies under the Common Agricultural Policy, and national agencies check these declarations, increasingly with satellite data (Rußwurm et al., 2020).</w:t>
+      </w:r>
+      <w:r>
+        <w:t xml:space="preserve"> Satellite image time series (SITS) from Sentinel-2 (Drusch et al., 2012) have made parcel-level crop-type mapping practical at national scale, and operational systems now produce such maps routinely (Inglada et al., 2015; Defourny et al., 2019). Deep temporal classifiers, whether convolutional (Pelletier et al., 2019), residual (Wang et al., 2017) or attention-based (Sainte Fare Garnot et al., 2020; Rußwurm and Körner, 2020), reach around 80% overall accuracy on the BreizhCrops benchmark (Rußwurm et al., 2020). Overall accuracy, however, is dominated by the abundant classes: a classifier can miss nearly every parcel of a rare class and lose less than a point. Yet rare classes often matter most for policy; orchards, for example, are subsidized and inspected separately.</w:t>
       </w:r>
     </w:p>
     <w:p>
@@ -354,11 +357,7 @@
         <w:jc w:val="both"/>
       </w:pPr>
       <w:r>
-        <w:t>We use BreizhCrops (Rußwurm et al., 2020): 608,489 agricultural parcels of the 2017 season in the four départements of Brittany, France, frh01 (Côtes-d'Armor), frh02 (Finistère), frh03 (Ille-et-Vilaine) and frh04 (Morbihan). Each parcel has a crop label from the farmers' subsidy declarations (French Land Parcel Information System, Registre Parcellaire Graphique), mapped to nine classes; a polygon, from which we compute area, perimeter, shape and centroid; and two Sentinel-2 series of the reflectance averaged over the parcel: L1C (top of atmosphere, 13 bands) and L2A (surface reflectanc</w:t>
-      </w:r>
-      <w:r>
-        <w:lastRenderedPageBreak/>
-        <w:t>e from Sen2Cor, the 10 bands at 10 and 20 m, with a per-date cloud fraction). BreizhCrops also provides networks pretrained on the L1C series of frh01–frh03 and a reference transform that resamples each series to 45 dates. Like those networks, we train on frh01–frh03 (485,781 parcels) and test on frh04 (122,708 parcels; Table 1).</w:t>
+        <w:t>We use BreizhCrops (Rußwurm et al., 2020): 608,489 agricultural parcels of the 2017 season in the four départements of Brittany, France, frh01 (Côtes-d'Armor), frh02 (Finistère), frh03 (Ille-et-Vilaine) and frh04 (Morbihan). Each parcel has a crop label from the farmers' subsidy declarations (French Land Parcel Information System, Registre Parcellaire Graphique), mapped to nine classes; a polygon, from which we compute area, perimeter, shape and centroid; and two Sentinel-2 series of the reflectance averaged over the parcel: L1C (top of atmosphere, 13 bands) and L2A (surface reflectance from Sen2Cor, the 10 bands at 10 and 20 m, with a per-date cloud fraction). BreizhCrops also provides networks pretrained on the L1C series of frh01–frh03 and a reference transform that resamples each series to 45 dates. Like those networks, we train on frh01–frh03 (485,781 parcels) and test on frh04 (122,708 parcels; Table 1).</w:t>
       </w:r>
     </w:p>
     <w:p>
@@ -1514,7 +1513,6 @@
           <w:b/>
           <w:bCs/>
         </w:rPr>
-        <w:lastRenderedPageBreak/>
         <w:t>Phenology (15):</w:t>
       </w:r>
       <w:r>
@@ -1721,7 +1719,6 @@
         <w:rPr>
           <w:noProof/>
         </w:rPr>
-        <w:lastRenderedPageBreak/>
         <w:drawing>
           <wp:inline distT="0" distB="0" distL="0" distR="0" wp14:anchorId="6566574F" wp14:editId="22305BF3">
             <wp:extent cx="5667375" cy="2047875"/>
@@ -1872,11 +1869,7 @@
         <w:jc w:val="both"/>
       </w:pPr>
       <w:r>
-        <w:t xml:space="preserve">Choosing a decoding configuration on the same parcels it is reported on is optimistic, and neighboring parcels are correlated. We therefore cut the test region into 10 km blocks grouped into five spatial folds (Roberts et al., 2017); each fold is scored with the configuration chosen on the other four, and the five folds are concatenated. Three selection rules were fixed in advance: accuracy-first (maximum accuracy subject to orchard recall ≥ 35%), orchard-first (maximum orchard recall subject to accuracy ≥ 80.69%) and closest to a stretch target of 81% accuracy and 60% orchard recall; these thresholds are targets set at the start of the project, the accuracy floor just below the pretrained MSResNet’s 80.77%. Intervals </w:t>
-      </w:r>
-      <w:r>
-        <w:lastRenderedPageBreak/>
-        <w:t xml:space="preserve">are 95% block-bootstrap intervals (Künsch, 1989) </w:t>
+        <w:t xml:space="preserve">Choosing a decoding configuration on the same parcels it is reported on is optimistic, and neighboring parcels are correlated. We therefore cut the test region into 10 km blocks grouped into five spatial folds (Roberts et al., 2017); each fold is scored with the configuration chosen on the other four, and the five folds are concatenated. Three selection rules were fixed in advance: accuracy-first (maximum accuracy subject to orchard recall ≥ 35%), orchard-first (maximum orchard recall subject to accuracy ≥ 80.69%) and closest to a stretch target of 81% accuracy and 60% orchard recall; these thresholds are targets set at the start of the project, the accuracy floor just below the pretrained MSResNet’s 80.77%. Intervals are 95% block-bootstrap intervals (Künsch, 1989) </w:t>
       </w:r>
       <w:r>
         <w:t>over the same blocks, with 2,000 resamples (1,000 for orchard AP), and</w:t>
@@ -4125,7 +4118,6 @@
           <w:sz w:val="20"/>
           <w:szCs w:val="20"/>
         </w:rPr>
-        <w:lastRenderedPageBreak/>
         <w:t>Observations.</w:t>
       </w:r>
       <w:r>
@@ -5496,7 +5488,6 @@
         <w:rPr>
           <w:b/>
         </w:rPr>
-        <w:lastRenderedPageBreak/>
         <w:t>Conclusion.</w:t>
       </w:r>
       <w:r>
@@ -7410,7 +7401,6 @@
                 <w:sz w:val="18"/>
                 <w:szCs w:val="18"/>
               </w:rPr>
-              <w:lastRenderedPageBreak/>
               <w:t>Orchard-first</w:t>
             </w:r>
           </w:p>
@@ -9251,7 +9241,6 @@
         <w:rPr>
           <w:b/>
         </w:rPr>
-        <w:lastRenderedPageBreak/>
         <w:t>Conclusion.</w:t>
       </w:r>
       <w:r>

</xml_diff>

<commit_message>
Place Fig. 1 with the Methods overview that introduces it
The pipeline figure and its caption move from after Section 3.5 to just
after the opening paragraph of Section 3, which now describes the
pipeline and refers to Fig. 1. Numbering is unchanged (still the first
figure).

Co-Authored-By: Claude Opus 5.5 <noreply@anthropic.com>
</commit_message>
<xml_diff>
--- a/paper/Orchards_in_the_Meadow.docx
+++ b/paper/Orchards_in_the_Meadow.docx
@@ -340,1373 +340,6 @@
       </w:pPr>
       <w:r>
         <w:t>Fig. 1 shows the pipeline; the subsections follow it. Each parcel's Sentinel-2 series (Section 3.1) is resampled into fixed-length network inputs (Section 3.2), from which four feature blocks are computed (Section 3.3). A gradient-boosted meta-classifier turns the features into class probabilities, and decoding-time biases choose the operating point; its labels are the first output (Section 3.4). Parcels whose orchard score passes a candidate threshold are re-scored by a binary verifier, the second output (Section 3.5). The four-tier cascade we started from is a baseline (Section 3.6).</w:t>
-      </w:r>
-    </w:p>
-    <w:p>
-      <w:pPr>
-        <w:pStyle w:val="Heading2"/>
-        <w:keepNext/>
-      </w:pPr>
-      <w:r>
-        <w:t>3.1 Data</w:t>
-      </w:r>
-    </w:p>
-    <w:p>
-      <w:pPr>
-        <w:spacing w:after="120" w:line="276" w:lineRule="auto"/>
-        <w:jc w:val="both"/>
-      </w:pPr>
-      <w:r>
-        <w:t>We use BreizhCrops (Rußwurm et al., 2020): 608,489 agricultural parcels of the 2017 season in the four départements of Brittany, France, frh01 (Côtes-d'Armor), frh02 (Finistère), frh03 (Ille-et-Vilaine) and frh04 (Morbihan). Each parcel has a crop label from the farmers' subsidy declarations (French Land Parcel Information System, Registre Parcellaire Graphique), mapped to nine classes; a polygon, from which we compute area, perimeter, shape and centroid; and two Sentinel-2 series of the reflectance averaged over the parcel: L1C (top of atmosphere, 13 bands) and L2A (surface reflectance from Sen2Cor, the 10 bands at 10 and 20 m, with a per-date cloud fraction). BreizhCrops also provides networks pretrained on the L1C series of frh01–frh03 and a reference transform that resamples each series to 45 dates. Like those networks, we train on frh01–frh03 (485,781 parcels) and test on frh04 (122,708 parcels; Table 1).</w:t>
-      </w:r>
-    </w:p>
-    <w:p>
-      <w:pPr>
-        <w:spacing w:after="120" w:line="276" w:lineRule="auto"/>
-        <w:jc w:val="both"/>
-      </w:pPr>
-      <w:r>
-        <w:t>Three properties of the data shape the method. First, the classes are highly imbalanced (Table 1): five classes cover 97% of the parcels; orchards make up 0.52% of the training and 0.45% of the test parcels, varying by region from 0.25% (frh02) to 0.73% (frh03); and sunflowers and nuts, with 2 and 11 test parcels, are too rare to evaluate. Second, the series are irregular and noisy: 85% of the test parcels have fewer than 45 dates (median 27, against 37–39 in the training regions, so the test region is observed less often), the L2A cloud fraction is above zero on 60–68% of the observations, and only 32–40% of the dates pass our clear-date test (Section 3.3). Third, the processing levels do not fully overlap: the pretrained networks need the L1C series, which we align to the L2A parcels by identifier, but 151 test and 394 training parcels have none, so their L1C-network features are set to missing.</w:t>
-      </w:r>
-    </w:p>
-    <w:p>
-      <w:pPr>
-        <w:keepNext/>
-        <w:spacing w:before="120" w:after="120" w:line="252" w:lineRule="auto"/>
-        <w:jc w:val="both"/>
-      </w:pPr>
-      <w:r>
-        <w:rPr>
-          <w:b/>
-          <w:sz w:val="20"/>
-        </w:rPr>
-        <w:t>Table 1.</w:t>
-      </w:r>
-      <w:r>
-        <w:rPr>
-          <w:sz w:val="20"/>
-        </w:rPr>
-        <w:t xml:space="preserve"> BreizhCrops classes in the training regions (frh01–frh03) and the test region (frh04): parcels and share of the region.</w:t>
-      </w:r>
-    </w:p>
-    <w:tbl>
-      <w:tblPr>
-        <w:tblW w:w="3527" w:type="pct"/>
-        <w:tblBorders>
-          <w:top w:val="single" w:sz="4" w:space="0" w:color="auto"/>
-          <w:left w:val="single" w:sz="4" w:space="0" w:color="auto"/>
-          <w:bottom w:val="single" w:sz="4" w:space="0" w:color="auto"/>
-          <w:right w:val="single" w:sz="4" w:space="0" w:color="auto"/>
-          <w:insideH w:val="single" w:sz="4" w:space="0" w:color="auto"/>
-          <w:insideV w:val="single" w:sz="4" w:space="0" w:color="auto"/>
-        </w:tblBorders>
-        <w:tblCellMar>
-          <w:left w:w="10" w:type="dxa"/>
-          <w:right w:w="10" w:type="dxa"/>
-        </w:tblCellMar>
-        <w:tblLook w:val="04A0" w:firstRow="1" w:lastRow="0" w:firstColumn="1" w:lastColumn="0" w:noHBand="0" w:noVBand="1"/>
-      </w:tblPr>
-      <w:tblGrid>
-        <w:gridCol w:w="2544"/>
-        <w:gridCol w:w="1908"/>
-        <w:gridCol w:w="1908"/>
-      </w:tblGrid>
-      <w:tr>
-        <w:trPr>
-          <w:tblHeader/>
-        </w:trPr>
-        <w:tc>
-          <w:tcPr>
-            <w:tcW w:w="2000" w:type="pct"/>
-            <w:tcBorders>
-              <w:top w:val="single" w:sz="4" w:space="0" w:color="999999"/>
-              <w:left w:val="single" w:sz="4" w:space="0" w:color="999999"/>
-              <w:bottom w:val="single" w:sz="4" w:space="0" w:color="999999"/>
-              <w:right w:val="single" w:sz="4" w:space="0" w:color="999999"/>
-            </w:tcBorders>
-            <w:shd w:val="clear" w:color="auto" w:fill="EDEDED"/>
-            <w:tcMar>
-              <w:top w:w="40" w:type="dxa"/>
-              <w:left w:w="80" w:type="dxa"/>
-              <w:bottom w:w="40" w:type="dxa"/>
-              <w:right w:w="80" w:type="dxa"/>
-            </w:tcMar>
-          </w:tcPr>
-          <w:p>
-            <w:r>
-              <w:rPr>
-                <w:b/>
-                <w:bCs/>
-                <w:sz w:val="18"/>
-                <w:szCs w:val="18"/>
-              </w:rPr>
-              <w:t>Class</w:t>
-            </w:r>
-          </w:p>
-        </w:tc>
-        <w:tc>
-          <w:tcPr>
-            <w:tcW w:w="1500" w:type="pct"/>
-            <w:tcBorders>
-              <w:top w:val="single" w:sz="4" w:space="0" w:color="999999"/>
-              <w:left w:val="single" w:sz="4" w:space="0" w:color="999999"/>
-              <w:bottom w:val="single" w:sz="4" w:space="0" w:color="999999"/>
-              <w:right w:val="single" w:sz="4" w:space="0" w:color="999999"/>
-            </w:tcBorders>
-            <w:shd w:val="clear" w:color="auto" w:fill="EDEDED"/>
-            <w:tcMar>
-              <w:top w:w="40" w:type="dxa"/>
-              <w:left w:w="80" w:type="dxa"/>
-              <w:bottom w:w="40" w:type="dxa"/>
-              <w:right w:w="80" w:type="dxa"/>
-            </w:tcMar>
-          </w:tcPr>
-          <w:p>
-            <w:pPr>
-              <w:jc w:val="right"/>
-            </w:pPr>
-            <w:r>
-              <w:rPr>
-                <w:b/>
-                <w:bCs/>
-                <w:sz w:val="18"/>
-                <w:szCs w:val="18"/>
-              </w:rPr>
-              <w:t>Training (frh01–frh03)</w:t>
-            </w:r>
-          </w:p>
-        </w:tc>
-        <w:tc>
-          <w:tcPr>
-            <w:tcW w:w="1500" w:type="pct"/>
-            <w:tcBorders>
-              <w:top w:val="single" w:sz="4" w:space="0" w:color="999999"/>
-              <w:left w:val="single" w:sz="4" w:space="0" w:color="999999"/>
-              <w:bottom w:val="single" w:sz="4" w:space="0" w:color="999999"/>
-              <w:right w:val="single" w:sz="4" w:space="0" w:color="999999"/>
-            </w:tcBorders>
-            <w:shd w:val="clear" w:color="auto" w:fill="EDEDED"/>
-            <w:tcMar>
-              <w:top w:w="40" w:type="dxa"/>
-              <w:left w:w="80" w:type="dxa"/>
-              <w:bottom w:w="40" w:type="dxa"/>
-              <w:right w:w="80" w:type="dxa"/>
-            </w:tcMar>
-          </w:tcPr>
-          <w:p>
-            <w:pPr>
-              <w:jc w:val="right"/>
-            </w:pPr>
-            <w:r>
-              <w:rPr>
-                <w:b/>
-                <w:bCs/>
-                <w:sz w:val="18"/>
-                <w:szCs w:val="18"/>
-              </w:rPr>
-              <w:t>Test (frh04)</w:t>
-            </w:r>
-          </w:p>
-        </w:tc>
-      </w:tr>
-      <w:tr>
-        <w:tc>
-          <w:tcPr>
-            <w:tcW w:w="2000" w:type="pct"/>
-            <w:tcBorders>
-              <w:top w:val="single" w:sz="4" w:space="0" w:color="999999"/>
-              <w:left w:val="single" w:sz="4" w:space="0" w:color="999999"/>
-              <w:bottom w:val="single" w:sz="4" w:space="0" w:color="999999"/>
-              <w:right w:val="single" w:sz="4" w:space="0" w:color="999999"/>
-            </w:tcBorders>
-            <w:tcMar>
-              <w:top w:w="40" w:type="dxa"/>
-              <w:left w:w="80" w:type="dxa"/>
-              <w:bottom w:w="40" w:type="dxa"/>
-              <w:right w:w="80" w:type="dxa"/>
-            </w:tcMar>
-          </w:tcPr>
-          <w:p>
-            <w:pPr>
-              <w:rPr>
-                <w:sz w:val="18"/>
-                <w:szCs w:val="18"/>
-              </w:rPr>
-            </w:pPr>
-            <w:r>
-              <w:rPr>
-                <w:sz w:val="18"/>
-                <w:szCs w:val="18"/>
-              </w:rPr>
-              <w:t>Barley</w:t>
-            </w:r>
-          </w:p>
-        </w:tc>
-        <w:tc>
-          <w:tcPr>
-            <w:tcW w:w="1500" w:type="pct"/>
-            <w:tcBorders>
-              <w:top w:val="single" w:sz="4" w:space="0" w:color="999999"/>
-              <w:left w:val="single" w:sz="4" w:space="0" w:color="999999"/>
-              <w:bottom w:val="single" w:sz="4" w:space="0" w:color="999999"/>
-              <w:right w:val="single" w:sz="4" w:space="0" w:color="999999"/>
-            </w:tcBorders>
-            <w:tcMar>
-              <w:top w:w="40" w:type="dxa"/>
-              <w:left w:w="80" w:type="dxa"/>
-              <w:bottom w:w="40" w:type="dxa"/>
-              <w:right w:w="80" w:type="dxa"/>
-            </w:tcMar>
-          </w:tcPr>
-          <w:p>
-            <w:pPr>
-              <w:jc w:val="right"/>
-              <w:rPr>
-                <w:sz w:val="18"/>
-                <w:szCs w:val="18"/>
-              </w:rPr>
-            </w:pPr>
-            <w:r>
-              <w:rPr>
-                <w:sz w:val="18"/>
-                <w:szCs w:val="18"/>
-              </w:rPr>
-              <w:t>30,941 (6.37%)</w:t>
-            </w:r>
-          </w:p>
-        </w:tc>
-        <w:tc>
-          <w:tcPr>
-            <w:tcW w:w="1500" w:type="pct"/>
-            <w:tcBorders>
-              <w:top w:val="single" w:sz="4" w:space="0" w:color="999999"/>
-              <w:left w:val="single" w:sz="4" w:space="0" w:color="999999"/>
-              <w:bottom w:val="single" w:sz="4" w:space="0" w:color="999999"/>
-              <w:right w:val="single" w:sz="4" w:space="0" w:color="999999"/>
-            </w:tcBorders>
-            <w:tcMar>
-              <w:top w:w="40" w:type="dxa"/>
-              <w:left w:w="80" w:type="dxa"/>
-              <w:bottom w:w="40" w:type="dxa"/>
-              <w:right w:w="80" w:type="dxa"/>
-            </w:tcMar>
-          </w:tcPr>
-          <w:p>
-            <w:pPr>
-              <w:jc w:val="right"/>
-              <w:rPr>
-                <w:sz w:val="18"/>
-                <w:szCs w:val="18"/>
-              </w:rPr>
-            </w:pPr>
-            <w:r>
-              <w:rPr>
-                <w:sz w:val="18"/>
-                <w:szCs w:val="18"/>
-              </w:rPr>
-              <w:t>5,981 (4.87%)</w:t>
-            </w:r>
-          </w:p>
-        </w:tc>
-      </w:tr>
-      <w:tr>
-        <w:tc>
-          <w:tcPr>
-            <w:tcW w:w="2000" w:type="pct"/>
-            <w:tcBorders>
-              <w:top w:val="single" w:sz="4" w:space="0" w:color="999999"/>
-              <w:left w:val="single" w:sz="4" w:space="0" w:color="999999"/>
-              <w:bottom w:val="single" w:sz="4" w:space="0" w:color="999999"/>
-              <w:right w:val="single" w:sz="4" w:space="0" w:color="999999"/>
-            </w:tcBorders>
-            <w:tcMar>
-              <w:top w:w="40" w:type="dxa"/>
-              <w:left w:w="80" w:type="dxa"/>
-              <w:bottom w:w="40" w:type="dxa"/>
-              <w:right w:w="80" w:type="dxa"/>
-            </w:tcMar>
-          </w:tcPr>
-          <w:p>
-            <w:pPr>
-              <w:rPr>
-                <w:sz w:val="18"/>
-                <w:szCs w:val="18"/>
-              </w:rPr>
-            </w:pPr>
-            <w:r>
-              <w:rPr>
-                <w:sz w:val="18"/>
-                <w:szCs w:val="18"/>
-              </w:rPr>
-              <w:t>Wheat</w:t>
-            </w:r>
-          </w:p>
-        </w:tc>
-        <w:tc>
-          <w:tcPr>
-            <w:tcW w:w="1500" w:type="pct"/>
-            <w:tcBorders>
-              <w:top w:val="single" w:sz="4" w:space="0" w:color="999999"/>
-              <w:left w:val="single" w:sz="4" w:space="0" w:color="999999"/>
-              <w:bottom w:val="single" w:sz="4" w:space="0" w:color="999999"/>
-              <w:right w:val="single" w:sz="4" w:space="0" w:color="999999"/>
-            </w:tcBorders>
-            <w:tcMar>
-              <w:top w:w="40" w:type="dxa"/>
-              <w:left w:w="80" w:type="dxa"/>
-              <w:bottom w:w="40" w:type="dxa"/>
-              <w:right w:w="80" w:type="dxa"/>
-            </w:tcMar>
-          </w:tcPr>
-          <w:p>
-            <w:pPr>
-              <w:jc w:val="right"/>
-              <w:rPr>
-                <w:sz w:val="18"/>
-                <w:szCs w:val="18"/>
-              </w:rPr>
-            </w:pPr>
-            <w:r>
-              <w:rPr>
-                <w:sz w:val="18"/>
-                <w:szCs w:val="18"/>
-              </w:rPr>
-              <w:t>72,608 (14.95%)</w:t>
-            </w:r>
-          </w:p>
-        </w:tc>
-        <w:tc>
-          <w:tcPr>
-            <w:tcW w:w="1500" w:type="pct"/>
-            <w:tcBorders>
-              <w:top w:val="single" w:sz="4" w:space="0" w:color="999999"/>
-              <w:left w:val="single" w:sz="4" w:space="0" w:color="999999"/>
-              <w:bottom w:val="single" w:sz="4" w:space="0" w:color="999999"/>
-              <w:right w:val="single" w:sz="4" w:space="0" w:color="999999"/>
-            </w:tcBorders>
-            <w:tcMar>
-              <w:top w:w="40" w:type="dxa"/>
-              <w:left w:w="80" w:type="dxa"/>
-              <w:bottom w:w="40" w:type="dxa"/>
-              <w:right w:w="80" w:type="dxa"/>
-            </w:tcMar>
-          </w:tcPr>
-          <w:p>
-            <w:pPr>
-              <w:jc w:val="right"/>
-              <w:rPr>
-                <w:sz w:val="18"/>
-                <w:szCs w:val="18"/>
-              </w:rPr>
-            </w:pPr>
-            <w:r>
-              <w:rPr>
-                <w:sz w:val="18"/>
-                <w:szCs w:val="18"/>
-              </w:rPr>
-              <w:t>17,009 (13.86%)</w:t>
-            </w:r>
-          </w:p>
-        </w:tc>
-      </w:tr>
-      <w:tr>
-        <w:tc>
-          <w:tcPr>
-            <w:tcW w:w="2000" w:type="pct"/>
-            <w:tcBorders>
-              <w:top w:val="single" w:sz="4" w:space="0" w:color="999999"/>
-              <w:left w:val="single" w:sz="4" w:space="0" w:color="999999"/>
-              <w:bottom w:val="single" w:sz="4" w:space="0" w:color="999999"/>
-              <w:right w:val="single" w:sz="4" w:space="0" w:color="999999"/>
-            </w:tcBorders>
-            <w:tcMar>
-              <w:top w:w="40" w:type="dxa"/>
-              <w:left w:w="80" w:type="dxa"/>
-              <w:bottom w:w="40" w:type="dxa"/>
-              <w:right w:w="80" w:type="dxa"/>
-            </w:tcMar>
-          </w:tcPr>
-          <w:p>
-            <w:pPr>
-              <w:rPr>
-                <w:sz w:val="18"/>
-                <w:szCs w:val="18"/>
-              </w:rPr>
-            </w:pPr>
-            <w:r>
-              <w:rPr>
-                <w:sz w:val="18"/>
-                <w:szCs w:val="18"/>
-              </w:rPr>
-              <w:t>Rapeseed</w:t>
-            </w:r>
-          </w:p>
-        </w:tc>
-        <w:tc>
-          <w:tcPr>
-            <w:tcW w:w="1500" w:type="pct"/>
-            <w:tcBorders>
-              <w:top w:val="single" w:sz="4" w:space="0" w:color="999999"/>
-              <w:left w:val="single" w:sz="4" w:space="0" w:color="999999"/>
-              <w:bottom w:val="single" w:sz="4" w:space="0" w:color="999999"/>
-              <w:right w:val="single" w:sz="4" w:space="0" w:color="999999"/>
-            </w:tcBorders>
-            <w:tcMar>
-              <w:top w:w="40" w:type="dxa"/>
-              <w:left w:w="80" w:type="dxa"/>
-              <w:bottom w:w="40" w:type="dxa"/>
-              <w:right w:w="80" w:type="dxa"/>
-            </w:tcMar>
-          </w:tcPr>
-          <w:p>
-            <w:pPr>
-              <w:jc w:val="right"/>
-              <w:rPr>
-                <w:sz w:val="18"/>
-                <w:szCs w:val="18"/>
-              </w:rPr>
-            </w:pPr>
-            <w:r>
-              <w:rPr>
-                <w:sz w:val="18"/>
-                <w:szCs w:val="18"/>
-              </w:rPr>
-              <w:t>11,502 (2.37%)</w:t>
-            </w:r>
-          </w:p>
-        </w:tc>
-        <w:tc>
-          <w:tcPr>
-            <w:tcW w:w="1500" w:type="pct"/>
-            <w:tcBorders>
-              <w:top w:val="single" w:sz="4" w:space="0" w:color="999999"/>
-              <w:left w:val="single" w:sz="4" w:space="0" w:color="999999"/>
-              <w:bottom w:val="single" w:sz="4" w:space="0" w:color="999999"/>
-              <w:right w:val="single" w:sz="4" w:space="0" w:color="999999"/>
-            </w:tcBorders>
-            <w:tcMar>
-              <w:top w:w="40" w:type="dxa"/>
-              <w:left w:w="80" w:type="dxa"/>
-              <w:bottom w:w="40" w:type="dxa"/>
-              <w:right w:w="80" w:type="dxa"/>
-            </w:tcMar>
-          </w:tcPr>
-          <w:p>
-            <w:pPr>
-              <w:jc w:val="right"/>
-              <w:rPr>
-                <w:sz w:val="18"/>
-                <w:szCs w:val="18"/>
-              </w:rPr>
-            </w:pPr>
-            <w:r>
-              <w:rPr>
-                <w:sz w:val="18"/>
-                <w:szCs w:val="18"/>
-              </w:rPr>
-              <w:t>3,244 (2.64%)</w:t>
-            </w:r>
-          </w:p>
-        </w:tc>
-      </w:tr>
-      <w:tr>
-        <w:tc>
-          <w:tcPr>
-            <w:tcW w:w="2000" w:type="pct"/>
-            <w:tcBorders>
-              <w:top w:val="single" w:sz="4" w:space="0" w:color="999999"/>
-              <w:left w:val="single" w:sz="4" w:space="0" w:color="999999"/>
-              <w:bottom w:val="single" w:sz="4" w:space="0" w:color="999999"/>
-              <w:right w:val="single" w:sz="4" w:space="0" w:color="999999"/>
-            </w:tcBorders>
-            <w:tcMar>
-              <w:top w:w="40" w:type="dxa"/>
-              <w:left w:w="80" w:type="dxa"/>
-              <w:bottom w:w="40" w:type="dxa"/>
-              <w:right w:w="80" w:type="dxa"/>
-            </w:tcMar>
-          </w:tcPr>
-          <w:p>
-            <w:pPr>
-              <w:rPr>
-                <w:sz w:val="18"/>
-                <w:szCs w:val="18"/>
-              </w:rPr>
-            </w:pPr>
-            <w:r>
-              <w:rPr>
-                <w:sz w:val="18"/>
-                <w:szCs w:val="18"/>
-              </w:rPr>
-              <w:t>Corn</w:t>
-            </w:r>
-          </w:p>
-        </w:tc>
-        <w:tc>
-          <w:tcPr>
-            <w:tcW w:w="1500" w:type="pct"/>
-            <w:tcBorders>
-              <w:top w:val="single" w:sz="4" w:space="0" w:color="999999"/>
-              <w:left w:val="single" w:sz="4" w:space="0" w:color="999999"/>
-              <w:bottom w:val="single" w:sz="4" w:space="0" w:color="999999"/>
-              <w:right w:val="single" w:sz="4" w:space="0" w:color="999999"/>
-            </w:tcBorders>
-            <w:tcMar>
-              <w:top w:w="40" w:type="dxa"/>
-              <w:left w:w="80" w:type="dxa"/>
-              <w:bottom w:w="40" w:type="dxa"/>
-              <w:right w:w="80" w:type="dxa"/>
-            </w:tcMar>
-          </w:tcPr>
-          <w:p>
-            <w:pPr>
-              <w:jc w:val="right"/>
-              <w:rPr>
-                <w:sz w:val="18"/>
-                <w:szCs w:val="18"/>
-              </w:rPr>
-            </w:pPr>
-            <w:r>
-              <w:rPr>
-                <w:sz w:val="18"/>
-                <w:szCs w:val="18"/>
-              </w:rPr>
-              <w:t>122,634 (25.24%)</w:t>
-            </w:r>
-          </w:p>
-        </w:tc>
-        <w:tc>
-          <w:tcPr>
-            <w:tcW w:w="1500" w:type="pct"/>
-            <w:tcBorders>
-              <w:top w:val="single" w:sz="4" w:space="0" w:color="999999"/>
-              <w:left w:val="single" w:sz="4" w:space="0" w:color="999999"/>
-              <w:bottom w:val="single" w:sz="4" w:space="0" w:color="999999"/>
-              <w:right w:val="single" w:sz="4" w:space="0" w:color="999999"/>
-            </w:tcBorders>
-            <w:tcMar>
-              <w:top w:w="40" w:type="dxa"/>
-              <w:left w:w="80" w:type="dxa"/>
-              <w:bottom w:w="40" w:type="dxa"/>
-              <w:right w:w="80" w:type="dxa"/>
-            </w:tcMar>
-          </w:tcPr>
-          <w:p>
-            <w:pPr>
-              <w:jc w:val="right"/>
-              <w:rPr>
-                <w:sz w:val="18"/>
-                <w:szCs w:val="18"/>
-              </w:rPr>
-            </w:pPr>
-            <w:r>
-              <w:rPr>
-                <w:sz w:val="18"/>
-                <w:szCs w:val="18"/>
-              </w:rPr>
-              <w:t>31,361 (25.56%)</w:t>
-            </w:r>
-          </w:p>
-        </w:tc>
-      </w:tr>
-      <w:tr>
-        <w:tc>
-          <w:tcPr>
-            <w:tcW w:w="2000" w:type="pct"/>
-            <w:tcBorders>
-              <w:top w:val="single" w:sz="4" w:space="0" w:color="999999"/>
-              <w:left w:val="single" w:sz="4" w:space="0" w:color="999999"/>
-              <w:bottom w:val="single" w:sz="4" w:space="0" w:color="999999"/>
-              <w:right w:val="single" w:sz="4" w:space="0" w:color="999999"/>
-            </w:tcBorders>
-            <w:tcMar>
-              <w:top w:w="40" w:type="dxa"/>
-              <w:left w:w="80" w:type="dxa"/>
-              <w:bottom w:w="40" w:type="dxa"/>
-              <w:right w:w="80" w:type="dxa"/>
-            </w:tcMar>
-          </w:tcPr>
-          <w:p>
-            <w:r>
-              <w:rPr>
-                <w:sz w:val="18"/>
-                <w:szCs w:val="18"/>
-              </w:rPr>
-              <w:t>Sunflower</w:t>
-            </w:r>
-          </w:p>
-        </w:tc>
-        <w:tc>
-          <w:tcPr>
-            <w:tcW w:w="1500" w:type="pct"/>
-            <w:tcBorders>
-              <w:top w:val="single" w:sz="4" w:space="0" w:color="999999"/>
-              <w:left w:val="single" w:sz="4" w:space="0" w:color="999999"/>
-              <w:bottom w:val="single" w:sz="4" w:space="0" w:color="999999"/>
-              <w:right w:val="single" w:sz="4" w:space="0" w:color="999999"/>
-            </w:tcBorders>
-            <w:tcMar>
-              <w:top w:w="40" w:type="dxa"/>
-              <w:left w:w="80" w:type="dxa"/>
-              <w:bottom w:w="40" w:type="dxa"/>
-              <w:right w:w="80" w:type="dxa"/>
-            </w:tcMar>
-          </w:tcPr>
-          <w:p>
-            <w:pPr>
-              <w:jc w:val="right"/>
-            </w:pPr>
-            <w:r>
-              <w:rPr>
-                <w:sz w:val="18"/>
-                <w:szCs w:val="18"/>
-              </w:rPr>
-              <w:t>17 (&lt;0.01%)</w:t>
-            </w:r>
-          </w:p>
-        </w:tc>
-        <w:tc>
-          <w:tcPr>
-            <w:tcW w:w="1500" w:type="pct"/>
-            <w:tcBorders>
-              <w:top w:val="single" w:sz="4" w:space="0" w:color="999999"/>
-              <w:left w:val="single" w:sz="4" w:space="0" w:color="999999"/>
-              <w:bottom w:val="single" w:sz="4" w:space="0" w:color="999999"/>
-              <w:right w:val="single" w:sz="4" w:space="0" w:color="999999"/>
-            </w:tcBorders>
-            <w:tcMar>
-              <w:top w:w="40" w:type="dxa"/>
-              <w:left w:w="80" w:type="dxa"/>
-              <w:bottom w:w="40" w:type="dxa"/>
-              <w:right w:w="80" w:type="dxa"/>
-            </w:tcMar>
-          </w:tcPr>
-          <w:p>
-            <w:pPr>
-              <w:jc w:val="right"/>
-            </w:pPr>
-            <w:r>
-              <w:rPr>
-                <w:sz w:val="18"/>
-                <w:szCs w:val="18"/>
-              </w:rPr>
-              <w:t>2 (&lt;0.01%)</w:t>
-            </w:r>
-          </w:p>
-        </w:tc>
-      </w:tr>
-      <w:tr>
-        <w:tc>
-          <w:tcPr>
-            <w:tcW w:w="2000" w:type="pct"/>
-            <w:tcBorders>
-              <w:top w:val="single" w:sz="4" w:space="0" w:color="999999"/>
-              <w:left w:val="single" w:sz="4" w:space="0" w:color="999999"/>
-              <w:bottom w:val="single" w:sz="4" w:space="0" w:color="999999"/>
-              <w:right w:val="single" w:sz="4" w:space="0" w:color="999999"/>
-            </w:tcBorders>
-            <w:tcMar>
-              <w:top w:w="40" w:type="dxa"/>
-              <w:left w:w="80" w:type="dxa"/>
-              <w:bottom w:w="40" w:type="dxa"/>
-              <w:right w:w="80" w:type="dxa"/>
-            </w:tcMar>
-          </w:tcPr>
-          <w:p>
-            <w:r>
-              <w:rPr>
-                <w:sz w:val="18"/>
-                <w:szCs w:val="18"/>
-              </w:rPr>
-              <w:t>Orchards</w:t>
-            </w:r>
-          </w:p>
-        </w:tc>
-        <w:tc>
-          <w:tcPr>
-            <w:tcW w:w="1500" w:type="pct"/>
-            <w:tcBorders>
-              <w:top w:val="single" w:sz="4" w:space="0" w:color="999999"/>
-              <w:left w:val="single" w:sz="4" w:space="0" w:color="999999"/>
-              <w:bottom w:val="single" w:sz="4" w:space="0" w:color="999999"/>
-              <w:right w:val="single" w:sz="4" w:space="0" w:color="999999"/>
-            </w:tcBorders>
-            <w:tcMar>
-              <w:top w:w="40" w:type="dxa"/>
-              <w:left w:w="80" w:type="dxa"/>
-              <w:bottom w:w="40" w:type="dxa"/>
-              <w:right w:w="80" w:type="dxa"/>
-            </w:tcMar>
-          </w:tcPr>
-          <w:p>
-            <w:pPr>
-              <w:jc w:val="right"/>
-            </w:pPr>
-            <w:r>
-              <w:rPr>
-                <w:sz w:val="18"/>
-                <w:szCs w:val="18"/>
-              </w:rPr>
-              <w:t>2,502 (0.52%)</w:t>
-            </w:r>
-          </w:p>
-        </w:tc>
-        <w:tc>
-          <w:tcPr>
-            <w:tcW w:w="1500" w:type="pct"/>
-            <w:tcBorders>
-              <w:top w:val="single" w:sz="4" w:space="0" w:color="999999"/>
-              <w:left w:val="single" w:sz="4" w:space="0" w:color="999999"/>
-              <w:bottom w:val="single" w:sz="4" w:space="0" w:color="999999"/>
-              <w:right w:val="single" w:sz="4" w:space="0" w:color="999999"/>
-            </w:tcBorders>
-            <w:tcMar>
-              <w:top w:w="40" w:type="dxa"/>
-              <w:left w:w="80" w:type="dxa"/>
-              <w:bottom w:w="40" w:type="dxa"/>
-              <w:right w:w="80" w:type="dxa"/>
-            </w:tcMar>
-          </w:tcPr>
-          <w:p>
-            <w:pPr>
-              <w:jc w:val="right"/>
-            </w:pPr>
-            <w:r>
-              <w:rPr>
-                <w:sz w:val="18"/>
-                <w:szCs w:val="18"/>
-              </w:rPr>
-              <w:t>552 (0.45%)</w:t>
-            </w:r>
-          </w:p>
-        </w:tc>
-      </w:tr>
-      <w:tr>
-        <w:tc>
-          <w:tcPr>
-            <w:tcW w:w="2000" w:type="pct"/>
-            <w:tcBorders>
-              <w:top w:val="single" w:sz="4" w:space="0" w:color="999999"/>
-              <w:left w:val="single" w:sz="4" w:space="0" w:color="999999"/>
-              <w:bottom w:val="single" w:sz="4" w:space="0" w:color="999999"/>
-              <w:right w:val="single" w:sz="4" w:space="0" w:color="999999"/>
-            </w:tcBorders>
-            <w:tcMar>
-              <w:top w:w="40" w:type="dxa"/>
-              <w:left w:w="80" w:type="dxa"/>
-              <w:bottom w:w="40" w:type="dxa"/>
-              <w:right w:w="80" w:type="dxa"/>
-            </w:tcMar>
-          </w:tcPr>
-          <w:p>
-            <w:r>
-              <w:rPr>
-                <w:sz w:val="18"/>
-                <w:szCs w:val="18"/>
-              </w:rPr>
-              <w:t>Nuts</w:t>
-            </w:r>
-          </w:p>
-        </w:tc>
-        <w:tc>
-          <w:tcPr>
-            <w:tcW w:w="1500" w:type="pct"/>
-            <w:tcBorders>
-              <w:top w:val="single" w:sz="4" w:space="0" w:color="999999"/>
-              <w:left w:val="single" w:sz="4" w:space="0" w:color="999999"/>
-              <w:bottom w:val="single" w:sz="4" w:space="0" w:color="999999"/>
-              <w:right w:val="single" w:sz="4" w:space="0" w:color="999999"/>
-            </w:tcBorders>
-            <w:tcMar>
-              <w:top w:w="40" w:type="dxa"/>
-              <w:left w:w="80" w:type="dxa"/>
-              <w:bottom w:w="40" w:type="dxa"/>
-              <w:right w:w="80" w:type="dxa"/>
-            </w:tcMar>
-          </w:tcPr>
-          <w:p>
-            <w:pPr>
-              <w:jc w:val="right"/>
-            </w:pPr>
-            <w:r>
-              <w:rPr>
-                <w:sz w:val="18"/>
-                <w:szCs w:val="18"/>
-              </w:rPr>
-              <w:t>38 (0.01%)</w:t>
-            </w:r>
-          </w:p>
-        </w:tc>
-        <w:tc>
-          <w:tcPr>
-            <w:tcW w:w="1500" w:type="pct"/>
-            <w:tcBorders>
-              <w:top w:val="single" w:sz="4" w:space="0" w:color="999999"/>
-              <w:left w:val="single" w:sz="4" w:space="0" w:color="999999"/>
-              <w:bottom w:val="single" w:sz="4" w:space="0" w:color="999999"/>
-              <w:right w:val="single" w:sz="4" w:space="0" w:color="999999"/>
-            </w:tcBorders>
-            <w:tcMar>
-              <w:top w:w="40" w:type="dxa"/>
-              <w:left w:w="80" w:type="dxa"/>
-              <w:bottom w:w="40" w:type="dxa"/>
-              <w:right w:w="80" w:type="dxa"/>
-            </w:tcMar>
-          </w:tcPr>
-          <w:p>
-            <w:pPr>
-              <w:jc w:val="right"/>
-            </w:pPr>
-            <w:r>
-              <w:rPr>
-                <w:sz w:val="18"/>
-                <w:szCs w:val="18"/>
-              </w:rPr>
-              <w:t>11 (0.01%)</w:t>
-            </w:r>
-          </w:p>
-        </w:tc>
-      </w:tr>
-      <w:tr>
-        <w:tc>
-          <w:tcPr>
-            <w:tcW w:w="2000" w:type="pct"/>
-            <w:tcBorders>
-              <w:top w:val="single" w:sz="4" w:space="0" w:color="999999"/>
-              <w:left w:val="single" w:sz="4" w:space="0" w:color="999999"/>
-              <w:bottom w:val="single" w:sz="4" w:space="0" w:color="999999"/>
-              <w:right w:val="single" w:sz="4" w:space="0" w:color="999999"/>
-            </w:tcBorders>
-            <w:tcMar>
-              <w:top w:w="40" w:type="dxa"/>
-              <w:left w:w="80" w:type="dxa"/>
-              <w:bottom w:w="40" w:type="dxa"/>
-              <w:right w:w="80" w:type="dxa"/>
-            </w:tcMar>
-          </w:tcPr>
-          <w:p>
-            <w:r>
-              <w:rPr>
-                <w:sz w:val="18"/>
-                <w:szCs w:val="18"/>
-              </w:rPr>
-              <w:t>Permanent meadows</w:t>
-            </w:r>
-          </w:p>
-        </w:tc>
-        <w:tc>
-          <w:tcPr>
-            <w:tcW w:w="1500" w:type="pct"/>
-            <w:tcBorders>
-              <w:top w:val="single" w:sz="4" w:space="0" w:color="999999"/>
-              <w:left w:val="single" w:sz="4" w:space="0" w:color="999999"/>
-              <w:bottom w:val="single" w:sz="4" w:space="0" w:color="999999"/>
-              <w:right w:val="single" w:sz="4" w:space="0" w:color="999999"/>
-            </w:tcBorders>
-            <w:tcMar>
-              <w:top w:w="40" w:type="dxa"/>
-              <w:left w:w="80" w:type="dxa"/>
-              <w:bottom w:w="40" w:type="dxa"/>
-              <w:right w:w="80" w:type="dxa"/>
-            </w:tcMar>
-          </w:tcPr>
-          <w:p>
-            <w:pPr>
-              <w:jc w:val="right"/>
-            </w:pPr>
-            <w:r>
-              <w:rPr>
-                <w:sz w:val="18"/>
-                <w:szCs w:val="18"/>
-              </w:rPr>
-              <w:t>101,701 (20.94%)</w:t>
-            </w:r>
-          </w:p>
-        </w:tc>
-        <w:tc>
-          <w:tcPr>
-            <w:tcW w:w="1500" w:type="pct"/>
-            <w:tcBorders>
-              <w:top w:val="single" w:sz="4" w:space="0" w:color="999999"/>
-              <w:left w:val="single" w:sz="4" w:space="0" w:color="999999"/>
-              <w:bottom w:val="single" w:sz="4" w:space="0" w:color="999999"/>
-              <w:right w:val="single" w:sz="4" w:space="0" w:color="999999"/>
-            </w:tcBorders>
-            <w:tcMar>
-              <w:top w:w="40" w:type="dxa"/>
-              <w:left w:w="80" w:type="dxa"/>
-              <w:bottom w:w="40" w:type="dxa"/>
-              <w:right w:w="80" w:type="dxa"/>
-            </w:tcMar>
-          </w:tcPr>
-          <w:p>
-            <w:pPr>
-              <w:jc w:val="right"/>
-            </w:pPr>
-            <w:r>
-              <w:rPr>
-                <w:sz w:val="18"/>
-                <w:szCs w:val="18"/>
-              </w:rPr>
-              <w:t>26,134 (21.30%)</w:t>
-            </w:r>
-          </w:p>
-        </w:tc>
-      </w:tr>
-      <w:tr>
-        <w:tc>
-          <w:tcPr>
-            <w:tcW w:w="2000" w:type="pct"/>
-            <w:tcBorders>
-              <w:top w:val="single" w:sz="4" w:space="0" w:color="999999"/>
-              <w:left w:val="single" w:sz="4" w:space="0" w:color="999999"/>
-              <w:bottom w:val="single" w:sz="4" w:space="0" w:color="999999"/>
-              <w:right w:val="single" w:sz="4" w:space="0" w:color="999999"/>
-            </w:tcBorders>
-            <w:tcMar>
-              <w:top w:w="40" w:type="dxa"/>
-              <w:left w:w="80" w:type="dxa"/>
-              <w:bottom w:w="40" w:type="dxa"/>
-              <w:right w:w="80" w:type="dxa"/>
-            </w:tcMar>
-          </w:tcPr>
-          <w:p>
-            <w:r>
-              <w:rPr>
-                <w:sz w:val="18"/>
-                <w:szCs w:val="18"/>
-              </w:rPr>
-              <w:t>Temporary meadows</w:t>
-            </w:r>
-          </w:p>
-        </w:tc>
-        <w:tc>
-          <w:tcPr>
-            <w:tcW w:w="1500" w:type="pct"/>
-            <w:tcBorders>
-              <w:top w:val="single" w:sz="4" w:space="0" w:color="999999"/>
-              <w:left w:val="single" w:sz="4" w:space="0" w:color="999999"/>
-              <w:bottom w:val="single" w:sz="4" w:space="0" w:color="999999"/>
-              <w:right w:val="single" w:sz="4" w:space="0" w:color="999999"/>
-            </w:tcBorders>
-            <w:tcMar>
-              <w:top w:w="40" w:type="dxa"/>
-              <w:left w:w="80" w:type="dxa"/>
-              <w:bottom w:w="40" w:type="dxa"/>
-              <w:right w:w="80" w:type="dxa"/>
-            </w:tcMar>
-          </w:tcPr>
-          <w:p>
-            <w:pPr>
-              <w:jc w:val="right"/>
-            </w:pPr>
-            <w:r>
-              <w:rPr>
-                <w:sz w:val="18"/>
-                <w:szCs w:val="18"/>
-              </w:rPr>
-              <w:t>143,838 (29.61%)</w:t>
-            </w:r>
-          </w:p>
-        </w:tc>
-        <w:tc>
-          <w:tcPr>
-            <w:tcW w:w="1500" w:type="pct"/>
-            <w:tcBorders>
-              <w:top w:val="single" w:sz="4" w:space="0" w:color="999999"/>
-              <w:left w:val="single" w:sz="4" w:space="0" w:color="999999"/>
-              <w:bottom w:val="single" w:sz="4" w:space="0" w:color="999999"/>
-              <w:right w:val="single" w:sz="4" w:space="0" w:color="999999"/>
-            </w:tcBorders>
-            <w:tcMar>
-              <w:top w:w="40" w:type="dxa"/>
-              <w:left w:w="80" w:type="dxa"/>
-              <w:bottom w:w="40" w:type="dxa"/>
-              <w:right w:w="80" w:type="dxa"/>
-            </w:tcMar>
-          </w:tcPr>
-          <w:p>
-            <w:pPr>
-              <w:jc w:val="right"/>
-            </w:pPr>
-            <w:r>
-              <w:rPr>
-                <w:sz w:val="18"/>
-                <w:szCs w:val="18"/>
-              </w:rPr>
-              <w:t>38,414 (31.31%)</w:t>
-            </w:r>
-          </w:p>
-        </w:tc>
-      </w:tr>
-      <w:tr>
-        <w:tc>
-          <w:tcPr>
-            <w:tcW w:w="2000" w:type="pct"/>
-            <w:tcBorders>
-              <w:top w:val="single" w:sz="4" w:space="0" w:color="999999"/>
-              <w:left w:val="single" w:sz="4" w:space="0" w:color="999999"/>
-              <w:bottom w:val="single" w:sz="4" w:space="0" w:color="999999"/>
-              <w:right w:val="single" w:sz="4" w:space="0" w:color="999999"/>
-            </w:tcBorders>
-            <w:tcMar>
-              <w:top w:w="40" w:type="dxa"/>
-              <w:left w:w="80" w:type="dxa"/>
-              <w:bottom w:w="40" w:type="dxa"/>
-              <w:right w:w="80" w:type="dxa"/>
-            </w:tcMar>
-          </w:tcPr>
-          <w:p>
-            <w:r>
-              <w:rPr>
-                <w:sz w:val="18"/>
-                <w:szCs w:val="18"/>
-              </w:rPr>
-              <w:t>Total</w:t>
-            </w:r>
-          </w:p>
-        </w:tc>
-        <w:tc>
-          <w:tcPr>
-            <w:tcW w:w="1500" w:type="pct"/>
-            <w:tcBorders>
-              <w:top w:val="single" w:sz="4" w:space="0" w:color="999999"/>
-              <w:left w:val="single" w:sz="4" w:space="0" w:color="999999"/>
-              <w:bottom w:val="single" w:sz="4" w:space="0" w:color="999999"/>
-              <w:right w:val="single" w:sz="4" w:space="0" w:color="999999"/>
-            </w:tcBorders>
-            <w:tcMar>
-              <w:top w:w="40" w:type="dxa"/>
-              <w:left w:w="80" w:type="dxa"/>
-              <w:bottom w:w="40" w:type="dxa"/>
-              <w:right w:w="80" w:type="dxa"/>
-            </w:tcMar>
-          </w:tcPr>
-          <w:p>
-            <w:pPr>
-              <w:jc w:val="right"/>
-            </w:pPr>
-            <w:r>
-              <w:rPr>
-                <w:sz w:val="18"/>
-                <w:szCs w:val="18"/>
-              </w:rPr>
-              <w:t>485,781</w:t>
-            </w:r>
-          </w:p>
-        </w:tc>
-        <w:tc>
-          <w:tcPr>
-            <w:tcW w:w="1500" w:type="pct"/>
-            <w:tcBorders>
-              <w:top w:val="single" w:sz="4" w:space="0" w:color="999999"/>
-              <w:left w:val="single" w:sz="4" w:space="0" w:color="999999"/>
-              <w:bottom w:val="single" w:sz="4" w:space="0" w:color="999999"/>
-              <w:right w:val="single" w:sz="4" w:space="0" w:color="999999"/>
-            </w:tcBorders>
-            <w:tcMar>
-              <w:top w:w="40" w:type="dxa"/>
-              <w:left w:w="80" w:type="dxa"/>
-              <w:bottom w:w="40" w:type="dxa"/>
-              <w:right w:w="80" w:type="dxa"/>
-            </w:tcMar>
-          </w:tcPr>
-          <w:p>
-            <w:pPr>
-              <w:jc w:val="right"/>
-            </w:pPr>
-            <w:r>
-              <w:rPr>
-                <w:sz w:val="18"/>
-                <w:szCs w:val="18"/>
-              </w:rPr>
-              <w:t>122,708</w:t>
-            </w:r>
-          </w:p>
-        </w:tc>
-      </w:tr>
-    </w:tbl>
-    <w:p>
-      <w:pPr>
-        <w:spacing w:after="80"/>
-      </w:pPr>
-    </w:p>
-    <w:p>
-      <w:pPr>
-        <w:pStyle w:val="Heading2"/>
-        <w:keepNext/>
-      </w:pPr>
-      <w:r>
-        <w:t xml:space="preserve">3.2 </w:t>
-      </w:r>
-      <w:r>
-        <w:t>Multi-view inference</w:t>
-      </w:r>
-    </w:p>
-    <w:p>
-      <w:pPr>
-        <w:spacing w:after="120" w:line="276" w:lineRule="auto"/>
-        <w:jc w:val="both"/>
-      </w:pPr>
-      <w:r>
-        <w:t>Because most series are shorter than 45 dates, the BreizhCrops reference transform randomly resamples each series to 45 dates; zero-padding instead would create out-of-distribution inputs (Section 4.4). To reduce the variance of random resampling at test time, we feed every network the mean over eight seeded, resampled 45-date views, a form of test-time augmentation (Shanmugam et al., 2021).</w:t>
-      </w:r>
-    </w:p>
-    <w:p>
-      <w:pPr>
-        <w:pStyle w:val="Heading2"/>
-        <w:keepNext/>
-        <w:jc w:val="both"/>
-      </w:pPr>
-      <w:r>
-        <w:t>3.3 Feature blocks</w:t>
-      </w:r>
-    </w:p>
-    <w:p>
-      <w:pPr>
-        <w:spacing w:after="120" w:line="276" w:lineRule="auto"/>
-        <w:jc w:val="both"/>
-      </w:pPr>
-      <w:r>
-        <w:t>The meta-classifier sees 51 features per parcel, in four blocks (Fig. 1):</w:t>
-      </w:r>
-    </w:p>
-    <w:p>
-      <w:pPr>
-        <w:pStyle w:val="ListParagraph"/>
-        <w:numPr>
-          <w:ilvl w:val="0"/>
-          <w:numId w:val="3"/>
-        </w:numPr>
-        <w:spacing w:after="60" w:line="276" w:lineRule="auto"/>
-        <w:jc w:val="both"/>
-      </w:pPr>
-      <w:r>
-        <w:rPr>
-          <w:b/>
-          <w:bCs/>
-        </w:rPr>
-        <w:t>Parcel metadata (8):</w:t>
-      </w:r>
-      <w:r>
-        <w:t xml:space="preserve"> log area, maximum NDVI, NDVI amplitude, centroid latitude, mean and standard deviation of the </w:t>
-      </w:r>
-      <w:r>
-        <w:t>normalized</w:t>
-      </w:r>
-      <w:r>
-        <w:t xml:space="preserve"> acquisition day of year, the day of year of the NDVI maximum, and the log number of valid observations.</w:t>
-      </w:r>
-    </w:p>
-    <w:p>
-      <w:pPr>
-        <w:pStyle w:val="ListParagraph"/>
-        <w:numPr>
-          <w:ilvl w:val="0"/>
-          <w:numId w:val="3"/>
-        </w:numPr>
-        <w:spacing w:after="60" w:line="276" w:lineRule="auto"/>
-        <w:jc w:val="both"/>
-      </w:pPr>
-      <w:r>
-        <w:rPr>
-          <w:b/>
-          <w:bCs/>
-        </w:rPr>
-        <w:t>Phenology (15):</w:t>
-      </w:r>
-      <w:r>
-        <w:t xml:space="preserve"> computed from cloud-free dates only: seasonal NDVI means and the winter minimum, NDVI spread, the summer-minus-winter contrast, mowing-like NDVI drops between April and September, spring and summer red-edge (NDRE) and moisture (NDMI) means, the number of clear dates, and parcel compactness. On frh04 the strongest single features separate orchards from meadows </w:t>
-      </w:r>
-      <w:r>
-        <w:t>with a separability of 0.74 (spring NDMI), 0.72 (spring NDVI) and 0.70 (largest summer NDVI drop), where separability is max(AUROC, 1 − AUROC) and AUROC is the area under the ROC curve;</w:t>
-      </w:r>
-      <w:r>
-        <w:t xml:space="preserve"> Fig. 2a, b shows the seasonal difference.</w:t>
-      </w:r>
-    </w:p>
-    <w:p>
-      <w:pPr>
-        <w:pStyle w:val="ListParagraph"/>
-        <w:numPr>
-          <w:ilvl w:val="0"/>
-          <w:numId w:val="3"/>
-        </w:numPr>
-        <w:spacing w:after="60" w:line="276" w:lineRule="auto"/>
-        <w:jc w:val="both"/>
-      </w:pPr>
-      <w:r>
-        <w:rPr>
-          <w:b/>
-          <w:bCs/>
-        </w:rPr>
-        <w:t>Pretrained L1C networks (19):</w:t>
-      </w:r>
-      <w:r>
-        <w:t xml:space="preserve"> the logits of the BreizhCrops MSResNet and Transformer (nine each) and one margin feature, extracted with eight-view test-time augmentation.</w:t>
-      </w:r>
-    </w:p>
-    <w:p>
-      <w:pPr>
-        <w:pStyle w:val="ListParagraph"/>
-        <w:numPr>
-          <w:ilvl w:val="0"/>
-          <w:numId w:val="3"/>
-        </w:numPr>
-        <w:spacing w:after="60" w:line="276" w:lineRule="auto"/>
-        <w:jc w:val="both"/>
-      </w:pPr>
-      <w:r>
-        <w:rPr>
-          <w:b/>
-          <w:bCs/>
-        </w:rPr>
-        <w:t>L2A network (9):</w:t>
-      </w:r>
-      <w:r>
-        <w:t xml:space="preserve"> the logits of a 9-class MSResNet that we train from scratch on the L2A series of frh01–frh03. It uses clear dates only, keeping a date when its cloud fraction is at most 0.1, its blue reflectance is below 0.12 and </w:t>
-      </w:r>
-      <w:r>
-        <w:t>it is not an isolated NDVI dip.</w:t>
-      </w:r>
-      <w:r>
-        <w:t xml:space="preserve"> </w:t>
-      </w:r>
-      <w:r>
-        <w:t>We train the network for ten epochs and then recompute its BatchNorm statistics (Ioffe and Szegedy, 2015) on the training series; without this step its accuracy is 58.7% instead of 80.2%. Its logits are averaged over three training seeds and extracted with eight-view test-time augmentation.</w:t>
-      </w:r>
-    </w:p>
-    <w:p>
-      <w:pPr>
-        <w:pStyle w:val="Heading2"/>
-        <w:keepNext/>
-      </w:pPr>
-      <w:r>
-        <w:t>3.4 Meta-classifier</w:t>
-      </w:r>
-    </w:p>
-    <w:p>
-      <w:pPr>
-        <w:spacing w:after="120" w:line="276" w:lineRule="auto"/>
-        <w:jc w:val="both"/>
-      </w:pPr>
-      <w:r>
-        <w:t xml:space="preserve">The meta-classifier turns the 51 features into labels in four stages, each feeding the next. </w:t>
-      </w:r>
-      <w:r>
-        <w:rPr>
-          <w:b/>
-        </w:rPr>
-        <w:t>(1) Training:</w:t>
-      </w:r>
-      <w:r>
-        <w:t xml:space="preserve"> XGBoost and CatBoost are trained on the features of the training regions, with class-balanced sample weights and orchards further up-weighted by a factor m </w:t>
-      </w:r>
-      <w:r>
-        <w:rPr>
-          <w:rFonts w:ascii="Cambria Math" w:hAnsi="Cambria Math" w:cs="Cambria Math"/>
-        </w:rPr>
-        <w:t>∈</w:t>
-      </w:r>
-      <w:r>
-        <w:t xml:space="preserve"> {1, 2, 3}, which gives one pair of models per m. </w:t>
-      </w:r>
-      <w:r>
-        <w:rPr>
-          <w:b/>
-        </w:rPr>
-        <w:t>(2) Blending:</w:t>
-      </w:r>
-      <w:r>
-        <w:t xml:space="preserve"> for each test parcel, the class probabilities of the two models are combined by a geometric mean or by a weighted arithmetic mean (weight 0.7 on XGBoost). </w:t>
-      </w:r>
-      <w:r>
-        <w:rPr>
-          <w:b/>
-        </w:rPr>
-        <w:t>(3) Decoding:</w:t>
-      </w:r>
-      <w:r>
-        <w:t xml:space="preserve"> log-space biases favor orchards and penalize the two meadow classes,</w:t>
-      </w:r>
-    </w:p>
-    <w:p>
-      <w:pPr>
-        <w:spacing w:before="80" w:after="120"/>
-        <w:jc w:val="center"/>
-      </w:pPr>
-      <w:r>
-        <w:rPr>
-          <w:i/>
-          <w:iCs/>
-        </w:rPr>
-        <w:t>ŷ = argmax_k [ log p_k + b_o · 1(k = orchard) − b_m · 1(k ∈ meadows) ],</w:t>
-      </w:r>
-    </w:p>
-    <w:p>
-      <w:pPr>
-        <w:spacing w:after="120" w:line="276" w:lineRule="auto"/>
-        <w:jc w:val="both"/>
-      </w:pPr>
-      <w:r>
-        <w:t xml:space="preserve">with b_o </w:t>
-      </w:r>
-      <w:r>
-        <w:rPr>
-          <w:rFonts w:ascii="Cambria Math" w:hAnsi="Cambria Math" w:cs="Cambria Math"/>
-        </w:rPr>
-        <w:t>∈</w:t>
-      </w:r>
-      <w:r>
-        <w:t xml:space="preserve"> {0, 0.5, …, 3} and b_m </w:t>
-      </w:r>
-      <w:r>
-        <w:rPr>
-          <w:rFonts w:ascii="Cambria Math" w:hAnsi="Cambria Math" w:cs="Cambria Math"/>
-        </w:rPr>
-        <w:t>∈</w:t>
-      </w:r>
-      <w:r>
-        <w:t xml:space="preserve"> {0, 0.25, 0.5, 0.75, 1, 1.5, 2}. With the two blends and three multipliers this gives 294 decoding configurations, which trace a family of operating points from accuracy-first to orchard-first. </w:t>
-      </w:r>
-      <w:r>
-        <w:rPr>
-          <w:b/>
-        </w:rPr>
-        <w:t>(4) Selection:</w:t>
-      </w:r>
-      <w:r>
-        <w:t xml:space="preserve"> one configuration per selection rule is chosen without using the labels of the parcels it is scored on (Section 4.2); its labels are the first output of the system. The grid is an operating-point dial rather than a source of accuracy: at the accuracy-first point every fold of every seed selects the weighted blend with m = 1 and no biases. The meta-classifier also passes the verifier an orchard score, the XGBoost probability at m = 1, which, unlike the blend, is cheap to recompute out of fold on the training regions (Section 3.5).</w:t>
-      </w:r>
-    </w:p>
-    <w:p>
-      <w:pPr>
-        <w:pStyle w:val="Heading2"/>
-        <w:keepNext/>
-      </w:pPr>
-      <w:r>
-        <w:t>3.5 Orchard verifier</w:t>
-      </w:r>
-    </w:p>
-    <w:p>
-      <w:pPr>
-        <w:spacing w:after="120" w:line="276" w:lineRule="auto"/>
-        <w:jc w:val="both"/>
-      </w:pPr>
-      <w:r>
-        <w:t xml:space="preserve">The second stage re-examines the parcels the meta-classifier considers possible orchards. To train it on candidates that look like test candidates, </w:t>
-      </w:r>
-      <w:r>
-        <w:t>we compute the meta-classifier's orchard scores out of fold on the training regions</w:t>
-      </w:r>
-      <w:r>
-        <w:t xml:space="preserve">: each training region is scored by a meta-classifier trained on the other two. The candidate threshold τ is the 10th percentile of these scores among training orchards, so 90% of training orchards become candidates. A binary XGBoost is trained on the training candidates (orchard versus rest) with 9 meta-classifier probabilities, the 15 phenology features, monthly means of the 10 bands and of NDVI, NDRE and NDMI over clear dates, parcel geometry (area, perimeter, compactness, elongation) and the context of the ten nearest parcels (mean and maximum orchard score, mean meadow score, mean distance). Parcels are then ranked with candidates first, ordered by the verifier's probability, followed by non-candidates, ordered by the meta orchard probability (in the implementation a candidate's score is 1 plus the verifier probability). A parcel is </w:t>
-      </w:r>
-      <w:r>
-        <w:t>labeled</w:t>
-      </w:r>
-      <w:r>
-        <w:t xml:space="preserve"> an orchard if its score passes a threshold chosen out of sample (Section 4.2); otherwise it receives the meta-classifier's most probable non-orchard class.</w:t>
       </w:r>
     </w:p>
     <w:p>
@@ -1780,6 +413,1373 @@
           <w:szCs w:val="20"/>
         </w:rPr>
         <w:t>The final pipeline. Four feature blocks (51 features) feed a gradient-boosted meta-classifier whose decode-time biases choose the operating point (output 1). Parcels whose meta orchard score passes the candidate threshold are re-scored by the orchard verifier (output 2).</w:t>
+      </w:r>
+    </w:p>
+    <w:p>
+      <w:pPr>
+        <w:pStyle w:val="Heading2"/>
+        <w:keepNext/>
+      </w:pPr>
+      <w:r>
+        <w:t>3.1 Data</w:t>
+      </w:r>
+    </w:p>
+    <w:p>
+      <w:pPr>
+        <w:spacing w:after="120" w:line="276" w:lineRule="auto"/>
+        <w:jc w:val="both"/>
+      </w:pPr>
+      <w:r>
+        <w:t>We use BreizhCrops (Rußwurm et al., 2020): 608,489 agricultural parcels of the 2017 season in the four départements of Brittany, France, frh01 (Côtes-d'Armor), frh02 (Finistère), frh03 (Ille-et-Vilaine) and frh04 (Morbihan). Each parcel has a crop label from the farmers' subsidy declarations (French Land Parcel Information System, Registre Parcellaire Graphique), mapped to nine classes; a polygon, from which we compute area, perimeter, shape and centroid; and two Sentinel-2 series of the reflectance averaged over the parcel: L1C (top of atmosphere, 13 bands) and L2A (surface reflectance from Sen2Cor, the 10 bands at 10 and 20 m, with a per-date cloud fraction). BreizhCrops also provides networks pretrained on the L1C series of frh01–frh03 and a reference transform that resamples each series to 45 dates. Like those networks, we train on frh01–frh03 (485,781 parcels) and test on frh04 (122,708 parcels; Table 1).</w:t>
+      </w:r>
+    </w:p>
+    <w:p>
+      <w:pPr>
+        <w:spacing w:after="120" w:line="276" w:lineRule="auto"/>
+        <w:jc w:val="both"/>
+      </w:pPr>
+      <w:r>
+        <w:t>Three properties of the data shape the method. First, the classes are highly imbalanced (Table 1): five classes cover 97% of the parcels; orchards make up 0.52% of the training and 0.45% of the test parcels, varying by region from 0.25% (frh02) to 0.73% (frh03); and sunflowers and nuts, with 2 and 11 test parcels, are too rare to evaluate. Second, the series are irregular and noisy: 85% of the test parcels have fewer than 45 dates (median 27, against 37–39 in the training regions, so the test region is observed less often), the L2A cloud fraction is above zero on 60–68% of the observations, and only 32–40% of the dates pass our clear-date test (Section 3.3). Third, the processing levels do not fully overlap: the pretrained networks need the L1C series, which we align to the L2A parcels by identifier, but 151 test and 394 training parcels have none, so their L1C-network features are set to missing.</w:t>
+      </w:r>
+    </w:p>
+    <w:p>
+      <w:pPr>
+        <w:keepNext/>
+        <w:spacing w:before="120" w:after="120" w:line="252" w:lineRule="auto"/>
+        <w:jc w:val="both"/>
+      </w:pPr>
+      <w:r>
+        <w:rPr>
+          <w:b/>
+          <w:sz w:val="20"/>
+        </w:rPr>
+        <w:t>Table 1.</w:t>
+      </w:r>
+      <w:r>
+        <w:rPr>
+          <w:sz w:val="20"/>
+        </w:rPr>
+        <w:t xml:space="preserve"> BreizhCrops classes in the training regions (frh01–frh03) and the test region (frh04): parcels and share of the region.</w:t>
+      </w:r>
+    </w:p>
+    <w:tbl>
+      <w:tblPr>
+        <w:tblW w:w="3527" w:type="pct"/>
+        <w:tblBorders>
+          <w:top w:val="single" w:sz="4" w:space="0" w:color="auto"/>
+          <w:left w:val="single" w:sz="4" w:space="0" w:color="auto"/>
+          <w:bottom w:val="single" w:sz="4" w:space="0" w:color="auto"/>
+          <w:right w:val="single" w:sz="4" w:space="0" w:color="auto"/>
+          <w:insideH w:val="single" w:sz="4" w:space="0" w:color="auto"/>
+          <w:insideV w:val="single" w:sz="4" w:space="0" w:color="auto"/>
+        </w:tblBorders>
+        <w:tblCellMar>
+          <w:left w:w="10" w:type="dxa"/>
+          <w:right w:w="10" w:type="dxa"/>
+        </w:tblCellMar>
+        <w:tblLook w:val="04A0" w:firstRow="1" w:lastRow="0" w:firstColumn="1" w:lastColumn="0" w:noHBand="0" w:noVBand="1"/>
+      </w:tblPr>
+      <w:tblGrid>
+        <w:gridCol w:w="2544"/>
+        <w:gridCol w:w="1908"/>
+        <w:gridCol w:w="1908"/>
+      </w:tblGrid>
+      <w:tr>
+        <w:trPr>
+          <w:tblHeader/>
+        </w:trPr>
+        <w:tc>
+          <w:tcPr>
+            <w:tcW w:w="2000" w:type="pct"/>
+            <w:tcBorders>
+              <w:top w:val="single" w:sz="4" w:space="0" w:color="999999"/>
+              <w:left w:val="single" w:sz="4" w:space="0" w:color="999999"/>
+              <w:bottom w:val="single" w:sz="4" w:space="0" w:color="999999"/>
+              <w:right w:val="single" w:sz="4" w:space="0" w:color="999999"/>
+            </w:tcBorders>
+            <w:shd w:val="clear" w:color="auto" w:fill="EDEDED"/>
+            <w:tcMar>
+              <w:top w:w="40" w:type="dxa"/>
+              <w:left w:w="80" w:type="dxa"/>
+              <w:bottom w:w="40" w:type="dxa"/>
+              <w:right w:w="80" w:type="dxa"/>
+            </w:tcMar>
+          </w:tcPr>
+          <w:p>
+            <w:r>
+              <w:rPr>
+                <w:b/>
+                <w:bCs/>
+                <w:sz w:val="18"/>
+                <w:szCs w:val="18"/>
+              </w:rPr>
+              <w:t>Class</w:t>
+            </w:r>
+          </w:p>
+        </w:tc>
+        <w:tc>
+          <w:tcPr>
+            <w:tcW w:w="1500" w:type="pct"/>
+            <w:tcBorders>
+              <w:top w:val="single" w:sz="4" w:space="0" w:color="999999"/>
+              <w:left w:val="single" w:sz="4" w:space="0" w:color="999999"/>
+              <w:bottom w:val="single" w:sz="4" w:space="0" w:color="999999"/>
+              <w:right w:val="single" w:sz="4" w:space="0" w:color="999999"/>
+            </w:tcBorders>
+            <w:shd w:val="clear" w:color="auto" w:fill="EDEDED"/>
+            <w:tcMar>
+              <w:top w:w="40" w:type="dxa"/>
+              <w:left w:w="80" w:type="dxa"/>
+              <w:bottom w:w="40" w:type="dxa"/>
+              <w:right w:w="80" w:type="dxa"/>
+            </w:tcMar>
+          </w:tcPr>
+          <w:p>
+            <w:pPr>
+              <w:jc w:val="right"/>
+            </w:pPr>
+            <w:r>
+              <w:rPr>
+                <w:b/>
+                <w:bCs/>
+                <w:sz w:val="18"/>
+                <w:szCs w:val="18"/>
+              </w:rPr>
+              <w:t>Training (frh01–frh03)</w:t>
+            </w:r>
+          </w:p>
+        </w:tc>
+        <w:tc>
+          <w:tcPr>
+            <w:tcW w:w="1500" w:type="pct"/>
+            <w:tcBorders>
+              <w:top w:val="single" w:sz="4" w:space="0" w:color="999999"/>
+              <w:left w:val="single" w:sz="4" w:space="0" w:color="999999"/>
+              <w:bottom w:val="single" w:sz="4" w:space="0" w:color="999999"/>
+              <w:right w:val="single" w:sz="4" w:space="0" w:color="999999"/>
+            </w:tcBorders>
+            <w:shd w:val="clear" w:color="auto" w:fill="EDEDED"/>
+            <w:tcMar>
+              <w:top w:w="40" w:type="dxa"/>
+              <w:left w:w="80" w:type="dxa"/>
+              <w:bottom w:w="40" w:type="dxa"/>
+              <w:right w:w="80" w:type="dxa"/>
+            </w:tcMar>
+          </w:tcPr>
+          <w:p>
+            <w:pPr>
+              <w:jc w:val="right"/>
+            </w:pPr>
+            <w:r>
+              <w:rPr>
+                <w:b/>
+                <w:bCs/>
+                <w:sz w:val="18"/>
+                <w:szCs w:val="18"/>
+              </w:rPr>
+              <w:t>Test (frh04)</w:t>
+            </w:r>
+          </w:p>
+        </w:tc>
+      </w:tr>
+      <w:tr>
+        <w:tc>
+          <w:tcPr>
+            <w:tcW w:w="2000" w:type="pct"/>
+            <w:tcBorders>
+              <w:top w:val="single" w:sz="4" w:space="0" w:color="999999"/>
+              <w:left w:val="single" w:sz="4" w:space="0" w:color="999999"/>
+              <w:bottom w:val="single" w:sz="4" w:space="0" w:color="999999"/>
+              <w:right w:val="single" w:sz="4" w:space="0" w:color="999999"/>
+            </w:tcBorders>
+            <w:tcMar>
+              <w:top w:w="40" w:type="dxa"/>
+              <w:left w:w="80" w:type="dxa"/>
+              <w:bottom w:w="40" w:type="dxa"/>
+              <w:right w:w="80" w:type="dxa"/>
+            </w:tcMar>
+          </w:tcPr>
+          <w:p>
+            <w:pPr>
+              <w:rPr>
+                <w:sz w:val="18"/>
+                <w:szCs w:val="18"/>
+              </w:rPr>
+            </w:pPr>
+            <w:r>
+              <w:rPr>
+                <w:sz w:val="18"/>
+                <w:szCs w:val="18"/>
+              </w:rPr>
+              <w:t>Barley</w:t>
+            </w:r>
+          </w:p>
+        </w:tc>
+        <w:tc>
+          <w:tcPr>
+            <w:tcW w:w="1500" w:type="pct"/>
+            <w:tcBorders>
+              <w:top w:val="single" w:sz="4" w:space="0" w:color="999999"/>
+              <w:left w:val="single" w:sz="4" w:space="0" w:color="999999"/>
+              <w:bottom w:val="single" w:sz="4" w:space="0" w:color="999999"/>
+              <w:right w:val="single" w:sz="4" w:space="0" w:color="999999"/>
+            </w:tcBorders>
+            <w:tcMar>
+              <w:top w:w="40" w:type="dxa"/>
+              <w:left w:w="80" w:type="dxa"/>
+              <w:bottom w:w="40" w:type="dxa"/>
+              <w:right w:w="80" w:type="dxa"/>
+            </w:tcMar>
+          </w:tcPr>
+          <w:p>
+            <w:pPr>
+              <w:jc w:val="right"/>
+              <w:rPr>
+                <w:sz w:val="18"/>
+                <w:szCs w:val="18"/>
+              </w:rPr>
+            </w:pPr>
+            <w:r>
+              <w:rPr>
+                <w:sz w:val="18"/>
+                <w:szCs w:val="18"/>
+              </w:rPr>
+              <w:t>30,941 (6.37%)</w:t>
+            </w:r>
+          </w:p>
+        </w:tc>
+        <w:tc>
+          <w:tcPr>
+            <w:tcW w:w="1500" w:type="pct"/>
+            <w:tcBorders>
+              <w:top w:val="single" w:sz="4" w:space="0" w:color="999999"/>
+              <w:left w:val="single" w:sz="4" w:space="0" w:color="999999"/>
+              <w:bottom w:val="single" w:sz="4" w:space="0" w:color="999999"/>
+              <w:right w:val="single" w:sz="4" w:space="0" w:color="999999"/>
+            </w:tcBorders>
+            <w:tcMar>
+              <w:top w:w="40" w:type="dxa"/>
+              <w:left w:w="80" w:type="dxa"/>
+              <w:bottom w:w="40" w:type="dxa"/>
+              <w:right w:w="80" w:type="dxa"/>
+            </w:tcMar>
+          </w:tcPr>
+          <w:p>
+            <w:pPr>
+              <w:jc w:val="right"/>
+              <w:rPr>
+                <w:sz w:val="18"/>
+                <w:szCs w:val="18"/>
+              </w:rPr>
+            </w:pPr>
+            <w:r>
+              <w:rPr>
+                <w:sz w:val="18"/>
+                <w:szCs w:val="18"/>
+              </w:rPr>
+              <w:t>5,981 (4.87%)</w:t>
+            </w:r>
+          </w:p>
+        </w:tc>
+      </w:tr>
+      <w:tr>
+        <w:tc>
+          <w:tcPr>
+            <w:tcW w:w="2000" w:type="pct"/>
+            <w:tcBorders>
+              <w:top w:val="single" w:sz="4" w:space="0" w:color="999999"/>
+              <w:left w:val="single" w:sz="4" w:space="0" w:color="999999"/>
+              <w:bottom w:val="single" w:sz="4" w:space="0" w:color="999999"/>
+              <w:right w:val="single" w:sz="4" w:space="0" w:color="999999"/>
+            </w:tcBorders>
+            <w:tcMar>
+              <w:top w:w="40" w:type="dxa"/>
+              <w:left w:w="80" w:type="dxa"/>
+              <w:bottom w:w="40" w:type="dxa"/>
+              <w:right w:w="80" w:type="dxa"/>
+            </w:tcMar>
+          </w:tcPr>
+          <w:p>
+            <w:pPr>
+              <w:rPr>
+                <w:sz w:val="18"/>
+                <w:szCs w:val="18"/>
+              </w:rPr>
+            </w:pPr>
+            <w:r>
+              <w:rPr>
+                <w:sz w:val="18"/>
+                <w:szCs w:val="18"/>
+              </w:rPr>
+              <w:t>Wheat</w:t>
+            </w:r>
+          </w:p>
+        </w:tc>
+        <w:tc>
+          <w:tcPr>
+            <w:tcW w:w="1500" w:type="pct"/>
+            <w:tcBorders>
+              <w:top w:val="single" w:sz="4" w:space="0" w:color="999999"/>
+              <w:left w:val="single" w:sz="4" w:space="0" w:color="999999"/>
+              <w:bottom w:val="single" w:sz="4" w:space="0" w:color="999999"/>
+              <w:right w:val="single" w:sz="4" w:space="0" w:color="999999"/>
+            </w:tcBorders>
+            <w:tcMar>
+              <w:top w:w="40" w:type="dxa"/>
+              <w:left w:w="80" w:type="dxa"/>
+              <w:bottom w:w="40" w:type="dxa"/>
+              <w:right w:w="80" w:type="dxa"/>
+            </w:tcMar>
+          </w:tcPr>
+          <w:p>
+            <w:pPr>
+              <w:jc w:val="right"/>
+              <w:rPr>
+                <w:sz w:val="18"/>
+                <w:szCs w:val="18"/>
+              </w:rPr>
+            </w:pPr>
+            <w:r>
+              <w:rPr>
+                <w:sz w:val="18"/>
+                <w:szCs w:val="18"/>
+              </w:rPr>
+              <w:t>72,608 (14.95%)</w:t>
+            </w:r>
+          </w:p>
+        </w:tc>
+        <w:tc>
+          <w:tcPr>
+            <w:tcW w:w="1500" w:type="pct"/>
+            <w:tcBorders>
+              <w:top w:val="single" w:sz="4" w:space="0" w:color="999999"/>
+              <w:left w:val="single" w:sz="4" w:space="0" w:color="999999"/>
+              <w:bottom w:val="single" w:sz="4" w:space="0" w:color="999999"/>
+              <w:right w:val="single" w:sz="4" w:space="0" w:color="999999"/>
+            </w:tcBorders>
+            <w:tcMar>
+              <w:top w:w="40" w:type="dxa"/>
+              <w:left w:w="80" w:type="dxa"/>
+              <w:bottom w:w="40" w:type="dxa"/>
+              <w:right w:w="80" w:type="dxa"/>
+            </w:tcMar>
+          </w:tcPr>
+          <w:p>
+            <w:pPr>
+              <w:jc w:val="right"/>
+              <w:rPr>
+                <w:sz w:val="18"/>
+                <w:szCs w:val="18"/>
+              </w:rPr>
+            </w:pPr>
+            <w:r>
+              <w:rPr>
+                <w:sz w:val="18"/>
+                <w:szCs w:val="18"/>
+              </w:rPr>
+              <w:t>17,009 (13.86%)</w:t>
+            </w:r>
+          </w:p>
+        </w:tc>
+      </w:tr>
+      <w:tr>
+        <w:tc>
+          <w:tcPr>
+            <w:tcW w:w="2000" w:type="pct"/>
+            <w:tcBorders>
+              <w:top w:val="single" w:sz="4" w:space="0" w:color="999999"/>
+              <w:left w:val="single" w:sz="4" w:space="0" w:color="999999"/>
+              <w:bottom w:val="single" w:sz="4" w:space="0" w:color="999999"/>
+              <w:right w:val="single" w:sz="4" w:space="0" w:color="999999"/>
+            </w:tcBorders>
+            <w:tcMar>
+              <w:top w:w="40" w:type="dxa"/>
+              <w:left w:w="80" w:type="dxa"/>
+              <w:bottom w:w="40" w:type="dxa"/>
+              <w:right w:w="80" w:type="dxa"/>
+            </w:tcMar>
+          </w:tcPr>
+          <w:p>
+            <w:pPr>
+              <w:rPr>
+                <w:sz w:val="18"/>
+                <w:szCs w:val="18"/>
+              </w:rPr>
+            </w:pPr>
+            <w:r>
+              <w:rPr>
+                <w:sz w:val="18"/>
+                <w:szCs w:val="18"/>
+              </w:rPr>
+              <w:t>Rapeseed</w:t>
+            </w:r>
+          </w:p>
+        </w:tc>
+        <w:tc>
+          <w:tcPr>
+            <w:tcW w:w="1500" w:type="pct"/>
+            <w:tcBorders>
+              <w:top w:val="single" w:sz="4" w:space="0" w:color="999999"/>
+              <w:left w:val="single" w:sz="4" w:space="0" w:color="999999"/>
+              <w:bottom w:val="single" w:sz="4" w:space="0" w:color="999999"/>
+              <w:right w:val="single" w:sz="4" w:space="0" w:color="999999"/>
+            </w:tcBorders>
+            <w:tcMar>
+              <w:top w:w="40" w:type="dxa"/>
+              <w:left w:w="80" w:type="dxa"/>
+              <w:bottom w:w="40" w:type="dxa"/>
+              <w:right w:w="80" w:type="dxa"/>
+            </w:tcMar>
+          </w:tcPr>
+          <w:p>
+            <w:pPr>
+              <w:jc w:val="right"/>
+              <w:rPr>
+                <w:sz w:val="18"/>
+                <w:szCs w:val="18"/>
+              </w:rPr>
+            </w:pPr>
+            <w:r>
+              <w:rPr>
+                <w:sz w:val="18"/>
+                <w:szCs w:val="18"/>
+              </w:rPr>
+              <w:t>11,502 (2.37%)</w:t>
+            </w:r>
+          </w:p>
+        </w:tc>
+        <w:tc>
+          <w:tcPr>
+            <w:tcW w:w="1500" w:type="pct"/>
+            <w:tcBorders>
+              <w:top w:val="single" w:sz="4" w:space="0" w:color="999999"/>
+              <w:left w:val="single" w:sz="4" w:space="0" w:color="999999"/>
+              <w:bottom w:val="single" w:sz="4" w:space="0" w:color="999999"/>
+              <w:right w:val="single" w:sz="4" w:space="0" w:color="999999"/>
+            </w:tcBorders>
+            <w:tcMar>
+              <w:top w:w="40" w:type="dxa"/>
+              <w:left w:w="80" w:type="dxa"/>
+              <w:bottom w:w="40" w:type="dxa"/>
+              <w:right w:w="80" w:type="dxa"/>
+            </w:tcMar>
+          </w:tcPr>
+          <w:p>
+            <w:pPr>
+              <w:jc w:val="right"/>
+              <w:rPr>
+                <w:sz w:val="18"/>
+                <w:szCs w:val="18"/>
+              </w:rPr>
+            </w:pPr>
+            <w:r>
+              <w:rPr>
+                <w:sz w:val="18"/>
+                <w:szCs w:val="18"/>
+              </w:rPr>
+              <w:t>3,244 (2.64%)</w:t>
+            </w:r>
+          </w:p>
+        </w:tc>
+      </w:tr>
+      <w:tr>
+        <w:tc>
+          <w:tcPr>
+            <w:tcW w:w="2000" w:type="pct"/>
+            <w:tcBorders>
+              <w:top w:val="single" w:sz="4" w:space="0" w:color="999999"/>
+              <w:left w:val="single" w:sz="4" w:space="0" w:color="999999"/>
+              <w:bottom w:val="single" w:sz="4" w:space="0" w:color="999999"/>
+              <w:right w:val="single" w:sz="4" w:space="0" w:color="999999"/>
+            </w:tcBorders>
+            <w:tcMar>
+              <w:top w:w="40" w:type="dxa"/>
+              <w:left w:w="80" w:type="dxa"/>
+              <w:bottom w:w="40" w:type="dxa"/>
+              <w:right w:w="80" w:type="dxa"/>
+            </w:tcMar>
+          </w:tcPr>
+          <w:p>
+            <w:pPr>
+              <w:rPr>
+                <w:sz w:val="18"/>
+                <w:szCs w:val="18"/>
+              </w:rPr>
+            </w:pPr>
+            <w:r>
+              <w:rPr>
+                <w:sz w:val="18"/>
+                <w:szCs w:val="18"/>
+              </w:rPr>
+              <w:t>Corn</w:t>
+            </w:r>
+          </w:p>
+        </w:tc>
+        <w:tc>
+          <w:tcPr>
+            <w:tcW w:w="1500" w:type="pct"/>
+            <w:tcBorders>
+              <w:top w:val="single" w:sz="4" w:space="0" w:color="999999"/>
+              <w:left w:val="single" w:sz="4" w:space="0" w:color="999999"/>
+              <w:bottom w:val="single" w:sz="4" w:space="0" w:color="999999"/>
+              <w:right w:val="single" w:sz="4" w:space="0" w:color="999999"/>
+            </w:tcBorders>
+            <w:tcMar>
+              <w:top w:w="40" w:type="dxa"/>
+              <w:left w:w="80" w:type="dxa"/>
+              <w:bottom w:w="40" w:type="dxa"/>
+              <w:right w:w="80" w:type="dxa"/>
+            </w:tcMar>
+          </w:tcPr>
+          <w:p>
+            <w:pPr>
+              <w:jc w:val="right"/>
+              <w:rPr>
+                <w:sz w:val="18"/>
+                <w:szCs w:val="18"/>
+              </w:rPr>
+            </w:pPr>
+            <w:r>
+              <w:rPr>
+                <w:sz w:val="18"/>
+                <w:szCs w:val="18"/>
+              </w:rPr>
+              <w:t>122,634 (25.24%)</w:t>
+            </w:r>
+          </w:p>
+        </w:tc>
+        <w:tc>
+          <w:tcPr>
+            <w:tcW w:w="1500" w:type="pct"/>
+            <w:tcBorders>
+              <w:top w:val="single" w:sz="4" w:space="0" w:color="999999"/>
+              <w:left w:val="single" w:sz="4" w:space="0" w:color="999999"/>
+              <w:bottom w:val="single" w:sz="4" w:space="0" w:color="999999"/>
+              <w:right w:val="single" w:sz="4" w:space="0" w:color="999999"/>
+            </w:tcBorders>
+            <w:tcMar>
+              <w:top w:w="40" w:type="dxa"/>
+              <w:left w:w="80" w:type="dxa"/>
+              <w:bottom w:w="40" w:type="dxa"/>
+              <w:right w:w="80" w:type="dxa"/>
+            </w:tcMar>
+          </w:tcPr>
+          <w:p>
+            <w:pPr>
+              <w:jc w:val="right"/>
+              <w:rPr>
+                <w:sz w:val="18"/>
+                <w:szCs w:val="18"/>
+              </w:rPr>
+            </w:pPr>
+            <w:r>
+              <w:rPr>
+                <w:sz w:val="18"/>
+                <w:szCs w:val="18"/>
+              </w:rPr>
+              <w:t>31,361 (25.56%)</w:t>
+            </w:r>
+          </w:p>
+        </w:tc>
+      </w:tr>
+      <w:tr>
+        <w:tc>
+          <w:tcPr>
+            <w:tcW w:w="2000" w:type="pct"/>
+            <w:tcBorders>
+              <w:top w:val="single" w:sz="4" w:space="0" w:color="999999"/>
+              <w:left w:val="single" w:sz="4" w:space="0" w:color="999999"/>
+              <w:bottom w:val="single" w:sz="4" w:space="0" w:color="999999"/>
+              <w:right w:val="single" w:sz="4" w:space="0" w:color="999999"/>
+            </w:tcBorders>
+            <w:tcMar>
+              <w:top w:w="40" w:type="dxa"/>
+              <w:left w:w="80" w:type="dxa"/>
+              <w:bottom w:w="40" w:type="dxa"/>
+              <w:right w:w="80" w:type="dxa"/>
+            </w:tcMar>
+          </w:tcPr>
+          <w:p>
+            <w:r>
+              <w:rPr>
+                <w:sz w:val="18"/>
+                <w:szCs w:val="18"/>
+              </w:rPr>
+              <w:t>Sunflower</w:t>
+            </w:r>
+          </w:p>
+        </w:tc>
+        <w:tc>
+          <w:tcPr>
+            <w:tcW w:w="1500" w:type="pct"/>
+            <w:tcBorders>
+              <w:top w:val="single" w:sz="4" w:space="0" w:color="999999"/>
+              <w:left w:val="single" w:sz="4" w:space="0" w:color="999999"/>
+              <w:bottom w:val="single" w:sz="4" w:space="0" w:color="999999"/>
+              <w:right w:val="single" w:sz="4" w:space="0" w:color="999999"/>
+            </w:tcBorders>
+            <w:tcMar>
+              <w:top w:w="40" w:type="dxa"/>
+              <w:left w:w="80" w:type="dxa"/>
+              <w:bottom w:w="40" w:type="dxa"/>
+              <w:right w:w="80" w:type="dxa"/>
+            </w:tcMar>
+          </w:tcPr>
+          <w:p>
+            <w:pPr>
+              <w:jc w:val="right"/>
+            </w:pPr>
+            <w:r>
+              <w:rPr>
+                <w:sz w:val="18"/>
+                <w:szCs w:val="18"/>
+              </w:rPr>
+              <w:t>17 (&lt;0.01%)</w:t>
+            </w:r>
+          </w:p>
+        </w:tc>
+        <w:tc>
+          <w:tcPr>
+            <w:tcW w:w="1500" w:type="pct"/>
+            <w:tcBorders>
+              <w:top w:val="single" w:sz="4" w:space="0" w:color="999999"/>
+              <w:left w:val="single" w:sz="4" w:space="0" w:color="999999"/>
+              <w:bottom w:val="single" w:sz="4" w:space="0" w:color="999999"/>
+              <w:right w:val="single" w:sz="4" w:space="0" w:color="999999"/>
+            </w:tcBorders>
+            <w:tcMar>
+              <w:top w:w="40" w:type="dxa"/>
+              <w:left w:w="80" w:type="dxa"/>
+              <w:bottom w:w="40" w:type="dxa"/>
+              <w:right w:w="80" w:type="dxa"/>
+            </w:tcMar>
+          </w:tcPr>
+          <w:p>
+            <w:pPr>
+              <w:jc w:val="right"/>
+            </w:pPr>
+            <w:r>
+              <w:rPr>
+                <w:sz w:val="18"/>
+                <w:szCs w:val="18"/>
+              </w:rPr>
+              <w:t>2 (&lt;0.01%)</w:t>
+            </w:r>
+          </w:p>
+        </w:tc>
+      </w:tr>
+      <w:tr>
+        <w:tc>
+          <w:tcPr>
+            <w:tcW w:w="2000" w:type="pct"/>
+            <w:tcBorders>
+              <w:top w:val="single" w:sz="4" w:space="0" w:color="999999"/>
+              <w:left w:val="single" w:sz="4" w:space="0" w:color="999999"/>
+              <w:bottom w:val="single" w:sz="4" w:space="0" w:color="999999"/>
+              <w:right w:val="single" w:sz="4" w:space="0" w:color="999999"/>
+            </w:tcBorders>
+            <w:tcMar>
+              <w:top w:w="40" w:type="dxa"/>
+              <w:left w:w="80" w:type="dxa"/>
+              <w:bottom w:w="40" w:type="dxa"/>
+              <w:right w:w="80" w:type="dxa"/>
+            </w:tcMar>
+          </w:tcPr>
+          <w:p>
+            <w:r>
+              <w:rPr>
+                <w:sz w:val="18"/>
+                <w:szCs w:val="18"/>
+              </w:rPr>
+              <w:t>Orchards</w:t>
+            </w:r>
+          </w:p>
+        </w:tc>
+        <w:tc>
+          <w:tcPr>
+            <w:tcW w:w="1500" w:type="pct"/>
+            <w:tcBorders>
+              <w:top w:val="single" w:sz="4" w:space="0" w:color="999999"/>
+              <w:left w:val="single" w:sz="4" w:space="0" w:color="999999"/>
+              <w:bottom w:val="single" w:sz="4" w:space="0" w:color="999999"/>
+              <w:right w:val="single" w:sz="4" w:space="0" w:color="999999"/>
+            </w:tcBorders>
+            <w:tcMar>
+              <w:top w:w="40" w:type="dxa"/>
+              <w:left w:w="80" w:type="dxa"/>
+              <w:bottom w:w="40" w:type="dxa"/>
+              <w:right w:w="80" w:type="dxa"/>
+            </w:tcMar>
+          </w:tcPr>
+          <w:p>
+            <w:pPr>
+              <w:jc w:val="right"/>
+            </w:pPr>
+            <w:r>
+              <w:rPr>
+                <w:sz w:val="18"/>
+                <w:szCs w:val="18"/>
+              </w:rPr>
+              <w:t>2,502 (0.52%)</w:t>
+            </w:r>
+          </w:p>
+        </w:tc>
+        <w:tc>
+          <w:tcPr>
+            <w:tcW w:w="1500" w:type="pct"/>
+            <w:tcBorders>
+              <w:top w:val="single" w:sz="4" w:space="0" w:color="999999"/>
+              <w:left w:val="single" w:sz="4" w:space="0" w:color="999999"/>
+              <w:bottom w:val="single" w:sz="4" w:space="0" w:color="999999"/>
+              <w:right w:val="single" w:sz="4" w:space="0" w:color="999999"/>
+            </w:tcBorders>
+            <w:tcMar>
+              <w:top w:w="40" w:type="dxa"/>
+              <w:left w:w="80" w:type="dxa"/>
+              <w:bottom w:w="40" w:type="dxa"/>
+              <w:right w:w="80" w:type="dxa"/>
+            </w:tcMar>
+          </w:tcPr>
+          <w:p>
+            <w:pPr>
+              <w:jc w:val="right"/>
+            </w:pPr>
+            <w:r>
+              <w:rPr>
+                <w:sz w:val="18"/>
+                <w:szCs w:val="18"/>
+              </w:rPr>
+              <w:t>552 (0.45%)</w:t>
+            </w:r>
+          </w:p>
+        </w:tc>
+      </w:tr>
+      <w:tr>
+        <w:tc>
+          <w:tcPr>
+            <w:tcW w:w="2000" w:type="pct"/>
+            <w:tcBorders>
+              <w:top w:val="single" w:sz="4" w:space="0" w:color="999999"/>
+              <w:left w:val="single" w:sz="4" w:space="0" w:color="999999"/>
+              <w:bottom w:val="single" w:sz="4" w:space="0" w:color="999999"/>
+              <w:right w:val="single" w:sz="4" w:space="0" w:color="999999"/>
+            </w:tcBorders>
+            <w:tcMar>
+              <w:top w:w="40" w:type="dxa"/>
+              <w:left w:w="80" w:type="dxa"/>
+              <w:bottom w:w="40" w:type="dxa"/>
+              <w:right w:w="80" w:type="dxa"/>
+            </w:tcMar>
+          </w:tcPr>
+          <w:p>
+            <w:r>
+              <w:rPr>
+                <w:sz w:val="18"/>
+                <w:szCs w:val="18"/>
+              </w:rPr>
+              <w:t>Nuts</w:t>
+            </w:r>
+          </w:p>
+        </w:tc>
+        <w:tc>
+          <w:tcPr>
+            <w:tcW w:w="1500" w:type="pct"/>
+            <w:tcBorders>
+              <w:top w:val="single" w:sz="4" w:space="0" w:color="999999"/>
+              <w:left w:val="single" w:sz="4" w:space="0" w:color="999999"/>
+              <w:bottom w:val="single" w:sz="4" w:space="0" w:color="999999"/>
+              <w:right w:val="single" w:sz="4" w:space="0" w:color="999999"/>
+            </w:tcBorders>
+            <w:tcMar>
+              <w:top w:w="40" w:type="dxa"/>
+              <w:left w:w="80" w:type="dxa"/>
+              <w:bottom w:w="40" w:type="dxa"/>
+              <w:right w:w="80" w:type="dxa"/>
+            </w:tcMar>
+          </w:tcPr>
+          <w:p>
+            <w:pPr>
+              <w:jc w:val="right"/>
+            </w:pPr>
+            <w:r>
+              <w:rPr>
+                <w:sz w:val="18"/>
+                <w:szCs w:val="18"/>
+              </w:rPr>
+              <w:t>38 (0.01%)</w:t>
+            </w:r>
+          </w:p>
+        </w:tc>
+        <w:tc>
+          <w:tcPr>
+            <w:tcW w:w="1500" w:type="pct"/>
+            <w:tcBorders>
+              <w:top w:val="single" w:sz="4" w:space="0" w:color="999999"/>
+              <w:left w:val="single" w:sz="4" w:space="0" w:color="999999"/>
+              <w:bottom w:val="single" w:sz="4" w:space="0" w:color="999999"/>
+              <w:right w:val="single" w:sz="4" w:space="0" w:color="999999"/>
+            </w:tcBorders>
+            <w:tcMar>
+              <w:top w:w="40" w:type="dxa"/>
+              <w:left w:w="80" w:type="dxa"/>
+              <w:bottom w:w="40" w:type="dxa"/>
+              <w:right w:w="80" w:type="dxa"/>
+            </w:tcMar>
+          </w:tcPr>
+          <w:p>
+            <w:pPr>
+              <w:jc w:val="right"/>
+            </w:pPr>
+            <w:r>
+              <w:rPr>
+                <w:sz w:val="18"/>
+                <w:szCs w:val="18"/>
+              </w:rPr>
+              <w:t>11 (0.01%)</w:t>
+            </w:r>
+          </w:p>
+        </w:tc>
+      </w:tr>
+      <w:tr>
+        <w:tc>
+          <w:tcPr>
+            <w:tcW w:w="2000" w:type="pct"/>
+            <w:tcBorders>
+              <w:top w:val="single" w:sz="4" w:space="0" w:color="999999"/>
+              <w:left w:val="single" w:sz="4" w:space="0" w:color="999999"/>
+              <w:bottom w:val="single" w:sz="4" w:space="0" w:color="999999"/>
+              <w:right w:val="single" w:sz="4" w:space="0" w:color="999999"/>
+            </w:tcBorders>
+            <w:tcMar>
+              <w:top w:w="40" w:type="dxa"/>
+              <w:left w:w="80" w:type="dxa"/>
+              <w:bottom w:w="40" w:type="dxa"/>
+              <w:right w:w="80" w:type="dxa"/>
+            </w:tcMar>
+          </w:tcPr>
+          <w:p>
+            <w:r>
+              <w:rPr>
+                <w:sz w:val="18"/>
+                <w:szCs w:val="18"/>
+              </w:rPr>
+              <w:t>Permanent meadows</w:t>
+            </w:r>
+          </w:p>
+        </w:tc>
+        <w:tc>
+          <w:tcPr>
+            <w:tcW w:w="1500" w:type="pct"/>
+            <w:tcBorders>
+              <w:top w:val="single" w:sz="4" w:space="0" w:color="999999"/>
+              <w:left w:val="single" w:sz="4" w:space="0" w:color="999999"/>
+              <w:bottom w:val="single" w:sz="4" w:space="0" w:color="999999"/>
+              <w:right w:val="single" w:sz="4" w:space="0" w:color="999999"/>
+            </w:tcBorders>
+            <w:tcMar>
+              <w:top w:w="40" w:type="dxa"/>
+              <w:left w:w="80" w:type="dxa"/>
+              <w:bottom w:w="40" w:type="dxa"/>
+              <w:right w:w="80" w:type="dxa"/>
+            </w:tcMar>
+          </w:tcPr>
+          <w:p>
+            <w:pPr>
+              <w:jc w:val="right"/>
+            </w:pPr>
+            <w:r>
+              <w:rPr>
+                <w:sz w:val="18"/>
+                <w:szCs w:val="18"/>
+              </w:rPr>
+              <w:t>101,701 (20.94%)</w:t>
+            </w:r>
+          </w:p>
+        </w:tc>
+        <w:tc>
+          <w:tcPr>
+            <w:tcW w:w="1500" w:type="pct"/>
+            <w:tcBorders>
+              <w:top w:val="single" w:sz="4" w:space="0" w:color="999999"/>
+              <w:left w:val="single" w:sz="4" w:space="0" w:color="999999"/>
+              <w:bottom w:val="single" w:sz="4" w:space="0" w:color="999999"/>
+              <w:right w:val="single" w:sz="4" w:space="0" w:color="999999"/>
+            </w:tcBorders>
+            <w:tcMar>
+              <w:top w:w="40" w:type="dxa"/>
+              <w:left w:w="80" w:type="dxa"/>
+              <w:bottom w:w="40" w:type="dxa"/>
+              <w:right w:w="80" w:type="dxa"/>
+            </w:tcMar>
+          </w:tcPr>
+          <w:p>
+            <w:pPr>
+              <w:jc w:val="right"/>
+            </w:pPr>
+            <w:r>
+              <w:rPr>
+                <w:sz w:val="18"/>
+                <w:szCs w:val="18"/>
+              </w:rPr>
+              <w:t>26,134 (21.30%)</w:t>
+            </w:r>
+          </w:p>
+        </w:tc>
+      </w:tr>
+      <w:tr>
+        <w:tc>
+          <w:tcPr>
+            <w:tcW w:w="2000" w:type="pct"/>
+            <w:tcBorders>
+              <w:top w:val="single" w:sz="4" w:space="0" w:color="999999"/>
+              <w:left w:val="single" w:sz="4" w:space="0" w:color="999999"/>
+              <w:bottom w:val="single" w:sz="4" w:space="0" w:color="999999"/>
+              <w:right w:val="single" w:sz="4" w:space="0" w:color="999999"/>
+            </w:tcBorders>
+            <w:tcMar>
+              <w:top w:w="40" w:type="dxa"/>
+              <w:left w:w="80" w:type="dxa"/>
+              <w:bottom w:w="40" w:type="dxa"/>
+              <w:right w:w="80" w:type="dxa"/>
+            </w:tcMar>
+          </w:tcPr>
+          <w:p>
+            <w:r>
+              <w:rPr>
+                <w:sz w:val="18"/>
+                <w:szCs w:val="18"/>
+              </w:rPr>
+              <w:t>Temporary meadows</w:t>
+            </w:r>
+          </w:p>
+        </w:tc>
+        <w:tc>
+          <w:tcPr>
+            <w:tcW w:w="1500" w:type="pct"/>
+            <w:tcBorders>
+              <w:top w:val="single" w:sz="4" w:space="0" w:color="999999"/>
+              <w:left w:val="single" w:sz="4" w:space="0" w:color="999999"/>
+              <w:bottom w:val="single" w:sz="4" w:space="0" w:color="999999"/>
+              <w:right w:val="single" w:sz="4" w:space="0" w:color="999999"/>
+            </w:tcBorders>
+            <w:tcMar>
+              <w:top w:w="40" w:type="dxa"/>
+              <w:left w:w="80" w:type="dxa"/>
+              <w:bottom w:w="40" w:type="dxa"/>
+              <w:right w:w="80" w:type="dxa"/>
+            </w:tcMar>
+          </w:tcPr>
+          <w:p>
+            <w:pPr>
+              <w:jc w:val="right"/>
+            </w:pPr>
+            <w:r>
+              <w:rPr>
+                <w:sz w:val="18"/>
+                <w:szCs w:val="18"/>
+              </w:rPr>
+              <w:t>143,838 (29.61%)</w:t>
+            </w:r>
+          </w:p>
+        </w:tc>
+        <w:tc>
+          <w:tcPr>
+            <w:tcW w:w="1500" w:type="pct"/>
+            <w:tcBorders>
+              <w:top w:val="single" w:sz="4" w:space="0" w:color="999999"/>
+              <w:left w:val="single" w:sz="4" w:space="0" w:color="999999"/>
+              <w:bottom w:val="single" w:sz="4" w:space="0" w:color="999999"/>
+              <w:right w:val="single" w:sz="4" w:space="0" w:color="999999"/>
+            </w:tcBorders>
+            <w:tcMar>
+              <w:top w:w="40" w:type="dxa"/>
+              <w:left w:w="80" w:type="dxa"/>
+              <w:bottom w:w="40" w:type="dxa"/>
+              <w:right w:w="80" w:type="dxa"/>
+            </w:tcMar>
+          </w:tcPr>
+          <w:p>
+            <w:pPr>
+              <w:jc w:val="right"/>
+            </w:pPr>
+            <w:r>
+              <w:rPr>
+                <w:sz w:val="18"/>
+                <w:szCs w:val="18"/>
+              </w:rPr>
+              <w:t>38,414 (31.31%)</w:t>
+            </w:r>
+          </w:p>
+        </w:tc>
+      </w:tr>
+      <w:tr>
+        <w:tc>
+          <w:tcPr>
+            <w:tcW w:w="2000" w:type="pct"/>
+            <w:tcBorders>
+              <w:top w:val="single" w:sz="4" w:space="0" w:color="999999"/>
+              <w:left w:val="single" w:sz="4" w:space="0" w:color="999999"/>
+              <w:bottom w:val="single" w:sz="4" w:space="0" w:color="999999"/>
+              <w:right w:val="single" w:sz="4" w:space="0" w:color="999999"/>
+            </w:tcBorders>
+            <w:tcMar>
+              <w:top w:w="40" w:type="dxa"/>
+              <w:left w:w="80" w:type="dxa"/>
+              <w:bottom w:w="40" w:type="dxa"/>
+              <w:right w:w="80" w:type="dxa"/>
+            </w:tcMar>
+          </w:tcPr>
+          <w:p>
+            <w:r>
+              <w:rPr>
+                <w:sz w:val="18"/>
+                <w:szCs w:val="18"/>
+              </w:rPr>
+              <w:t>Total</w:t>
+            </w:r>
+          </w:p>
+        </w:tc>
+        <w:tc>
+          <w:tcPr>
+            <w:tcW w:w="1500" w:type="pct"/>
+            <w:tcBorders>
+              <w:top w:val="single" w:sz="4" w:space="0" w:color="999999"/>
+              <w:left w:val="single" w:sz="4" w:space="0" w:color="999999"/>
+              <w:bottom w:val="single" w:sz="4" w:space="0" w:color="999999"/>
+              <w:right w:val="single" w:sz="4" w:space="0" w:color="999999"/>
+            </w:tcBorders>
+            <w:tcMar>
+              <w:top w:w="40" w:type="dxa"/>
+              <w:left w:w="80" w:type="dxa"/>
+              <w:bottom w:w="40" w:type="dxa"/>
+              <w:right w:w="80" w:type="dxa"/>
+            </w:tcMar>
+          </w:tcPr>
+          <w:p>
+            <w:pPr>
+              <w:jc w:val="right"/>
+            </w:pPr>
+            <w:r>
+              <w:rPr>
+                <w:sz w:val="18"/>
+                <w:szCs w:val="18"/>
+              </w:rPr>
+              <w:t>485,781</w:t>
+            </w:r>
+          </w:p>
+        </w:tc>
+        <w:tc>
+          <w:tcPr>
+            <w:tcW w:w="1500" w:type="pct"/>
+            <w:tcBorders>
+              <w:top w:val="single" w:sz="4" w:space="0" w:color="999999"/>
+              <w:left w:val="single" w:sz="4" w:space="0" w:color="999999"/>
+              <w:bottom w:val="single" w:sz="4" w:space="0" w:color="999999"/>
+              <w:right w:val="single" w:sz="4" w:space="0" w:color="999999"/>
+            </w:tcBorders>
+            <w:tcMar>
+              <w:top w:w="40" w:type="dxa"/>
+              <w:left w:w="80" w:type="dxa"/>
+              <w:bottom w:w="40" w:type="dxa"/>
+              <w:right w:w="80" w:type="dxa"/>
+            </w:tcMar>
+          </w:tcPr>
+          <w:p>
+            <w:pPr>
+              <w:jc w:val="right"/>
+            </w:pPr>
+            <w:r>
+              <w:rPr>
+                <w:sz w:val="18"/>
+                <w:szCs w:val="18"/>
+              </w:rPr>
+              <w:t>122,708</w:t>
+            </w:r>
+          </w:p>
+        </w:tc>
+      </w:tr>
+    </w:tbl>
+    <w:p>
+      <w:pPr>
+        <w:spacing w:after="80"/>
+      </w:pPr>
+    </w:p>
+    <w:p>
+      <w:pPr>
+        <w:pStyle w:val="Heading2"/>
+        <w:keepNext/>
+      </w:pPr>
+      <w:r>
+        <w:t xml:space="preserve">3.2 </w:t>
+      </w:r>
+      <w:r>
+        <w:t>Multi-view inference</w:t>
+      </w:r>
+    </w:p>
+    <w:p>
+      <w:pPr>
+        <w:spacing w:after="120" w:line="276" w:lineRule="auto"/>
+        <w:jc w:val="both"/>
+      </w:pPr>
+      <w:r>
+        <w:t>Because most series are shorter than 45 dates, the BreizhCrops reference transform randomly resamples each series to 45 dates; zero-padding instead would create out-of-distribution inputs (Section 4.4). To reduce the variance of random resampling at test time, we feed every network the mean over eight seeded, resampled 45-date views, a form of test-time augmentation (Shanmugam et al., 2021).</w:t>
+      </w:r>
+    </w:p>
+    <w:p>
+      <w:pPr>
+        <w:pStyle w:val="Heading2"/>
+        <w:keepNext/>
+        <w:jc w:val="both"/>
+      </w:pPr>
+      <w:r>
+        <w:t>3.3 Feature blocks</w:t>
+      </w:r>
+    </w:p>
+    <w:p>
+      <w:pPr>
+        <w:spacing w:after="120" w:line="276" w:lineRule="auto"/>
+        <w:jc w:val="both"/>
+      </w:pPr>
+      <w:r>
+        <w:t>The meta-classifier sees 51 features per parcel, in four blocks (Fig. 1):</w:t>
+      </w:r>
+    </w:p>
+    <w:p>
+      <w:pPr>
+        <w:pStyle w:val="ListParagraph"/>
+        <w:numPr>
+          <w:ilvl w:val="0"/>
+          <w:numId w:val="3"/>
+        </w:numPr>
+        <w:spacing w:after="60" w:line="276" w:lineRule="auto"/>
+        <w:jc w:val="both"/>
+      </w:pPr>
+      <w:r>
+        <w:rPr>
+          <w:b/>
+          <w:bCs/>
+        </w:rPr>
+        <w:t>Parcel metadata (8):</w:t>
+      </w:r>
+      <w:r>
+        <w:t xml:space="preserve"> log area, maximum NDVI, NDVI amplitude, centroid latitude, mean and standard deviation of the </w:t>
+      </w:r>
+      <w:r>
+        <w:t>normalized</w:t>
+      </w:r>
+      <w:r>
+        <w:t xml:space="preserve"> acquisition day of year, the day of year of the NDVI maximum, and the log number of valid observations.</w:t>
+      </w:r>
+    </w:p>
+    <w:p>
+      <w:pPr>
+        <w:pStyle w:val="ListParagraph"/>
+        <w:numPr>
+          <w:ilvl w:val="0"/>
+          <w:numId w:val="3"/>
+        </w:numPr>
+        <w:spacing w:after="60" w:line="276" w:lineRule="auto"/>
+        <w:jc w:val="both"/>
+      </w:pPr>
+      <w:r>
+        <w:rPr>
+          <w:b/>
+          <w:bCs/>
+        </w:rPr>
+        <w:t>Phenology (15):</w:t>
+      </w:r>
+      <w:r>
+        <w:t xml:space="preserve"> computed from cloud-free dates only: seasonal NDVI means and the winter minimum, NDVI spread, the summer-minus-winter contrast, mowing-like NDVI drops between April and September, spring and summer red-edge (NDRE) and moisture (NDMI) means, the number of clear dates, and parcel compactness. On frh04 the strongest single features separate orchards from meadows </w:t>
+      </w:r>
+      <w:r>
+        <w:t>with a separability of 0.74 (spring NDMI), 0.72 (spring NDVI) and 0.70 (largest summer NDVI drop), where separability is max(AUROC, 1 − AUROC) and AUROC is the area under the ROC curve;</w:t>
+      </w:r>
+      <w:r>
+        <w:t xml:space="preserve"> Fig. 2a, b shows the seasonal difference.</w:t>
+      </w:r>
+    </w:p>
+    <w:p>
+      <w:pPr>
+        <w:pStyle w:val="ListParagraph"/>
+        <w:numPr>
+          <w:ilvl w:val="0"/>
+          <w:numId w:val="3"/>
+        </w:numPr>
+        <w:spacing w:after="60" w:line="276" w:lineRule="auto"/>
+        <w:jc w:val="both"/>
+      </w:pPr>
+      <w:r>
+        <w:rPr>
+          <w:b/>
+          <w:bCs/>
+        </w:rPr>
+        <w:t>Pretrained L1C networks (19):</w:t>
+      </w:r>
+      <w:r>
+        <w:t xml:space="preserve"> the logits of the BreizhCrops MSResNet and Transformer (nine each) and one margin feature, extracted with eight-view test-time augmentation.</w:t>
+      </w:r>
+    </w:p>
+    <w:p>
+      <w:pPr>
+        <w:pStyle w:val="ListParagraph"/>
+        <w:numPr>
+          <w:ilvl w:val="0"/>
+          <w:numId w:val="3"/>
+        </w:numPr>
+        <w:spacing w:after="60" w:line="276" w:lineRule="auto"/>
+        <w:jc w:val="both"/>
+      </w:pPr>
+      <w:r>
+        <w:rPr>
+          <w:b/>
+          <w:bCs/>
+        </w:rPr>
+        <w:t>L2A network (9):</w:t>
+      </w:r>
+      <w:r>
+        <w:t xml:space="preserve"> the logits of a 9-class MSResNet that we train from scratch on the L2A series of frh01–frh03. It uses clear dates only, keeping a date when its cloud fraction is at most 0.1, its blue reflectance is below 0.12 and </w:t>
+      </w:r>
+      <w:r>
+        <w:t>it is not an isolated NDVI dip.</w:t>
+      </w:r>
+      <w:r>
+        <w:t xml:space="preserve"> </w:t>
+      </w:r>
+      <w:r>
+        <w:t>We train the network for ten epochs and then recompute its BatchNorm statistics (Ioffe and Szegedy, 2015) on the training series; without this step its accuracy is 58.7% instead of 80.2%. Its logits are averaged over three training seeds and extracted with eight-view test-time augmentation.</w:t>
+      </w:r>
+    </w:p>
+    <w:p>
+      <w:pPr>
+        <w:pStyle w:val="Heading2"/>
+        <w:keepNext/>
+      </w:pPr>
+      <w:r>
+        <w:t>3.4 Meta-classifier</w:t>
+      </w:r>
+    </w:p>
+    <w:p>
+      <w:pPr>
+        <w:spacing w:after="120" w:line="276" w:lineRule="auto"/>
+        <w:jc w:val="both"/>
+      </w:pPr>
+      <w:r>
+        <w:t xml:space="preserve">The meta-classifier turns the 51 features into labels in four stages, each feeding the next. </w:t>
+      </w:r>
+      <w:r>
+        <w:rPr>
+          <w:b/>
+        </w:rPr>
+        <w:t>(1) Training:</w:t>
+      </w:r>
+      <w:r>
+        <w:t xml:space="preserve"> XGBoost and CatBoost are trained on the features of the training regions, with class-balanced sample weights and orchards further up-weighted by a factor m </w:t>
+      </w:r>
+      <w:r>
+        <w:rPr>
+          <w:rFonts w:ascii="Cambria Math" w:hAnsi="Cambria Math" w:cs="Cambria Math"/>
+        </w:rPr>
+        <w:t>∈</w:t>
+      </w:r>
+      <w:r>
+        <w:t xml:space="preserve"> {1, 2, 3}, which gives one pair of models per m. </w:t>
+      </w:r>
+      <w:r>
+        <w:rPr>
+          <w:b/>
+        </w:rPr>
+        <w:t>(2) Blending:</w:t>
+      </w:r>
+      <w:r>
+        <w:t xml:space="preserve"> for each test parcel, the class probabilities of the two models are combined by a geometric mean or by a weighted arithmetic mean (weight 0.7 on XGBoost). </w:t>
+      </w:r>
+      <w:r>
+        <w:rPr>
+          <w:b/>
+        </w:rPr>
+        <w:t>(3) Decoding:</w:t>
+      </w:r>
+      <w:r>
+        <w:t xml:space="preserve"> log-space biases favor orchards and penalize the two meadow classes,</w:t>
+      </w:r>
+    </w:p>
+    <w:p>
+      <w:pPr>
+        <w:spacing w:before="80" w:after="120"/>
+        <w:jc w:val="center"/>
+      </w:pPr>
+      <w:r>
+        <w:rPr>
+          <w:i/>
+          <w:iCs/>
+        </w:rPr>
+        <w:t>ŷ = argmax_k [ log p_k + b_o · 1(k = orchard) − b_m · 1(k ∈ meadows) ],</w:t>
+      </w:r>
+    </w:p>
+    <w:p>
+      <w:pPr>
+        <w:spacing w:after="120" w:line="276" w:lineRule="auto"/>
+        <w:jc w:val="both"/>
+      </w:pPr>
+      <w:r>
+        <w:t xml:space="preserve">with b_o </w:t>
+      </w:r>
+      <w:r>
+        <w:rPr>
+          <w:rFonts w:ascii="Cambria Math" w:hAnsi="Cambria Math" w:cs="Cambria Math"/>
+        </w:rPr>
+        <w:t>∈</w:t>
+      </w:r>
+      <w:r>
+        <w:t xml:space="preserve"> {0, 0.5, …, 3} and b_m </w:t>
+      </w:r>
+      <w:r>
+        <w:rPr>
+          <w:rFonts w:ascii="Cambria Math" w:hAnsi="Cambria Math" w:cs="Cambria Math"/>
+        </w:rPr>
+        <w:t>∈</w:t>
+      </w:r>
+      <w:r>
+        <w:t xml:space="preserve"> {0, 0.25, 0.5, 0.75, 1, 1.5, 2}. With the two blends and three multipliers this gives 294 decoding configurations, which trace a family of operating points from accuracy-first to orchard-first. </w:t>
+      </w:r>
+      <w:r>
+        <w:rPr>
+          <w:b/>
+        </w:rPr>
+        <w:t>(4) Selection:</w:t>
+      </w:r>
+      <w:r>
+        <w:t xml:space="preserve"> one configuration per selection rule is chosen without using the labels of the parcels it is scored on (Section 4.2); its labels are the first output of the system. The grid is an operating-point dial rather than a source of accuracy: at the accuracy-first point every fold of every seed selects the weighted blend with m = 1 and no biases. The meta-classifier also passes the verifier an orchard score, the XGBoost probability at m = 1, which, unlike the blend, is cheap to recompute out of fold on the training regions (Section 3.5).</w:t>
+      </w:r>
+    </w:p>
+    <w:p>
+      <w:pPr>
+        <w:pStyle w:val="Heading2"/>
+        <w:keepNext/>
+      </w:pPr>
+      <w:r>
+        <w:t>3.5 Orchard verifier</w:t>
+      </w:r>
+    </w:p>
+    <w:p>
+      <w:pPr>
+        <w:spacing w:after="120" w:line="276" w:lineRule="auto"/>
+        <w:jc w:val="both"/>
+      </w:pPr>
+      <w:r>
+        <w:t xml:space="preserve">The second stage re-examines the parcels the meta-classifier considers possible orchards. To train it on candidates that look like test candidates, </w:t>
+      </w:r>
+      <w:r>
+        <w:t>we compute the meta-classifier's orchard scores out of fold on the training regions</w:t>
+      </w:r>
+      <w:r>
+        <w:t xml:space="preserve">: each training region is scored by a meta-classifier trained on the other two. The candidate threshold τ is the 10th percentile of these scores among training orchards, so 90% of training orchards become candidates. A binary XGBoost is trained on the training candidates (orchard versus rest) with 9 meta-classifier probabilities, the 15 phenology features, monthly means of the 10 bands and of NDVI, NDRE and NDMI over clear dates, parcel geometry (area, perimeter, compactness, elongation) and the context of the ten nearest parcels (mean and maximum orchard score, mean meadow score, mean distance). Parcels are then ranked with candidates first, ordered by the verifier's probability, followed by non-candidates, ordered by the meta orchard probability (in the implementation a candidate's score is 1 plus the verifier probability). A parcel is </w:t>
+      </w:r>
+      <w:r>
+        <w:t>labeled</w:t>
+      </w:r>
+      <w:r>
+        <w:t xml:space="preserve"> an orchard if its score passes a threshold chosen out of sample (Section 4.2); otherwise it receives the meta-classifier's most probable non-orchard class.</w:t>
       </w:r>
     </w:p>
     <w:p>

</xml_diff>

<commit_message>
Restore the missing table markers in the comparison table
The pretrained 8-view row lost its dagger and the two dial rows their
double daggers in an earlier edit, although the table notes still
explain both symbols.

Co-Authored-By: Claude Opus 5.5 <noreply@anthropic.com>
</commit_message>
<xml_diff>
--- a/paper/Orchards_in_the_Meadow.docx
+++ b/paper/Orchards_in_the_Meadow.docx
@@ -2446,7 +2446,7 @@
                 <w:sz w:val="18"/>
                 <w:szCs w:val="18"/>
               </w:rPr>
-              <w:t xml:space="preserve">Pretrained MSResNet, 8-view inputs </w:t>
+              <w:t>Pretrained MSResNet, 8-view inputs †</w:t>
             </w:r>
           </w:p>
         </w:tc>
@@ -2996,7 +2996,7 @@
                 <w:sz w:val="18"/>
                 <w:szCs w:val="18"/>
               </w:rPr>
-              <w:t xml:space="preserve">MSResNet on L2A + decision dial </w:t>
+              <w:t>MSResNet on L2A + decision dial ‡</w:t>
             </w:r>
           </w:p>
         </w:tc>
@@ -3160,7 +3160,7 @@
                 <w:sz w:val="18"/>
                 <w:szCs w:val="18"/>
               </w:rPr>
-              <w:t xml:space="preserve">MSResNet on L2A, orchards ×10 + dial </w:t>
+              <w:t>MSResNet on L2A, orchards ×10 + dial ‡</w:t>
             </w:r>
           </w:p>
         </w:tc>

</xml_diff>